<commit_message>
Update Margin Bridge with channel-mix and portfolio tier-mix sizing
Adds two newly-sized levers: channel mix shift (Wholesale -> DTC,
+1.36pt grounded to the approved Item 4 store plan, up to +4.47pt
under an aggressive scenario) and portfolio tier-mix optimization
(+1.65pt moderate, replacing the old floor-fix-only figure, up to
+5.49pt theoretical ceiling). Updates the headline reconciliation:
quantified upside rises from ~2.8pt to ~5.1pt, residual narrows from
~10.5-11.5pt to ~9.2pt (64% of the +14.3pt target) -- still the
majority of the gap, but real progress.
</commit_message>
<xml_diff>
--- a/workshop_prep/Margin_Bridge_Consolidated_Reconciliation.docx
+++ b/workshop_prep/Margin_Bridge_Consolidated_Reconciliation.docx
@@ -77,7 +77,7 @@
           <w:sz w:val="22"/>
           <w:szCs w:val="22"/>
         </w:rPr>
-        <w:t xml:space="preserve">This note was requested to see what a single, consolidated margin bridge looks like once everything already found across Items 1-6 is pulled together — and, honestly, what's still missing. The answer: of the +14.3pt Gross Margin target (39.2% FY2025A -&gt; 53.5% FY2029E), only roughly 3-4pt is backed by anything sized in this engagement so far. Over 70% of the target gap — 10.5 to 11.5 points — has no named, quantified source. This note exists to make that gap visible, not to paper over it, and to separate what is genuinely known from what still needs work before the workshop can responsibly commit to the 53.5% number.</w:t>
+        <w:t xml:space="preserve">UPDATED this round with two newly-sized levers: channel mix shift (Wholesale -&gt; DTC) and portfolio tier-mix optimization. Together they add roughly 3 more points, bringing the total quantified upside from ~2.8pt to ~5.1pt. The headline conclusion is unchanged in kind, improved in degree: of the +14.3pt Gross Margin target (39.2% FY2025A -&gt; 53.5% FY2029E), roughly 5.1pt is now backed by sized levers -- still only about a third of the target. ~9.2pt (64% of the gap) remains unexplained by anything sized in this engagement. This note exists to make that residual visible, not to paper over it.</w:t>
       </w:r>
     </w:p>
     <w:p>
@@ -124,7 +124,7 @@
         <w:spacing w:after="160" w:before="320"/>
       </w:pPr>
       <w:r>
-        <w:t xml:space="preserve">2. The headline reconciliation</w:t>
+        <w:t xml:space="preserve">2. The headline reconciliation (updated)</w:t>
       </w:r>
     </w:p>
     <w:tbl>
@@ -285,7 +285,7 @@
                 <w:sz w:val="19"/>
                 <w:szCs w:val="19"/>
               </w:rPr>
-              <w:t xml:space="preserve">Quantified upside, conservative reading (avoids double-counting)</w:t>
+              <w:t xml:space="preserve">General mix-adjusted price erosion (Item 2), if reversed</w:t>
             </w:r>
           </w:p>
         </w:tc>
@@ -313,7 +313,7 @@
                 <w:sz w:val="19"/>
                 <w:szCs w:val="19"/>
               </w:rPr>
-              <w:t xml:space="preserve">~2.8pt</w:t>
+              <w:t xml:space="preserve">+1.89pt</w:t>
             </w:r>
           </w:p>
         </w:tc>
@@ -342,7 +342,7 @@
                 <w:sz w:val="19"/>
                 <w:szCs w:val="19"/>
               </w:rPr>
-              <w:t xml:space="preserve">Quantified upside, generous reading</w:t>
+              <w:t xml:space="preserve">Portfolio tier-mix, moderate scenario (Sec. 5) -- supersedes the old floor-fix-only figure</w:t>
             </w:r>
           </w:p>
         </w:tc>
@@ -369,7 +369,7 @@
                 <w:sz w:val="19"/>
                 <w:szCs w:val="19"/>
               </w:rPr>
-              <w:t xml:space="preserve">~3.8pt</w:t>
+              <w:t xml:space="preserve">+1.65pt</w:t>
             </w:r>
           </w:p>
         </w:tc>
@@ -399,7 +399,7 @@
                 <w:sz w:val="19"/>
                 <w:szCs w:val="19"/>
               </w:rPr>
-              <w:t xml:space="preserve">RESIDUAL — unexplained by anything sized in Items 1-6</w:t>
+              <w:t xml:space="preserve">Wholesale Reorder margin gap (Item 5), if closed</w:t>
             </w:r>
           </w:p>
         </w:tc>
@@ -427,12 +427,197 @@
                 <w:sz w:val="19"/>
                 <w:szCs w:val="19"/>
               </w:rPr>
-              <w:t xml:space="preserve">~10.5 to 11.5pt (73-80% of the target)</w:t>
+              <w:t xml:space="preserve">+0.19pt</w:t>
+            </w:r>
+          </w:p>
+        </w:tc>
+      </w:tr>
+      <w:tr>
+        <w:tc>
+          <w:tcPr>
+            <w:tcW w:type="dxa" w:w="5350"/>
+            <w:tcMar>
+              <w:top w:type="dxa" w:w="60"/>
+              <w:left w:type="dxa" w:w="100"/>
+              <w:bottom w:type="dxa" w:w="60"/>
+              <w:right w:type="dxa" w:w="100"/>
+            </w:tcMar>
+            <w:vAlign w:val="center"/>
+          </w:tcPr>
+          <w:p>
+            <w:pPr>
+              <w:jc w:val="left"/>
+            </w:pPr>
+            <w:r>
+              <w:rPr>
+                <w:b w:val="false"/>
+                <w:bCs w:val="false"/>
+                <w:color w:val="000000"/>
+                <w:sz w:val="19"/>
+                <w:szCs w:val="19"/>
+              </w:rPr>
+              <w:t xml:space="preserve">Channel mix shift, grounded to the approved Item 4 store plan (Sec. 4)</w:t>
+            </w:r>
+          </w:p>
+        </w:tc>
+        <w:tc>
+          <w:tcPr>
+            <w:tcW w:type="dxa" w:w="4000"/>
+            <w:tcMar>
+              <w:top w:type="dxa" w:w="60"/>
+              <w:left w:type="dxa" w:w="100"/>
+              <w:bottom w:type="dxa" w:w="60"/>
+              <w:right w:type="dxa" w:w="100"/>
+            </w:tcMar>
+            <w:vAlign w:val="center"/>
+          </w:tcPr>
+          <w:p>
+            <w:pPr>
+              <w:jc w:val="center"/>
+            </w:pPr>
+            <w:r>
+              <w:rPr>
+                <w:b w:val="false"/>
+                <w:bCs w:val="false"/>
+                <w:color w:val="000000"/>
+                <w:sz w:val="19"/>
+                <w:szCs w:val="19"/>
+              </w:rPr>
+              <w:t xml:space="preserve">+1.36pt</w:t>
+            </w:r>
+          </w:p>
+        </w:tc>
+      </w:tr>
+      <w:tr>
+        <w:tc>
+          <w:tcPr>
+            <w:tcW w:type="dxa" w:w="5350"/>
+            <w:shd w:fill="F5F5F5" w:val="clear"/>
+            <w:tcMar>
+              <w:top w:type="dxa" w:w="60"/>
+              <w:left w:type="dxa" w:w="100"/>
+              <w:bottom w:type="dxa" w:w="60"/>
+              <w:right w:type="dxa" w:w="100"/>
+            </w:tcMar>
+            <w:vAlign w:val="center"/>
+          </w:tcPr>
+          <w:p>
+            <w:pPr>
+              <w:jc w:val="left"/>
+            </w:pPr>
+            <w:r>
+              <w:rPr>
+                <w:b w:val="false"/>
+                <w:bCs w:val="false"/>
+                <w:color w:val="000000"/>
+                <w:sz w:val="19"/>
+                <w:szCs w:val="19"/>
+              </w:rPr>
+              <w:t xml:space="preserve">UPDATED quantified total (grounded/moderate reading)</w:t>
+            </w:r>
+          </w:p>
+        </w:tc>
+        <w:tc>
+          <w:tcPr>
+            <w:tcW w:type="dxa" w:w="4000"/>
+            <w:shd w:fill="F5F5F5" w:val="clear"/>
+            <w:tcMar>
+              <w:top w:type="dxa" w:w="60"/>
+              <w:left w:type="dxa" w:w="100"/>
+              <w:bottom w:type="dxa" w:w="60"/>
+              <w:right w:type="dxa" w:w="100"/>
+            </w:tcMar>
+            <w:vAlign w:val="center"/>
+          </w:tcPr>
+          <w:p>
+            <w:pPr>
+              <w:jc w:val="center"/>
+            </w:pPr>
+            <w:r>
+              <w:rPr>
+                <w:b w:val="false"/>
+                <w:bCs w:val="false"/>
+                <w:color w:val="000000"/>
+                <w:sz w:val="19"/>
+                <w:szCs w:val="19"/>
+              </w:rPr>
+              <w:t xml:space="preserve">~5.1pt</w:t>
+            </w:r>
+          </w:p>
+        </w:tc>
+      </w:tr>
+      <w:tr>
+        <w:tc>
+          <w:tcPr>
+            <w:tcW w:type="dxa" w:w="5350"/>
+            <w:tcMar>
+              <w:top w:type="dxa" w:w="60"/>
+              <w:left w:type="dxa" w:w="100"/>
+              <w:bottom w:type="dxa" w:w="60"/>
+              <w:right w:type="dxa" w:w="100"/>
+            </w:tcMar>
+            <w:vAlign w:val="center"/>
+          </w:tcPr>
+          <w:p>
+            <w:pPr>
+              <w:jc w:val="left"/>
+            </w:pPr>
+            <w:r>
+              <w:rPr>
+                <w:b w:val="false"/>
+                <w:bCs w:val="false"/>
+                <w:color w:val="000000"/>
+                <w:sz w:val="19"/>
+                <w:szCs w:val="19"/>
+              </w:rPr>
+              <w:t xml:space="preserve">UPDATED RESIDUAL — still unexplained</w:t>
+            </w:r>
+          </w:p>
+        </w:tc>
+        <w:tc>
+          <w:tcPr>
+            <w:tcW w:type="dxa" w:w="4000"/>
+            <w:tcMar>
+              <w:top w:type="dxa" w:w="60"/>
+              <w:left w:type="dxa" w:w="100"/>
+              <w:bottom w:type="dxa" w:w="60"/>
+              <w:right w:type="dxa" w:w="100"/>
+            </w:tcMar>
+            <w:vAlign w:val="center"/>
+          </w:tcPr>
+          <w:p>
+            <w:pPr>
+              <w:jc w:val="center"/>
+            </w:pPr>
+            <w:r>
+              <w:rPr>
+                <w:b w:val="false"/>
+                <w:bCs w:val="false"/>
+                <w:color w:val="000000"/>
+                <w:sz w:val="19"/>
+                <w:szCs w:val="19"/>
+              </w:rPr>
+              <w:t xml:space="preserve">~9.2pt (64% of the target)</w:t>
             </w:r>
           </w:p>
         </w:tc>
       </w:tr>
     </w:tbl>
+    <w:p>
+      <w:pPr>
+        <w:spacing w:after="200"/>
+      </w:pPr>
+      <w:r>
+        <w:rPr>
+          <w:i/>
+          <w:iCs/>
+          <w:color w:val="555555"/>
+          <w:sz w:val="18"/>
+          <w:szCs w:val="18"/>
+        </w:rPr>
+        <w:t xml:space="preserve">Outer-bound context, not additive with the above (alternative aggressive scenarios of overlapping populations): channel mix pushed to 50% Wholesale share would be worth +4.47pt; the entire core portfolio performing at Hero-tier margin would be worth +5.49pt. Neither is a real plan.</w:t>
+      </w:r>
+    </w:p>
     <w:p>
       <w:pPr>
         <w:pBdr>
@@ -451,7 +636,7 @@
         <w:t xml:space="preserve">UNEXPLAINED GAP: </w:t>
       </w:r>
       <w:r>
-        <w:t xml:space="preserve">The great majority of the margin bridge is not yet backed by named, sized levers. This is not a criticism of Items 1-6 — each was scoped deliberately to answer a specific question, not to build the full bridge — it is the direct, honest result of assembling them for the first time. The workshop should treat the 53.5% target as still substantially unsubstantiated by bottom-up analysis until this residual is addressed.</w:t>
+        <w:t xml:space="preserve">Progress, but the majority of the margin bridge is still not backed by named, sized levers. This is not a criticism of Items 1-6 — each was scoped deliberately to answer a specific question, not to build the full bridge — it is the direct, honest result of assembling them and then actively searching for the largest remaining candidates. The workshop should treat the 53.5% target as still substantially unsubstantiated by bottom-up analysis until the ~9.2pt residual is addressed.</w:t>
       </w:r>
     </w:p>
     <w:p>
@@ -1127,7 +1312,7 @@
                 <w:sz w:val="19"/>
                 <w:szCs w:val="19"/>
               </w:rPr>
-              <w:t xml:space="preserve">+0.69pt</w:t>
+              <w:t xml:space="preserve">+0.69pt (superseded, see Sec. 5)</w:t>
             </w:r>
           </w:p>
         </w:tc>
@@ -1154,7 +1339,7 @@
                 <w:sz w:val="19"/>
                 <w:szCs w:val="19"/>
               </w:rPr>
-              <w:t xml:space="preserve">Opportunity, conservative floor-only estimate.</w:t>
+              <w:t xml:space="preserve">Conservative floor-only estimate -- kept for reference, replaced by Sec. 5's moderate scenario in the running total.</w:t>
             </w:r>
           </w:p>
         </w:tc>
@@ -1489,6 +1674,340 @@
                 <w:szCs w:val="19"/>
               </w:rPr>
               <w:t xml:space="preserve">ALREADY HAPPENED. Mix got worse, not better — a warning sign, not an opportunity, if it continues.</w:t>
+            </w:r>
+          </w:p>
+        </w:tc>
+      </w:tr>
+      <w:tr>
+        <w:tc>
+          <w:tcPr>
+            <w:tcW w:type="dxa" w:w="2500"/>
+            <w:shd w:fill="F5F5F5" w:val="clear"/>
+            <w:tcMar>
+              <w:top w:type="dxa" w:w="60"/>
+              <w:left w:type="dxa" w:w="100"/>
+              <w:bottom w:type="dxa" w:w="60"/>
+              <w:right w:type="dxa" w:w="100"/>
+            </w:tcMar>
+            <w:vAlign w:val="center"/>
+          </w:tcPr>
+          <w:p>
+            <w:pPr>
+              <w:jc w:val="left"/>
+            </w:pPr>
+            <w:r>
+              <w:rPr>
+                <w:b w:val="false"/>
+                <w:bCs w:val="false"/>
+                <w:color w:val="000000"/>
+                <w:sz w:val="19"/>
+                <w:szCs w:val="19"/>
+              </w:rPr>
+              <w:t xml:space="preserve">Channel mix shift (Wholesale -&gt; DTC)</w:t>
+            </w:r>
+          </w:p>
+        </w:tc>
+        <w:tc>
+          <w:tcPr>
+            <w:tcW w:type="dxa" w:w="700"/>
+            <w:shd w:fill="F5F5F5" w:val="clear"/>
+            <w:tcMar>
+              <w:top w:type="dxa" w:w="60"/>
+              <w:left w:type="dxa" w:w="100"/>
+              <w:bottom w:type="dxa" w:w="60"/>
+              <w:right w:type="dxa" w:w="100"/>
+            </w:tcMar>
+            <w:vAlign w:val="center"/>
+          </w:tcPr>
+          <w:p>
+            <w:pPr>
+              <w:jc w:val="center"/>
+            </w:pPr>
+            <w:r>
+              <w:rPr>
+                <w:b w:val="false"/>
+                <w:bCs w:val="false"/>
+                <w:color w:val="000000"/>
+                <w:sz w:val="19"/>
+                <w:szCs w:val="19"/>
+              </w:rPr>
+              <w:t xml:space="preserve">This note, Sec. 4</w:t>
+            </w:r>
+          </w:p>
+        </w:tc>
+        <w:tc>
+          <w:tcPr>
+            <w:tcW w:type="dxa" w:w="1900"/>
+            <w:shd w:fill="F5F5F5" w:val="clear"/>
+            <w:tcMar>
+              <w:top w:type="dxa" w:w="60"/>
+              <w:left w:type="dxa" w:w="100"/>
+              <w:bottom w:type="dxa" w:w="60"/>
+              <w:right w:type="dxa" w:w="100"/>
+            </w:tcMar>
+            <w:vAlign w:val="center"/>
+          </w:tcPr>
+          <w:p>
+            <w:pPr>
+              <w:jc w:val="center"/>
+            </w:pPr>
+            <w:r>
+              <w:rPr>
+                <w:b w:val="false"/>
+                <w:bCs w:val="false"/>
+                <w:color w:val="000000"/>
+                <w:sz w:val="19"/>
+                <w:szCs w:val="19"/>
+              </w:rPr>
+              <w:t xml:space="preserve">see Sec. 4</w:t>
+            </w:r>
+          </w:p>
+        </w:tc>
+        <w:tc>
+          <w:tcPr>
+            <w:tcW w:type="dxa" w:w="900"/>
+            <w:shd w:fill="F5F5F5" w:val="clear"/>
+            <w:tcMar>
+              <w:top w:type="dxa" w:w="60"/>
+              <w:left w:type="dxa" w:w="100"/>
+              <w:bottom w:type="dxa" w:w="60"/>
+              <w:right w:type="dxa" w:w="100"/>
+            </w:tcMar>
+            <w:vAlign w:val="center"/>
+          </w:tcPr>
+          <w:p>
+            <w:pPr>
+              <w:jc w:val="center"/>
+            </w:pPr>
+            <w:r>
+              <w:rPr>
+                <w:b w:val="false"/>
+                <w:bCs w:val="false"/>
+                <w:color w:val="000000"/>
+                <w:sz w:val="19"/>
+                <w:szCs w:val="19"/>
+              </w:rPr>
+              <w:t xml:space="preserve">see Sec. 4</w:t>
+            </w:r>
+          </w:p>
+        </w:tc>
+        <w:tc>
+          <w:tcPr>
+            <w:tcW w:type="dxa" w:w="1200"/>
+            <w:shd w:fill="F5F5F5" w:val="clear"/>
+            <w:tcMar>
+              <w:top w:type="dxa" w:w="60"/>
+              <w:left w:type="dxa" w:w="100"/>
+              <w:bottom w:type="dxa" w:w="60"/>
+              <w:right w:type="dxa" w:w="100"/>
+            </w:tcMar>
+            <w:vAlign w:val="center"/>
+          </w:tcPr>
+          <w:p>
+            <w:pPr>
+              <w:jc w:val="center"/>
+            </w:pPr>
+            <w:r>
+              <w:rPr>
+                <w:b w:val="false"/>
+                <w:bCs w:val="false"/>
+                <w:color w:val="000000"/>
+                <w:sz w:val="19"/>
+                <w:szCs w:val="19"/>
+              </w:rPr>
+              <w:t xml:space="preserve">+1.36pt (grounded) to +4.47pt (aggressive)</w:t>
+            </w:r>
+          </w:p>
+        </w:tc>
+        <w:tc>
+          <w:tcPr>
+            <w:tcW w:type="dxa" w:w="2150"/>
+            <w:shd w:fill="F5F5F5" w:val="clear"/>
+            <w:tcMar>
+              <w:top w:type="dxa" w:w="60"/>
+              <w:left w:type="dxa" w:w="100"/>
+              <w:bottom w:type="dxa" w:w="60"/>
+              <w:right w:type="dxa" w:w="100"/>
+            </w:tcMar>
+            <w:vAlign w:val="center"/>
+          </w:tcPr>
+          <w:p>
+            <w:pPr>
+              <w:jc w:val="center"/>
+            </w:pPr>
+            <w:r>
+              <w:rPr>
+                <w:b w:val="false"/>
+                <w:bCs w:val="false"/>
+                <w:color w:val="000000"/>
+                <w:sz w:val="19"/>
+                <w:szCs w:val="19"/>
+              </w:rPr>
+              <w:t xml:space="preserve">NEW this round. Real but smaller than hoped -- see Sec. 4.</w:t>
+            </w:r>
+          </w:p>
+        </w:tc>
+      </w:tr>
+      <w:tr>
+        <w:tc>
+          <w:tcPr>
+            <w:tcW w:type="dxa" w:w="2500"/>
+            <w:tcMar>
+              <w:top w:type="dxa" w:w="60"/>
+              <w:left w:type="dxa" w:w="100"/>
+              <w:bottom w:type="dxa" w:w="60"/>
+              <w:right w:type="dxa" w:w="100"/>
+            </w:tcMar>
+            <w:vAlign w:val="center"/>
+          </w:tcPr>
+          <w:p>
+            <w:pPr>
+              <w:jc w:val="left"/>
+            </w:pPr>
+            <w:r>
+              <w:rPr>
+                <w:b w:val="false"/>
+                <w:bCs w:val="false"/>
+                <w:color w:val="000000"/>
+                <w:sz w:val="19"/>
+                <w:szCs w:val="19"/>
+              </w:rPr>
+              <w:t xml:space="preserve">Portfolio tier-mix optimization (Problem Child + Thin)</w:t>
+            </w:r>
+          </w:p>
+        </w:tc>
+        <w:tc>
+          <w:tcPr>
+            <w:tcW w:type="dxa" w:w="700"/>
+            <w:tcMar>
+              <w:top w:type="dxa" w:w="60"/>
+              <w:left w:type="dxa" w:w="100"/>
+              <w:bottom w:type="dxa" w:w="60"/>
+              <w:right w:type="dxa" w:w="100"/>
+            </w:tcMar>
+            <w:vAlign w:val="center"/>
+          </w:tcPr>
+          <w:p>
+            <w:pPr>
+              <w:jc w:val="center"/>
+            </w:pPr>
+            <w:r>
+              <w:rPr>
+                <w:b w:val="false"/>
+                <w:bCs w:val="false"/>
+                <w:color w:val="000000"/>
+                <w:sz w:val="19"/>
+                <w:szCs w:val="19"/>
+              </w:rPr>
+              <w:t xml:space="preserve">This note, Sec. 5</w:t>
+            </w:r>
+          </w:p>
+        </w:tc>
+        <w:tc>
+          <w:tcPr>
+            <w:tcW w:type="dxa" w:w="1900"/>
+            <w:tcMar>
+              <w:top w:type="dxa" w:w="60"/>
+              <w:left w:type="dxa" w:w="100"/>
+              <w:bottom w:type="dxa" w:w="60"/>
+              <w:right w:type="dxa" w:w="100"/>
+            </w:tcMar>
+            <w:vAlign w:val="center"/>
+          </w:tcPr>
+          <w:p>
+            <w:pPr>
+              <w:jc w:val="center"/>
+            </w:pPr>
+            <w:r>
+              <w:rPr>
+                <w:b w:val="false"/>
+                <w:bCs w:val="false"/>
+                <w:color w:val="000000"/>
+                <w:sz w:val="19"/>
+                <w:szCs w:val="19"/>
+              </w:rPr>
+              <w:t xml:space="preserve">see Sec. 5</w:t>
+            </w:r>
+          </w:p>
+        </w:tc>
+        <w:tc>
+          <w:tcPr>
+            <w:tcW w:type="dxa" w:w="900"/>
+            <w:tcMar>
+              <w:top w:type="dxa" w:w="60"/>
+              <w:left w:type="dxa" w:w="100"/>
+              <w:bottom w:type="dxa" w:w="60"/>
+              <w:right w:type="dxa" w:w="100"/>
+            </w:tcMar>
+            <w:vAlign w:val="center"/>
+          </w:tcPr>
+          <w:p>
+            <w:pPr>
+              <w:jc w:val="center"/>
+            </w:pPr>
+            <w:r>
+              <w:rPr>
+                <w:b w:val="false"/>
+                <w:bCs w:val="false"/>
+                <w:color w:val="000000"/>
+                <w:sz w:val="19"/>
+                <w:szCs w:val="19"/>
+              </w:rPr>
+              <w:t xml:space="preserve">see Sec. 5</w:t>
+            </w:r>
+          </w:p>
+        </w:tc>
+        <w:tc>
+          <w:tcPr>
+            <w:tcW w:type="dxa" w:w="1200"/>
+            <w:tcMar>
+              <w:top w:type="dxa" w:w="60"/>
+              <w:left w:type="dxa" w:w="100"/>
+              <w:bottom w:type="dxa" w:w="60"/>
+              <w:right w:type="dxa" w:w="100"/>
+            </w:tcMar>
+            <w:vAlign w:val="center"/>
+          </w:tcPr>
+          <w:p>
+            <w:pPr>
+              <w:jc w:val="center"/>
+            </w:pPr>
+            <w:r>
+              <w:rPr>
+                <w:b w:val="false"/>
+                <w:bCs w:val="false"/>
+                <w:color w:val="000000"/>
+                <w:sz w:val="19"/>
+                <w:szCs w:val="19"/>
+              </w:rPr>
+              <w:t xml:space="preserve">+1.65pt (moderate) to +5.49pt (ceiling)</w:t>
+            </w:r>
+          </w:p>
+        </w:tc>
+        <w:tc>
+          <w:tcPr>
+            <w:tcW w:type="dxa" w:w="2150"/>
+            <w:tcMar>
+              <w:top w:type="dxa" w:w="60"/>
+              <w:left w:type="dxa" w:w="100"/>
+              <w:bottom w:type="dxa" w:w="60"/>
+              <w:right w:type="dxa" w:w="100"/>
+            </w:tcMar>
+            <w:vAlign w:val="center"/>
+          </w:tcPr>
+          <w:p>
+            <w:pPr>
+              <w:jc w:val="center"/>
+            </w:pPr>
+            <w:r>
+              <w:rPr>
+                <w:b w:val="false"/>
+                <w:bCs w:val="false"/>
+                <w:color w:val="000000"/>
+                <w:sz w:val="19"/>
+                <w:szCs w:val="19"/>
+              </w:rPr>
+              <w:t xml:space="preserve">NEW this round. Moderate reading now used in Section 2's running total.</w:t>
             </w:r>
           </w:p>
         </w:tc>
@@ -1861,16 +2380,2164 @@
         <w:t xml:space="preserve">DATA SHOWS: </w:t>
       </w:r>
       <w:r>
-        <w:t xml:space="preserve">Reading the table honestly: rows 1, 2 and 4 are three different lenses on the SAME underlying problem — Wholesale is discounting more than planned. They should not simply be added together. The conservative reconciliation in Section 2 uses row 2 (the broadest, most directly-measured figure) plus rows 3 and 4; the generous reading substitutes row 1 (the FW27-specific gap) for row 2. Either way, the total stays in the 2.8-3.8pt range — nowhere close to the 14.3pt needed.</w:t>
+        <w:t xml:space="preserve">Reading the table honestly: the FW27 gap, the general price-erosion line, and the Reorder-margin line are three different lenses on the SAME underlying problem — Wholesale is discounting more than planned. They should not simply be added together; Section 2 uses the general erosion line as the primary Wholesale-pricing figure to avoid double-counting.</w:t>
       </w:r>
     </w:p>
     <w:p>
+      <w:r>
+        <w:br w:type="page"/>
+      </w:r>
+    </w:p>
+    <w:p>
       <w:pPr>
         <w:pStyle w:val="Heading1"/>
         <w:spacing w:after="160" w:before="320"/>
       </w:pPr>
       <w:r>
-        <w:t xml:space="preserve">4. A second, more basic problem: the starting point itself doesn't reconcile</w:t>
+        <w:t xml:space="preserve">4. Channel mix shift (Wholesale → DTC) — sized this round</w:t>
+      </w:r>
+    </w:p>
+    <w:p>
+      <w:pPr>
+        <w:spacing w:after="160"/>
+      </w:pPr>
+      <w:r>
+        <w:t xml:space="preserve">Requested as the first candidate to close the residual. Current (2025) channel-level sales and margin, sales-extract basis, all accounts:</w:t>
+      </w:r>
+    </w:p>
+    <w:tbl>
+      <w:tblPr>
+        <w:tblW w:type="dxa" w:w="9350"/>
+        <w:tblBorders>
+          <w:top w:val="single" w:color="auto" w:sz="4"/>
+          <w:left w:val="single" w:color="auto" w:sz="4"/>
+          <w:bottom w:val="single" w:color="auto" w:sz="4"/>
+          <w:right w:val="single" w:color="auto" w:sz="4"/>
+          <w:insideH w:val="single" w:color="auto" w:sz="4"/>
+          <w:insideV w:val="single" w:color="auto" w:sz="4"/>
+        </w:tblBorders>
+      </w:tblPr>
+      <w:tblGrid>
+        <w:gridCol w:w="2350"/>
+        <w:gridCol w:w="2350"/>
+        <w:gridCol w:w="2350"/>
+        <w:gridCol w:w="2300"/>
+      </w:tblGrid>
+      <w:tr>
+        <w:trPr>
+          <w:tblHeader/>
+        </w:trPr>
+        <w:tc>
+          <w:tcPr>
+            <w:tcW w:type="dxa" w:w="2350"/>
+            <w:shd w:fill="2F2F2F" w:val="clear"/>
+            <w:tcMar>
+              <w:top w:type="dxa" w:w="60"/>
+              <w:left w:type="dxa" w:w="100"/>
+              <w:bottom w:type="dxa" w:w="60"/>
+              <w:right w:type="dxa" w:w="100"/>
+            </w:tcMar>
+            <w:vAlign w:val="center"/>
+          </w:tcPr>
+          <w:p>
+            <w:pPr>
+              <w:jc w:val="left"/>
+            </w:pPr>
+            <w:r>
+              <w:rPr>
+                <w:b/>
+                <w:bCs/>
+                <w:color w:val="FFFFFF"/>
+                <w:sz w:val="19"/>
+                <w:szCs w:val="19"/>
+              </w:rPr>
+              <w:t xml:space="preserve">Channel</w:t>
+            </w:r>
+          </w:p>
+        </w:tc>
+        <w:tc>
+          <w:tcPr>
+            <w:tcW w:type="dxa" w:w="2350"/>
+            <w:shd w:fill="2F2F2F" w:val="clear"/>
+            <w:tcMar>
+              <w:top w:type="dxa" w:w="60"/>
+              <w:left w:type="dxa" w:w="100"/>
+              <w:bottom w:type="dxa" w:w="60"/>
+              <w:right w:type="dxa" w:w="100"/>
+            </w:tcMar>
+            <w:vAlign w:val="center"/>
+          </w:tcPr>
+          <w:p>
+            <w:pPr>
+              <w:jc w:val="center"/>
+            </w:pPr>
+            <w:r>
+              <w:rPr>
+                <w:b/>
+                <w:bCs/>
+                <w:color w:val="FFFFFF"/>
+                <w:sz w:val="19"/>
+                <w:szCs w:val="19"/>
+              </w:rPr>
+              <w:t xml:space="preserve">Sales 2025</w:t>
+            </w:r>
+          </w:p>
+        </w:tc>
+        <w:tc>
+          <w:tcPr>
+            <w:tcW w:type="dxa" w:w="2350"/>
+            <w:shd w:fill="2F2F2F" w:val="clear"/>
+            <w:tcMar>
+              <w:top w:type="dxa" w:w="60"/>
+              <w:left w:type="dxa" w:w="100"/>
+              <w:bottom w:type="dxa" w:w="60"/>
+              <w:right w:type="dxa" w:w="100"/>
+            </w:tcMar>
+            <w:vAlign w:val="center"/>
+          </w:tcPr>
+          <w:p>
+            <w:pPr>
+              <w:jc w:val="center"/>
+            </w:pPr>
+            <w:r>
+              <w:rPr>
+                <w:b/>
+                <w:bCs/>
+                <w:color w:val="FFFFFF"/>
+                <w:sz w:val="19"/>
+                <w:szCs w:val="19"/>
+              </w:rPr>
+              <w:t xml:space="preserve">Share</w:t>
+            </w:r>
+          </w:p>
+        </w:tc>
+        <w:tc>
+          <w:tcPr>
+            <w:tcW w:type="dxa" w:w="2300"/>
+            <w:shd w:fill="2F2F2F" w:val="clear"/>
+            <w:tcMar>
+              <w:top w:type="dxa" w:w="60"/>
+              <w:left w:type="dxa" w:w="100"/>
+              <w:bottom w:type="dxa" w:w="60"/>
+              <w:right w:type="dxa" w:w="100"/>
+            </w:tcMar>
+            <w:vAlign w:val="center"/>
+          </w:tcPr>
+          <w:p>
+            <w:pPr>
+              <w:jc w:val="center"/>
+            </w:pPr>
+            <w:r>
+              <w:rPr>
+                <w:b/>
+                <w:bCs/>
+                <w:color w:val="FFFFFF"/>
+                <w:sz w:val="19"/>
+                <w:szCs w:val="19"/>
+              </w:rPr>
+              <w:t xml:space="preserve">GM%</w:t>
+            </w:r>
+          </w:p>
+        </w:tc>
+      </w:tr>
+      <w:tr>
+        <w:tc>
+          <w:tcPr>
+            <w:tcW w:type="dxa" w:w="2350"/>
+            <w:tcMar>
+              <w:top w:type="dxa" w:w="60"/>
+              <w:left w:type="dxa" w:w="100"/>
+              <w:bottom w:type="dxa" w:w="60"/>
+              <w:right w:type="dxa" w:w="100"/>
+            </w:tcMar>
+            <w:vAlign w:val="center"/>
+          </w:tcPr>
+          <w:p>
+            <w:pPr>
+              <w:jc w:val="left"/>
+            </w:pPr>
+            <w:r>
+              <w:rPr>
+                <w:b w:val="false"/>
+                <w:bCs w:val="false"/>
+                <w:color w:val="000000"/>
+                <w:sz w:val="19"/>
+                <w:szCs w:val="19"/>
+              </w:rPr>
+              <w:t xml:space="preserve">Wholesale</w:t>
+            </w:r>
+          </w:p>
+        </w:tc>
+        <w:tc>
+          <w:tcPr>
+            <w:tcW w:type="dxa" w:w="2350"/>
+            <w:tcMar>
+              <w:top w:type="dxa" w:w="60"/>
+              <w:left w:type="dxa" w:w="100"/>
+              <w:bottom w:type="dxa" w:w="60"/>
+              <w:right w:type="dxa" w:w="100"/>
+            </w:tcMar>
+            <w:vAlign w:val="center"/>
+          </w:tcPr>
+          <w:p>
+            <w:pPr>
+              <w:jc w:val="center"/>
+            </w:pPr>
+            <w:r>
+              <w:rPr>
+                <w:b w:val="false"/>
+                <w:bCs w:val="false"/>
+                <w:color w:val="000000"/>
+                <w:sz w:val="19"/>
+                <w:szCs w:val="19"/>
+              </w:rPr>
+              <w:t xml:space="preserve">658.4M</w:t>
+            </w:r>
+          </w:p>
+        </w:tc>
+        <w:tc>
+          <w:tcPr>
+            <w:tcW w:type="dxa" w:w="2350"/>
+            <w:tcMar>
+              <w:top w:type="dxa" w:w="60"/>
+              <w:left w:type="dxa" w:w="100"/>
+              <w:bottom w:type="dxa" w:w="60"/>
+              <w:right w:type="dxa" w:w="100"/>
+            </w:tcMar>
+            <w:vAlign w:val="center"/>
+          </w:tcPr>
+          <w:p>
+            <w:pPr>
+              <w:jc w:val="center"/>
+            </w:pPr>
+            <w:r>
+              <w:rPr>
+                <w:b w:val="false"/>
+                <w:bCs w:val="false"/>
+                <w:color w:val="000000"/>
+                <w:sz w:val="19"/>
+                <w:szCs w:val="19"/>
+              </w:rPr>
+              <w:t xml:space="preserve">75.1%</w:t>
+            </w:r>
+          </w:p>
+        </w:tc>
+        <w:tc>
+          <w:tcPr>
+            <w:tcW w:type="dxa" w:w="2300"/>
+            <w:tcMar>
+              <w:top w:type="dxa" w:w="60"/>
+              <w:left w:type="dxa" w:w="100"/>
+              <w:bottom w:type="dxa" w:w="60"/>
+              <w:right w:type="dxa" w:w="100"/>
+            </w:tcMar>
+            <w:vAlign w:val="center"/>
+          </w:tcPr>
+          <w:p>
+            <w:pPr>
+              <w:jc w:val="center"/>
+            </w:pPr>
+            <w:r>
+              <w:rPr>
+                <w:b w:val="false"/>
+                <w:bCs w:val="false"/>
+                <w:color w:val="000000"/>
+                <w:sz w:val="19"/>
+                <w:szCs w:val="19"/>
+              </w:rPr>
+              <w:t xml:space="preserve">36.6%</w:t>
+            </w:r>
+          </w:p>
+        </w:tc>
+      </w:tr>
+      <w:tr>
+        <w:tc>
+          <w:tcPr>
+            <w:tcW w:type="dxa" w:w="2350"/>
+            <w:shd w:fill="F5F5F5" w:val="clear"/>
+            <w:tcMar>
+              <w:top w:type="dxa" w:w="60"/>
+              <w:left w:type="dxa" w:w="100"/>
+              <w:bottom w:type="dxa" w:w="60"/>
+              <w:right w:type="dxa" w:w="100"/>
+            </w:tcMar>
+            <w:vAlign w:val="center"/>
+          </w:tcPr>
+          <w:p>
+            <w:pPr>
+              <w:jc w:val="left"/>
+            </w:pPr>
+            <w:r>
+              <w:rPr>
+                <w:b w:val="false"/>
+                <w:bCs w:val="false"/>
+                <w:color w:val="000000"/>
+                <w:sz w:val="19"/>
+                <w:szCs w:val="19"/>
+              </w:rPr>
+              <w:t xml:space="preserve">Retail</w:t>
+            </w:r>
+          </w:p>
+        </w:tc>
+        <w:tc>
+          <w:tcPr>
+            <w:tcW w:type="dxa" w:w="2350"/>
+            <w:shd w:fill="F5F5F5" w:val="clear"/>
+            <w:tcMar>
+              <w:top w:type="dxa" w:w="60"/>
+              <w:left w:type="dxa" w:w="100"/>
+              <w:bottom w:type="dxa" w:w="60"/>
+              <w:right w:type="dxa" w:w="100"/>
+            </w:tcMar>
+            <w:vAlign w:val="center"/>
+          </w:tcPr>
+          <w:p>
+            <w:pPr>
+              <w:jc w:val="center"/>
+            </w:pPr>
+            <w:r>
+              <w:rPr>
+                <w:b w:val="false"/>
+                <w:bCs w:val="false"/>
+                <w:color w:val="000000"/>
+                <w:sz w:val="19"/>
+                <w:szCs w:val="19"/>
+              </w:rPr>
+              <w:t xml:space="preserve">123.0M</w:t>
+            </w:r>
+          </w:p>
+        </w:tc>
+        <w:tc>
+          <w:tcPr>
+            <w:tcW w:type="dxa" w:w="2350"/>
+            <w:shd w:fill="F5F5F5" w:val="clear"/>
+            <w:tcMar>
+              <w:top w:type="dxa" w:w="60"/>
+              <w:left w:type="dxa" w:w="100"/>
+              <w:bottom w:type="dxa" w:w="60"/>
+              <w:right w:type="dxa" w:w="100"/>
+            </w:tcMar>
+            <w:vAlign w:val="center"/>
+          </w:tcPr>
+          <w:p>
+            <w:pPr>
+              <w:jc w:val="center"/>
+            </w:pPr>
+            <w:r>
+              <w:rPr>
+                <w:b w:val="false"/>
+                <w:bCs w:val="false"/>
+                <w:color w:val="000000"/>
+                <w:sz w:val="19"/>
+                <w:szCs w:val="19"/>
+              </w:rPr>
+              <w:t xml:space="preserve">14.0%</w:t>
+            </w:r>
+          </w:p>
+        </w:tc>
+        <w:tc>
+          <w:tcPr>
+            <w:tcW w:type="dxa" w:w="2300"/>
+            <w:shd w:fill="F5F5F5" w:val="clear"/>
+            <w:tcMar>
+              <w:top w:type="dxa" w:w="60"/>
+              <w:left w:type="dxa" w:w="100"/>
+              <w:bottom w:type="dxa" w:w="60"/>
+              <w:right w:type="dxa" w:w="100"/>
+            </w:tcMar>
+            <w:vAlign w:val="center"/>
+          </w:tcPr>
+          <w:p>
+            <w:pPr>
+              <w:jc w:val="center"/>
+            </w:pPr>
+            <w:r>
+              <w:rPr>
+                <w:b w:val="false"/>
+                <w:bCs w:val="false"/>
+                <w:color w:val="000000"/>
+                <w:sz w:val="19"/>
+                <w:szCs w:val="19"/>
+              </w:rPr>
+              <w:t xml:space="preserve">49.0%</w:t>
+            </w:r>
+          </w:p>
+        </w:tc>
+      </w:tr>
+      <w:tr>
+        <w:tc>
+          <w:tcPr>
+            <w:tcW w:type="dxa" w:w="2350"/>
+            <w:tcMar>
+              <w:top w:type="dxa" w:w="60"/>
+              <w:left w:type="dxa" w:w="100"/>
+              <w:bottom w:type="dxa" w:w="60"/>
+              <w:right w:type="dxa" w:w="100"/>
+            </w:tcMar>
+            <w:vAlign w:val="center"/>
+          </w:tcPr>
+          <w:p>
+            <w:pPr>
+              <w:jc w:val="left"/>
+            </w:pPr>
+            <w:r>
+              <w:rPr>
+                <w:b w:val="false"/>
+                <w:bCs w:val="false"/>
+                <w:color w:val="000000"/>
+                <w:sz w:val="19"/>
+                <w:szCs w:val="19"/>
+              </w:rPr>
+              <w:t xml:space="preserve">E-com</w:t>
+            </w:r>
+          </w:p>
+        </w:tc>
+        <w:tc>
+          <w:tcPr>
+            <w:tcW w:type="dxa" w:w="2350"/>
+            <w:tcMar>
+              <w:top w:type="dxa" w:w="60"/>
+              <w:left w:type="dxa" w:w="100"/>
+              <w:bottom w:type="dxa" w:w="60"/>
+              <w:right w:type="dxa" w:w="100"/>
+            </w:tcMar>
+            <w:vAlign w:val="center"/>
+          </w:tcPr>
+          <w:p>
+            <w:pPr>
+              <w:jc w:val="center"/>
+            </w:pPr>
+            <w:r>
+              <w:rPr>
+                <w:b w:val="false"/>
+                <w:bCs w:val="false"/>
+                <w:color w:val="000000"/>
+                <w:sz w:val="19"/>
+                <w:szCs w:val="19"/>
+              </w:rPr>
+              <w:t xml:space="preserve">94.1M</w:t>
+            </w:r>
+          </w:p>
+        </w:tc>
+        <w:tc>
+          <w:tcPr>
+            <w:tcW w:type="dxa" w:w="2350"/>
+            <w:tcMar>
+              <w:top w:type="dxa" w:w="60"/>
+              <w:left w:type="dxa" w:w="100"/>
+              <w:bottom w:type="dxa" w:w="60"/>
+              <w:right w:type="dxa" w:w="100"/>
+            </w:tcMar>
+            <w:vAlign w:val="center"/>
+          </w:tcPr>
+          <w:p>
+            <w:pPr>
+              <w:jc w:val="center"/>
+            </w:pPr>
+            <w:r>
+              <w:rPr>
+                <w:b w:val="false"/>
+                <w:bCs w:val="false"/>
+                <w:color w:val="000000"/>
+                <w:sz w:val="19"/>
+                <w:szCs w:val="19"/>
+              </w:rPr>
+              <w:t xml:space="preserve">10.7%</w:t>
+            </w:r>
+          </w:p>
+        </w:tc>
+        <w:tc>
+          <w:tcPr>
+            <w:tcW w:type="dxa" w:w="2300"/>
+            <w:tcMar>
+              <w:top w:type="dxa" w:w="60"/>
+              <w:left w:type="dxa" w:w="100"/>
+              <w:bottom w:type="dxa" w:w="60"/>
+              <w:right w:type="dxa" w:w="100"/>
+            </w:tcMar>
+            <w:vAlign w:val="center"/>
+          </w:tcPr>
+          <w:p>
+            <w:pPr>
+              <w:jc w:val="center"/>
+            </w:pPr>
+            <w:r>
+              <w:rPr>
+                <w:b w:val="false"/>
+                <w:bCs w:val="false"/>
+                <w:color w:val="000000"/>
+                <w:sz w:val="19"/>
+                <w:szCs w:val="19"/>
+              </w:rPr>
+              <w:t xml:space="preserve">61.2%</w:t>
+            </w:r>
+          </w:p>
+        </w:tc>
+      </w:tr>
+      <w:tr>
+        <w:tc>
+          <w:tcPr>
+            <w:tcW w:type="dxa" w:w="2350"/>
+            <w:shd w:fill="F5F5F5" w:val="clear"/>
+            <w:tcMar>
+              <w:top w:type="dxa" w:w="60"/>
+              <w:left w:type="dxa" w:w="100"/>
+              <w:bottom w:type="dxa" w:w="60"/>
+              <w:right w:type="dxa" w:w="100"/>
+            </w:tcMar>
+            <w:vAlign w:val="center"/>
+          </w:tcPr>
+          <w:p>
+            <w:pPr>
+              <w:jc w:val="left"/>
+            </w:pPr>
+            <w:r>
+              <w:rPr>
+                <w:b w:val="false"/>
+                <w:bCs w:val="false"/>
+                <w:color w:val="000000"/>
+                <w:sz w:val="19"/>
+                <w:szCs w:val="19"/>
+              </w:rPr>
+              <w:t xml:space="preserve">Marketplace</w:t>
+            </w:r>
+          </w:p>
+        </w:tc>
+        <w:tc>
+          <w:tcPr>
+            <w:tcW w:type="dxa" w:w="2350"/>
+            <w:shd w:fill="F5F5F5" w:val="clear"/>
+            <w:tcMar>
+              <w:top w:type="dxa" w:w="60"/>
+              <w:left w:type="dxa" w:w="100"/>
+              <w:bottom w:type="dxa" w:w="60"/>
+              <w:right w:type="dxa" w:w="100"/>
+            </w:tcMar>
+            <w:vAlign w:val="center"/>
+          </w:tcPr>
+          <w:p>
+            <w:pPr>
+              <w:jc w:val="center"/>
+            </w:pPr>
+            <w:r>
+              <w:rPr>
+                <w:b w:val="false"/>
+                <w:bCs w:val="false"/>
+                <w:color w:val="000000"/>
+                <w:sz w:val="19"/>
+                <w:szCs w:val="19"/>
+              </w:rPr>
+              <w:t xml:space="preserve">1.6M</w:t>
+            </w:r>
+          </w:p>
+        </w:tc>
+        <w:tc>
+          <w:tcPr>
+            <w:tcW w:type="dxa" w:w="2350"/>
+            <w:shd w:fill="F5F5F5" w:val="clear"/>
+            <w:tcMar>
+              <w:top w:type="dxa" w:w="60"/>
+              <w:left w:type="dxa" w:w="100"/>
+              <w:bottom w:type="dxa" w:w="60"/>
+              <w:right w:type="dxa" w:w="100"/>
+            </w:tcMar>
+            <w:vAlign w:val="center"/>
+          </w:tcPr>
+          <w:p>
+            <w:pPr>
+              <w:jc w:val="center"/>
+            </w:pPr>
+            <w:r>
+              <w:rPr>
+                <w:b w:val="false"/>
+                <w:bCs w:val="false"/>
+                <w:color w:val="000000"/>
+                <w:sz w:val="19"/>
+                <w:szCs w:val="19"/>
+              </w:rPr>
+              <w:t xml:space="preserve">0.2%</w:t>
+            </w:r>
+          </w:p>
+        </w:tc>
+        <w:tc>
+          <w:tcPr>
+            <w:tcW w:type="dxa" w:w="2300"/>
+            <w:shd w:fill="F5F5F5" w:val="clear"/>
+            <w:tcMar>
+              <w:top w:type="dxa" w:w="60"/>
+              <w:left w:type="dxa" w:w="100"/>
+              <w:bottom w:type="dxa" w:w="60"/>
+              <w:right w:type="dxa" w:w="100"/>
+            </w:tcMar>
+            <w:vAlign w:val="center"/>
+          </w:tcPr>
+          <w:p>
+            <w:pPr>
+              <w:jc w:val="center"/>
+            </w:pPr>
+            <w:r>
+              <w:rPr>
+                <w:b w:val="false"/>
+                <w:bCs w:val="false"/>
+                <w:color w:val="000000"/>
+                <w:sz w:val="19"/>
+                <w:szCs w:val="19"/>
+              </w:rPr>
+              <w:t xml:space="preserve">71.4%</w:t>
+            </w:r>
+          </w:p>
+        </w:tc>
+      </w:tr>
+      <w:tr>
+        <w:tc>
+          <w:tcPr>
+            <w:tcW w:type="dxa" w:w="2350"/>
+            <w:tcMar>
+              <w:top w:type="dxa" w:w="60"/>
+              <w:left w:type="dxa" w:w="100"/>
+              <w:bottom w:type="dxa" w:w="60"/>
+              <w:right w:type="dxa" w:w="100"/>
+            </w:tcMar>
+            <w:vAlign w:val="center"/>
+          </w:tcPr>
+          <w:p>
+            <w:pPr>
+              <w:jc w:val="left"/>
+            </w:pPr>
+            <w:r>
+              <w:rPr>
+                <w:b w:val="false"/>
+                <w:bCs w:val="false"/>
+                <w:color w:val="000000"/>
+                <w:sz w:val="19"/>
+                <w:szCs w:val="19"/>
+              </w:rPr>
+              <w:t xml:space="preserve">Blended</w:t>
+            </w:r>
+          </w:p>
+        </w:tc>
+        <w:tc>
+          <w:tcPr>
+            <w:tcW w:type="dxa" w:w="2350"/>
+            <w:tcMar>
+              <w:top w:type="dxa" w:w="60"/>
+              <w:left w:type="dxa" w:w="100"/>
+              <w:bottom w:type="dxa" w:w="60"/>
+              <w:right w:type="dxa" w:w="100"/>
+            </w:tcMar>
+            <w:vAlign w:val="center"/>
+          </w:tcPr>
+          <w:p>
+            <w:pPr>
+              <w:jc w:val="center"/>
+            </w:pPr>
+            <w:r>
+              <w:rPr>
+                <w:b w:val="false"/>
+                <w:bCs w:val="false"/>
+                <w:color w:val="000000"/>
+                <w:sz w:val="19"/>
+                <w:szCs w:val="19"/>
+              </w:rPr>
+              <w:t xml:space="preserve">877.2M</w:t>
+            </w:r>
+          </w:p>
+        </w:tc>
+        <w:tc>
+          <w:tcPr>
+            <w:tcW w:type="dxa" w:w="2350"/>
+            <w:tcMar>
+              <w:top w:type="dxa" w:w="60"/>
+              <w:left w:type="dxa" w:w="100"/>
+              <w:bottom w:type="dxa" w:w="60"/>
+              <w:right w:type="dxa" w:w="100"/>
+            </w:tcMar>
+            <w:vAlign w:val="center"/>
+          </w:tcPr>
+          <w:p>
+            <w:pPr>
+              <w:jc w:val="center"/>
+            </w:pPr>
+            <w:r>
+              <w:rPr>
+                <w:b w:val="false"/>
+                <w:bCs w:val="false"/>
+                <w:color w:val="000000"/>
+                <w:sz w:val="19"/>
+                <w:szCs w:val="19"/>
+              </w:rPr>
+              <w:t xml:space="preserve">—</w:t>
+            </w:r>
+          </w:p>
+        </w:tc>
+        <w:tc>
+          <w:tcPr>
+            <w:tcW w:type="dxa" w:w="2300"/>
+            <w:tcMar>
+              <w:top w:type="dxa" w:w="60"/>
+              <w:left w:type="dxa" w:w="100"/>
+              <w:bottom w:type="dxa" w:w="60"/>
+              <w:right w:type="dxa" w:w="100"/>
+            </w:tcMar>
+            <w:vAlign w:val="center"/>
+          </w:tcPr>
+          <w:p>
+            <w:pPr>
+              <w:jc w:val="center"/>
+            </w:pPr>
+            <w:r>
+              <w:rPr>
+                <w:b w:val="false"/>
+                <w:bCs w:val="false"/>
+                <w:color w:val="000000"/>
+                <w:sz w:val="19"/>
+                <w:szCs w:val="19"/>
+              </w:rPr>
+              <w:t xml:space="preserve">41.0%</w:t>
+            </w:r>
+          </w:p>
+        </w:tc>
+      </w:tr>
+    </w:tbl>
+    <w:p>
+      <w:pPr>
+        <w:pStyle w:val="Heading2"/>
+        <w:spacing w:after="120" w:before="240"/>
+      </w:pPr>
+      <w:r>
+        <w:t xml:space="preserve">4.1 Pure sensitivity — holding each channel's own margin fixed, varying only the mix</w:t>
+      </w:r>
+    </w:p>
+    <w:tbl>
+      <w:tblPr>
+        <w:tblW w:type="dxa" w:w="9350"/>
+        <w:tblBorders>
+          <w:top w:val="single" w:color="auto" w:sz="4"/>
+          <w:left w:val="single" w:color="auto" w:sz="4"/>
+          <w:bottom w:val="single" w:color="auto" w:sz="4"/>
+          <w:right w:val="single" w:color="auto" w:sz="4"/>
+          <w:insideH w:val="single" w:color="auto" w:sz="4"/>
+          <w:insideV w:val="single" w:color="auto" w:sz="4"/>
+        </w:tblBorders>
+      </w:tblPr>
+      <w:tblGrid>
+        <w:gridCol w:w="3100"/>
+        <w:gridCol w:w="3100"/>
+        <w:gridCol w:w="3150"/>
+      </w:tblGrid>
+      <w:tr>
+        <w:trPr>
+          <w:tblHeader/>
+        </w:trPr>
+        <w:tc>
+          <w:tcPr>
+            <w:tcW w:type="dxa" w:w="3100"/>
+            <w:shd w:fill="2F2F2F" w:val="clear"/>
+            <w:tcMar>
+              <w:top w:type="dxa" w:w="60"/>
+              <w:left w:type="dxa" w:w="100"/>
+              <w:bottom w:type="dxa" w:w="60"/>
+              <w:right w:type="dxa" w:w="100"/>
+            </w:tcMar>
+            <w:vAlign w:val="center"/>
+          </w:tcPr>
+          <w:p>
+            <w:pPr>
+              <w:jc w:val="left"/>
+            </w:pPr>
+            <w:r>
+              <w:rPr>
+                <w:b/>
+                <w:bCs/>
+                <w:color w:val="FFFFFF"/>
+                <w:sz w:val="19"/>
+                <w:szCs w:val="19"/>
+              </w:rPr>
+              <w:t xml:space="preserve">Wholesale share</w:t>
+            </w:r>
+          </w:p>
+        </w:tc>
+        <w:tc>
+          <w:tcPr>
+            <w:tcW w:type="dxa" w:w="3100"/>
+            <w:shd w:fill="2F2F2F" w:val="clear"/>
+            <w:tcMar>
+              <w:top w:type="dxa" w:w="60"/>
+              <w:left w:type="dxa" w:w="100"/>
+              <w:bottom w:type="dxa" w:w="60"/>
+              <w:right w:type="dxa" w:w="100"/>
+            </w:tcMar>
+            <w:vAlign w:val="center"/>
+          </w:tcPr>
+          <w:p>
+            <w:pPr>
+              <w:jc w:val="center"/>
+            </w:pPr>
+            <w:r>
+              <w:rPr>
+                <w:b/>
+                <w:bCs/>
+                <w:color w:val="FFFFFF"/>
+                <w:sz w:val="19"/>
+                <w:szCs w:val="19"/>
+              </w:rPr>
+              <w:t xml:space="preserve">Blended GM%</w:t>
+            </w:r>
+          </w:p>
+        </w:tc>
+        <w:tc>
+          <w:tcPr>
+            <w:tcW w:type="dxa" w:w="3150"/>
+            <w:shd w:fill="2F2F2F" w:val="clear"/>
+            <w:tcMar>
+              <w:top w:type="dxa" w:w="60"/>
+              <w:left w:type="dxa" w:w="100"/>
+              <w:bottom w:type="dxa" w:w="60"/>
+              <w:right w:type="dxa" w:w="100"/>
+            </w:tcMar>
+            <w:vAlign w:val="center"/>
+          </w:tcPr>
+          <w:p>
+            <w:pPr>
+              <w:jc w:val="center"/>
+            </w:pPr>
+            <w:r>
+              <w:rPr>
+                <w:b/>
+                <w:bCs/>
+                <w:color w:val="FFFFFF"/>
+                <w:sz w:val="19"/>
+                <w:szCs w:val="19"/>
+              </w:rPr>
+              <w:t xml:space="preserve">Change vs. 2025</w:t>
+            </w:r>
+          </w:p>
+        </w:tc>
+      </w:tr>
+      <w:tr>
+        <w:tc>
+          <w:tcPr>
+            <w:tcW w:type="dxa" w:w="3100"/>
+            <w:tcMar>
+              <w:top w:type="dxa" w:w="60"/>
+              <w:left w:type="dxa" w:w="100"/>
+              <w:bottom w:type="dxa" w:w="60"/>
+              <w:right w:type="dxa" w:w="100"/>
+            </w:tcMar>
+            <w:vAlign w:val="center"/>
+          </w:tcPr>
+          <w:p>
+            <w:pPr>
+              <w:jc w:val="left"/>
+            </w:pPr>
+            <w:r>
+              <w:rPr>
+                <w:b w:val="false"/>
+                <w:bCs w:val="false"/>
+                <w:color w:val="000000"/>
+                <w:sz w:val="19"/>
+                <w:szCs w:val="19"/>
+              </w:rPr>
+              <w:t xml:space="preserve">75.1% (current)</w:t>
+            </w:r>
+          </w:p>
+        </w:tc>
+        <w:tc>
+          <w:tcPr>
+            <w:tcW w:type="dxa" w:w="3100"/>
+            <w:tcMar>
+              <w:top w:type="dxa" w:w="60"/>
+              <w:left w:type="dxa" w:w="100"/>
+              <w:bottom w:type="dxa" w:w="60"/>
+              <w:right w:type="dxa" w:w="100"/>
+            </w:tcMar>
+            <w:vAlign w:val="center"/>
+          </w:tcPr>
+          <w:p>
+            <w:pPr>
+              <w:jc w:val="center"/>
+            </w:pPr>
+            <w:r>
+              <w:rPr>
+                <w:b w:val="false"/>
+                <w:bCs w:val="false"/>
+                <w:color w:val="000000"/>
+                <w:sz w:val="19"/>
+                <w:szCs w:val="19"/>
+              </w:rPr>
+              <w:t xml:space="preserve">41.0%</w:t>
+            </w:r>
+          </w:p>
+        </w:tc>
+        <w:tc>
+          <w:tcPr>
+            <w:tcW w:type="dxa" w:w="3150"/>
+            <w:tcMar>
+              <w:top w:type="dxa" w:w="60"/>
+              <w:left w:type="dxa" w:w="100"/>
+              <w:bottom w:type="dxa" w:w="60"/>
+              <w:right w:type="dxa" w:w="100"/>
+            </w:tcMar>
+            <w:vAlign w:val="center"/>
+          </w:tcPr>
+          <w:p>
+            <w:pPr>
+              <w:jc w:val="center"/>
+            </w:pPr>
+            <w:r>
+              <w:rPr>
+                <w:b w:val="false"/>
+                <w:bCs w:val="false"/>
+                <w:color w:val="000000"/>
+                <w:sz w:val="19"/>
+                <w:szCs w:val="19"/>
+              </w:rPr>
+              <w:t xml:space="preserve">—</w:t>
+            </w:r>
+          </w:p>
+        </w:tc>
+      </w:tr>
+      <w:tr>
+        <w:tc>
+          <w:tcPr>
+            <w:tcW w:type="dxa" w:w="3100"/>
+            <w:shd w:fill="F5F5F5" w:val="clear"/>
+            <w:tcMar>
+              <w:top w:type="dxa" w:w="60"/>
+              <w:left w:type="dxa" w:w="100"/>
+              <w:bottom w:type="dxa" w:w="60"/>
+              <w:right w:type="dxa" w:w="100"/>
+            </w:tcMar>
+            <w:vAlign w:val="center"/>
+          </w:tcPr>
+          <w:p>
+            <w:pPr>
+              <w:jc w:val="left"/>
+            </w:pPr>
+            <w:r>
+              <w:rPr>
+                <w:b w:val="false"/>
+                <w:bCs w:val="false"/>
+                <w:color w:val="000000"/>
+                <w:sz w:val="19"/>
+                <w:szCs w:val="19"/>
+              </w:rPr>
+              <w:t xml:space="preserve">70.0%</w:t>
+            </w:r>
+          </w:p>
+        </w:tc>
+        <w:tc>
+          <w:tcPr>
+            <w:tcW w:type="dxa" w:w="3100"/>
+            <w:shd w:fill="F5F5F5" w:val="clear"/>
+            <w:tcMar>
+              <w:top w:type="dxa" w:w="60"/>
+              <w:left w:type="dxa" w:w="100"/>
+              <w:bottom w:type="dxa" w:w="60"/>
+              <w:right w:type="dxa" w:w="100"/>
+            </w:tcMar>
+            <w:vAlign w:val="center"/>
+          </w:tcPr>
+          <w:p>
+            <w:pPr>
+              <w:jc w:val="center"/>
+            </w:pPr>
+            <w:r>
+              <w:rPr>
+                <w:b w:val="false"/>
+                <w:bCs w:val="false"/>
+                <w:color w:val="000000"/>
+                <w:sz w:val="19"/>
+                <w:szCs w:val="19"/>
+              </w:rPr>
+              <w:t xml:space="preserve">41.9%</w:t>
+            </w:r>
+          </w:p>
+        </w:tc>
+        <w:tc>
+          <w:tcPr>
+            <w:tcW w:type="dxa" w:w="3150"/>
+            <w:shd w:fill="F5F5F5" w:val="clear"/>
+            <w:tcMar>
+              <w:top w:type="dxa" w:w="60"/>
+              <w:left w:type="dxa" w:w="100"/>
+              <w:bottom w:type="dxa" w:w="60"/>
+              <w:right w:type="dxa" w:w="100"/>
+            </w:tcMar>
+            <w:vAlign w:val="center"/>
+          </w:tcPr>
+          <w:p>
+            <w:pPr>
+              <w:jc w:val="center"/>
+            </w:pPr>
+            <w:r>
+              <w:rPr>
+                <w:b w:val="false"/>
+                <w:bCs w:val="false"/>
+                <w:color w:val="000000"/>
+                <w:sz w:val="19"/>
+                <w:szCs w:val="19"/>
+              </w:rPr>
+              <w:t xml:space="preserve">+0.9pt</w:t>
+            </w:r>
+          </w:p>
+        </w:tc>
+      </w:tr>
+      <w:tr>
+        <w:tc>
+          <w:tcPr>
+            <w:tcW w:type="dxa" w:w="3100"/>
+            <w:tcMar>
+              <w:top w:type="dxa" w:w="60"/>
+              <w:left w:type="dxa" w:w="100"/>
+              <w:bottom w:type="dxa" w:w="60"/>
+              <w:right w:type="dxa" w:w="100"/>
+            </w:tcMar>
+            <w:vAlign w:val="center"/>
+          </w:tcPr>
+          <w:p>
+            <w:pPr>
+              <w:jc w:val="left"/>
+            </w:pPr>
+            <w:r>
+              <w:rPr>
+                <w:b w:val="false"/>
+                <w:bCs w:val="false"/>
+                <w:color w:val="000000"/>
+                <w:sz w:val="19"/>
+                <w:szCs w:val="19"/>
+              </w:rPr>
+              <w:t xml:space="preserve">65.0%</w:t>
+            </w:r>
+          </w:p>
+        </w:tc>
+        <w:tc>
+          <w:tcPr>
+            <w:tcW w:type="dxa" w:w="3100"/>
+            <w:tcMar>
+              <w:top w:type="dxa" w:w="60"/>
+              <w:left w:type="dxa" w:w="100"/>
+              <w:bottom w:type="dxa" w:w="60"/>
+              <w:right w:type="dxa" w:w="100"/>
+            </w:tcMar>
+            <w:vAlign w:val="center"/>
+          </w:tcPr>
+          <w:p>
+            <w:pPr>
+              <w:jc w:val="center"/>
+            </w:pPr>
+            <w:r>
+              <w:rPr>
+                <w:b w:val="false"/>
+                <w:bCs w:val="false"/>
+                <w:color w:val="000000"/>
+                <w:sz w:val="19"/>
+                <w:szCs w:val="19"/>
+              </w:rPr>
+              <w:t xml:space="preserve">42.8%</w:t>
+            </w:r>
+          </w:p>
+        </w:tc>
+        <w:tc>
+          <w:tcPr>
+            <w:tcW w:type="dxa" w:w="3150"/>
+            <w:tcMar>
+              <w:top w:type="dxa" w:w="60"/>
+              <w:left w:type="dxa" w:w="100"/>
+              <w:bottom w:type="dxa" w:w="60"/>
+              <w:right w:type="dxa" w:w="100"/>
+            </w:tcMar>
+            <w:vAlign w:val="center"/>
+          </w:tcPr>
+          <w:p>
+            <w:pPr>
+              <w:jc w:val="center"/>
+            </w:pPr>
+            <w:r>
+              <w:rPr>
+                <w:b w:val="false"/>
+                <w:bCs w:val="false"/>
+                <w:color w:val="000000"/>
+                <w:sz w:val="19"/>
+                <w:szCs w:val="19"/>
+              </w:rPr>
+              <w:t xml:space="preserve">+1.8pt</w:t>
+            </w:r>
+          </w:p>
+        </w:tc>
+      </w:tr>
+      <w:tr>
+        <w:tc>
+          <w:tcPr>
+            <w:tcW w:type="dxa" w:w="3100"/>
+            <w:shd w:fill="F5F5F5" w:val="clear"/>
+            <w:tcMar>
+              <w:top w:type="dxa" w:w="60"/>
+              <w:left w:type="dxa" w:w="100"/>
+              <w:bottom w:type="dxa" w:w="60"/>
+              <w:right w:type="dxa" w:w="100"/>
+            </w:tcMar>
+            <w:vAlign w:val="center"/>
+          </w:tcPr>
+          <w:p>
+            <w:pPr>
+              <w:jc w:val="left"/>
+            </w:pPr>
+            <w:r>
+              <w:rPr>
+                <w:b w:val="false"/>
+                <w:bCs w:val="false"/>
+                <w:color w:val="000000"/>
+                <w:sz w:val="19"/>
+                <w:szCs w:val="19"/>
+              </w:rPr>
+              <w:t xml:space="preserve">60.0%</w:t>
+            </w:r>
+          </w:p>
+        </w:tc>
+        <w:tc>
+          <w:tcPr>
+            <w:tcW w:type="dxa" w:w="3100"/>
+            <w:shd w:fill="F5F5F5" w:val="clear"/>
+            <w:tcMar>
+              <w:top w:type="dxa" w:w="60"/>
+              <w:left w:type="dxa" w:w="100"/>
+              <w:bottom w:type="dxa" w:w="60"/>
+              <w:right w:type="dxa" w:w="100"/>
+            </w:tcMar>
+            <w:vAlign w:val="center"/>
+          </w:tcPr>
+          <w:p>
+            <w:pPr>
+              <w:jc w:val="center"/>
+            </w:pPr>
+            <w:r>
+              <w:rPr>
+                <w:b w:val="false"/>
+                <w:bCs w:val="false"/>
+                <w:color w:val="000000"/>
+                <w:sz w:val="19"/>
+                <w:szCs w:val="19"/>
+              </w:rPr>
+              <w:t xml:space="preserve">43.7%</w:t>
+            </w:r>
+          </w:p>
+        </w:tc>
+        <w:tc>
+          <w:tcPr>
+            <w:tcW w:type="dxa" w:w="3150"/>
+            <w:shd w:fill="F5F5F5" w:val="clear"/>
+            <w:tcMar>
+              <w:top w:type="dxa" w:w="60"/>
+              <w:left w:type="dxa" w:w="100"/>
+              <w:bottom w:type="dxa" w:w="60"/>
+              <w:right w:type="dxa" w:w="100"/>
+            </w:tcMar>
+            <w:vAlign w:val="center"/>
+          </w:tcPr>
+          <w:p>
+            <w:pPr>
+              <w:jc w:val="center"/>
+            </w:pPr>
+            <w:r>
+              <w:rPr>
+                <w:b w:val="false"/>
+                <w:bCs w:val="false"/>
+                <w:color w:val="000000"/>
+                <w:sz w:val="19"/>
+                <w:szCs w:val="19"/>
+              </w:rPr>
+              <w:t xml:space="preserve">+2.7pt</w:t>
+            </w:r>
+          </w:p>
+        </w:tc>
+      </w:tr>
+      <w:tr>
+        <w:tc>
+          <w:tcPr>
+            <w:tcW w:type="dxa" w:w="3100"/>
+            <w:tcMar>
+              <w:top w:type="dxa" w:w="60"/>
+              <w:left w:type="dxa" w:w="100"/>
+              <w:bottom w:type="dxa" w:w="60"/>
+              <w:right w:type="dxa" w:w="100"/>
+            </w:tcMar>
+            <w:vAlign w:val="center"/>
+          </w:tcPr>
+          <w:p>
+            <w:pPr>
+              <w:jc w:val="left"/>
+            </w:pPr>
+            <w:r>
+              <w:rPr>
+                <w:b w:val="false"/>
+                <w:bCs w:val="false"/>
+                <w:color w:val="000000"/>
+                <w:sz w:val="19"/>
+                <w:szCs w:val="19"/>
+              </w:rPr>
+              <w:t xml:space="preserve">55.0%</w:t>
+            </w:r>
+          </w:p>
+        </w:tc>
+        <w:tc>
+          <w:tcPr>
+            <w:tcW w:type="dxa" w:w="3100"/>
+            <w:tcMar>
+              <w:top w:type="dxa" w:w="60"/>
+              <w:left w:type="dxa" w:w="100"/>
+              <w:bottom w:type="dxa" w:w="60"/>
+              <w:right w:type="dxa" w:w="100"/>
+            </w:tcMar>
+            <w:vAlign w:val="center"/>
+          </w:tcPr>
+          <w:p>
+            <w:pPr>
+              <w:jc w:val="center"/>
+            </w:pPr>
+            <w:r>
+              <w:rPr>
+                <w:b w:val="false"/>
+                <w:bCs w:val="false"/>
+                <w:color w:val="000000"/>
+                <w:sz w:val="19"/>
+                <w:szCs w:val="19"/>
+              </w:rPr>
+              <w:t xml:space="preserve">44.6%</w:t>
+            </w:r>
+          </w:p>
+        </w:tc>
+        <w:tc>
+          <w:tcPr>
+            <w:tcW w:type="dxa" w:w="3150"/>
+            <w:tcMar>
+              <w:top w:type="dxa" w:w="60"/>
+              <w:left w:type="dxa" w:w="100"/>
+              <w:bottom w:type="dxa" w:w="60"/>
+              <w:right w:type="dxa" w:w="100"/>
+            </w:tcMar>
+            <w:vAlign w:val="center"/>
+          </w:tcPr>
+          <w:p>
+            <w:pPr>
+              <w:jc w:val="center"/>
+            </w:pPr>
+            <w:r>
+              <w:rPr>
+                <w:b w:val="false"/>
+                <w:bCs w:val="false"/>
+                <w:color w:val="000000"/>
+                <w:sz w:val="19"/>
+                <w:szCs w:val="19"/>
+              </w:rPr>
+              <w:t xml:space="preserve">+3.6pt</w:t>
+            </w:r>
+          </w:p>
+        </w:tc>
+      </w:tr>
+      <w:tr>
+        <w:tc>
+          <w:tcPr>
+            <w:tcW w:type="dxa" w:w="3100"/>
+            <w:shd w:fill="F5F5F5" w:val="clear"/>
+            <w:tcMar>
+              <w:top w:type="dxa" w:w="60"/>
+              <w:left w:type="dxa" w:w="100"/>
+              <w:bottom w:type="dxa" w:w="60"/>
+              <w:right w:type="dxa" w:w="100"/>
+            </w:tcMar>
+            <w:vAlign w:val="center"/>
+          </w:tcPr>
+          <w:p>
+            <w:pPr>
+              <w:jc w:val="left"/>
+            </w:pPr>
+            <w:r>
+              <w:rPr>
+                <w:b w:val="false"/>
+                <w:bCs w:val="false"/>
+                <w:color w:val="000000"/>
+                <w:sz w:val="19"/>
+                <w:szCs w:val="19"/>
+              </w:rPr>
+              <w:t xml:space="preserve">50.0%</w:t>
+            </w:r>
+          </w:p>
+        </w:tc>
+        <w:tc>
+          <w:tcPr>
+            <w:tcW w:type="dxa" w:w="3100"/>
+            <w:shd w:fill="F5F5F5" w:val="clear"/>
+            <w:tcMar>
+              <w:top w:type="dxa" w:w="60"/>
+              <w:left w:type="dxa" w:w="100"/>
+              <w:bottom w:type="dxa" w:w="60"/>
+              <w:right w:type="dxa" w:w="100"/>
+            </w:tcMar>
+            <w:vAlign w:val="center"/>
+          </w:tcPr>
+          <w:p>
+            <w:pPr>
+              <w:jc w:val="center"/>
+            </w:pPr>
+            <w:r>
+              <w:rPr>
+                <w:b w:val="false"/>
+                <w:bCs w:val="false"/>
+                <w:color w:val="000000"/>
+                <w:sz w:val="19"/>
+                <w:szCs w:val="19"/>
+              </w:rPr>
+              <w:t xml:space="preserve">45.5%</w:t>
+            </w:r>
+          </w:p>
+        </w:tc>
+        <w:tc>
+          <w:tcPr>
+            <w:tcW w:type="dxa" w:w="3150"/>
+            <w:shd w:fill="F5F5F5" w:val="clear"/>
+            <w:tcMar>
+              <w:top w:type="dxa" w:w="60"/>
+              <w:left w:type="dxa" w:w="100"/>
+              <w:bottom w:type="dxa" w:w="60"/>
+              <w:right w:type="dxa" w:w="100"/>
+            </w:tcMar>
+            <w:vAlign w:val="center"/>
+          </w:tcPr>
+          <w:p>
+            <w:pPr>
+              <w:jc w:val="center"/>
+            </w:pPr>
+            <w:r>
+              <w:rPr>
+                <w:b w:val="false"/>
+                <w:bCs w:val="false"/>
+                <w:color w:val="000000"/>
+                <w:sz w:val="19"/>
+                <w:szCs w:val="19"/>
+              </w:rPr>
+              <w:t xml:space="preserve">+4.5pt</w:t>
+            </w:r>
+          </w:p>
+        </w:tc>
+      </w:tr>
+    </w:tbl>
+    <w:p>
+      <w:pPr>
+        <w:pStyle w:val="Heading2"/>
+        <w:spacing w:after="120" w:before="240"/>
+      </w:pPr>
+      <w:r>
+        <w:t xml:space="preserve">4.2 Grounded scenario — the actual, already-approved plan</w:t>
+      </w:r>
+    </w:p>
+    <w:p>
+      <w:pPr>
+        <w:pBdr>
+          <w:left w:val="single" w:color="3C8A4C" w:sz="18"/>
+        </w:pBdr>
+        <w:shd w:fill="EAF3EA" w:val="clear"/>
+        <w:spacing w:after="120" w:before="100"/>
+        <w:ind w:left="150" w:right="100"/>
+      </w:pPr>
+      <w:r>
+        <w:rPr>
+          <w:b/>
+          <w:bCs/>
+          <w:color w:val="1F5C2E"/>
+        </w:rPr>
+        <w:t xml:space="preserve">DATA SHOWS: </w:t>
+      </w:r>
+      <w:r>
+        <w:t xml:space="preserve">Adding the Item 4 new-store run-rate (181.8M SEK, full ramp ~2029, per the MTP slide) on top of an otherwise-unchanged 2025 base, at existing-Retail-level margin (49.0%): Wholesale share falls from 75.1% to 62.2%, and blended margin rises from 41.0% to 42.4% -- worth +1.36pt.</w:t>
+      </w:r>
+    </w:p>
+    <w:p>
+      <w:pPr>
+        <w:pBdr>
+          <w:left w:val="single" w:color="B23A3A" w:sz="18"/>
+        </w:pBdr>
+        <w:shd w:fill="FBE7E7" w:val="clear"/>
+        <w:spacing w:after="120" w:before="100"/>
+        <w:ind w:left="150" w:right="100"/>
+      </w:pPr>
+      <w:r>
+        <w:rPr>
+          <w:b/>
+          <w:bCs/>
+          <w:color w:val="7A1F1F"/>
+        </w:rPr>
+        <w:t xml:space="preserve">UNEXPLAINED GAP: </w:t>
+      </w:r>
+      <w:r>
+        <w:t xml:space="preserve">Honest verdict: this lever is real but not the answer. Even a genuinely aggressive mix shift -- cutting Wholesale's share by a third, from 75% to 50%, far beyond anything currently planned -- is only worth +4.5pt. The plan that's actually been approved (the 16 new stores) is worth +1.4pt. Against a residual in the 9-11pt range, channel mix closes at most half of it under an aggressive scenario, and about an eighth of it under the approved plan.</w:t>
+      </w:r>
+    </w:p>
+    <w:p>
+      <w:pPr>
+        <w:pStyle w:val="Heading1"/>
+        <w:spacing w:after="160" w:before="320"/>
+      </w:pPr>
+      <w:r>
+        <w:t xml:space="preserve">5. Portfolio tier-mix optimization — sized this round</w:t>
+      </w:r>
+    </w:p>
+    <w:p>
+      <w:pPr>
+        <w:spacing w:after="160"/>
+      </w:pPr>
+      <w:r>
+        <w:t xml:space="preserve">The original margin bridge sized only a conservative 'floor fix' for Problem Child (bring the 129-franchise, 88.5M SEK 'Core Pricing Fix' bucket from 33.4% up to the 40% GM floor used to define the tier). This section asks a bigger question: what if the fix is a genuine turnaround, not just clearing a floor -- and what if the Thin tier's exited volume is replaced by equivalent-value product rather than simply deleted?</w:t>
+      </w:r>
+    </w:p>
+    <w:tbl>
+      <w:tblPr>
+        <w:tblW w:type="dxa" w:w="9350"/>
+        <w:tblBorders>
+          <w:top w:val="single" w:color="auto" w:sz="4"/>
+          <w:left w:val="single" w:color="auto" w:sz="4"/>
+          <w:bottom w:val="single" w:color="auto" w:sz="4"/>
+          <w:right w:val="single" w:color="auto" w:sz="4"/>
+          <w:insideH w:val="single" w:color="auto" w:sz="4"/>
+          <w:insideV w:val="single" w:color="auto" w:sz="4"/>
+        </w:tblBorders>
+      </w:tblPr>
+      <w:tblGrid>
+        <w:gridCol w:w="3300"/>
+        <w:gridCol w:w="1500"/>
+        <w:gridCol w:w="1650"/>
+        <w:gridCol w:w="2900"/>
+      </w:tblGrid>
+      <w:tr>
+        <w:trPr>
+          <w:tblHeader/>
+        </w:trPr>
+        <w:tc>
+          <w:tcPr>
+            <w:tcW w:type="dxa" w:w="3300"/>
+            <w:shd w:fill="2F2F2F" w:val="clear"/>
+            <w:tcMar>
+              <w:top w:type="dxa" w:w="60"/>
+              <w:left w:type="dxa" w:w="100"/>
+              <w:bottom w:type="dxa" w:w="60"/>
+              <w:right w:type="dxa" w:w="100"/>
+            </w:tcMar>
+            <w:vAlign w:val="center"/>
+          </w:tcPr>
+          <w:p>
+            <w:pPr>
+              <w:jc w:val="left"/>
+            </w:pPr>
+            <w:r>
+              <w:rPr>
+                <w:b/>
+                <w:bCs/>
+                <w:color w:val="FFFFFF"/>
+                <w:sz w:val="19"/>
+                <w:szCs w:val="19"/>
+              </w:rPr>
+              <w:t xml:space="preserve">Scenario</w:t>
+            </w:r>
+          </w:p>
+        </w:tc>
+        <w:tc>
+          <w:tcPr>
+            <w:tcW w:type="dxa" w:w="1500"/>
+            <w:shd w:fill="2F2F2F" w:val="clear"/>
+            <w:tcMar>
+              <w:top w:type="dxa" w:w="60"/>
+              <w:left w:type="dxa" w:w="100"/>
+              <w:bottom w:type="dxa" w:w="60"/>
+              <w:right w:type="dxa" w:w="100"/>
+            </w:tcMar>
+            <w:vAlign w:val="center"/>
+          </w:tcPr>
+          <w:p>
+            <w:pPr>
+              <w:jc w:val="center"/>
+            </w:pPr>
+            <w:r>
+              <w:rPr>
+                <w:b/>
+                <w:bCs/>
+                <w:color w:val="FFFFFF"/>
+                <w:sz w:val="19"/>
+                <w:szCs w:val="19"/>
+              </w:rPr>
+              <w:t xml:space="preserve">SEK impact</w:t>
+            </w:r>
+          </w:p>
+        </w:tc>
+        <w:tc>
+          <w:tcPr>
+            <w:tcW w:type="dxa" w:w="1650"/>
+            <w:shd w:fill="2F2F2F" w:val="clear"/>
+            <w:tcMar>
+              <w:top w:type="dxa" w:w="60"/>
+              <w:left w:type="dxa" w:w="100"/>
+              <w:bottom w:type="dxa" w:w="60"/>
+              <w:right w:type="dxa" w:w="100"/>
+            </w:tcMar>
+            <w:vAlign w:val="center"/>
+          </w:tcPr>
+          <w:p>
+            <w:pPr>
+              <w:jc w:val="center"/>
+            </w:pPr>
+            <w:r>
+              <w:rPr>
+                <w:b/>
+                <w:bCs/>
+                <w:color w:val="FFFFFF"/>
+                <w:sz w:val="19"/>
+                <w:szCs w:val="19"/>
+              </w:rPr>
+              <w:t xml:space="preserve">Pt of company sales</w:t>
+            </w:r>
+          </w:p>
+        </w:tc>
+        <w:tc>
+          <w:tcPr>
+            <w:tcW w:type="dxa" w:w="2900"/>
+            <w:shd w:fill="2F2F2F" w:val="clear"/>
+            <w:tcMar>
+              <w:top w:type="dxa" w:w="60"/>
+              <w:left w:type="dxa" w:w="100"/>
+              <w:bottom w:type="dxa" w:w="60"/>
+              <w:right w:type="dxa" w:w="100"/>
+            </w:tcMar>
+            <w:vAlign w:val="center"/>
+          </w:tcPr>
+          <w:p>
+            <w:pPr>
+              <w:jc w:val="center"/>
+            </w:pPr>
+            <w:r>
+              <w:rPr>
+                <w:b/>
+                <w:bCs/>
+                <w:color w:val="FFFFFF"/>
+                <w:sz w:val="19"/>
+                <w:szCs w:val="19"/>
+              </w:rPr>
+              <w:t xml:space="preserve">Note</w:t>
+            </w:r>
+          </w:p>
+        </w:tc>
+      </w:tr>
+      <w:tr>
+        <w:tc>
+          <w:tcPr>
+            <w:tcW w:type="dxa" w:w="3300"/>
+            <w:tcMar>
+              <w:top w:type="dxa" w:w="60"/>
+              <w:left w:type="dxa" w:w="100"/>
+              <w:bottom w:type="dxa" w:w="60"/>
+              <w:right w:type="dxa" w:w="100"/>
+            </w:tcMar>
+            <w:vAlign w:val="center"/>
+          </w:tcPr>
+          <w:p>
+            <w:pPr>
+              <w:jc w:val="left"/>
+            </w:pPr>
+            <w:r>
+              <w:rPr>
+                <w:b w:val="false"/>
+                <w:bCs w:val="false"/>
+                <w:color w:val="000000"/>
+                <w:sz w:val="19"/>
+                <w:szCs w:val="19"/>
+              </w:rPr>
+              <w:t xml:space="preserve">A: Problem Child -&gt; 40% GM floor</w:t>
+            </w:r>
+          </w:p>
+        </w:tc>
+        <w:tc>
+          <w:tcPr>
+            <w:tcW w:type="dxa" w:w="1500"/>
+            <w:tcMar>
+              <w:top w:type="dxa" w:w="60"/>
+              <w:left w:type="dxa" w:w="100"/>
+              <w:bottom w:type="dxa" w:w="60"/>
+              <w:right w:type="dxa" w:w="100"/>
+            </w:tcMar>
+            <w:vAlign w:val="center"/>
+          </w:tcPr>
+          <w:p>
+            <w:pPr>
+              <w:jc w:val="center"/>
+            </w:pPr>
+            <w:r>
+              <w:rPr>
+                <w:b w:val="false"/>
+                <w:bCs w:val="false"/>
+                <w:color w:val="000000"/>
+                <w:sz w:val="19"/>
+                <w:szCs w:val="19"/>
+              </w:rPr>
+              <w:t xml:space="preserve">5.8M</w:t>
+            </w:r>
+          </w:p>
+        </w:tc>
+        <w:tc>
+          <w:tcPr>
+            <w:tcW w:type="dxa" w:w="1650"/>
+            <w:tcMar>
+              <w:top w:type="dxa" w:w="60"/>
+              <w:left w:type="dxa" w:w="100"/>
+              <w:bottom w:type="dxa" w:w="60"/>
+              <w:right w:type="dxa" w:w="100"/>
+            </w:tcMar>
+            <w:vAlign w:val="center"/>
+          </w:tcPr>
+          <w:p>
+            <w:pPr>
+              <w:jc w:val="center"/>
+            </w:pPr>
+            <w:r>
+              <w:rPr>
+                <w:b w:val="false"/>
+                <w:bCs w:val="false"/>
+                <w:color w:val="000000"/>
+                <w:sz w:val="19"/>
+                <w:szCs w:val="19"/>
+              </w:rPr>
+              <w:t xml:space="preserve">+0.69pt</w:t>
+            </w:r>
+          </w:p>
+        </w:tc>
+        <w:tc>
+          <w:tcPr>
+            <w:tcW w:type="dxa" w:w="2900"/>
+            <w:tcMar>
+              <w:top w:type="dxa" w:w="60"/>
+              <w:left w:type="dxa" w:w="100"/>
+              <w:bottom w:type="dxa" w:w="60"/>
+              <w:right w:type="dxa" w:w="100"/>
+            </w:tcMar>
+            <w:vAlign w:val="center"/>
+          </w:tcPr>
+          <w:p>
+            <w:pPr>
+              <w:jc w:val="center"/>
+            </w:pPr>
+            <w:r>
+              <w:rPr>
+                <w:b w:val="false"/>
+                <w:bCs w:val="false"/>
+                <w:color w:val="000000"/>
+                <w:sz w:val="19"/>
+                <w:szCs w:val="19"/>
+              </w:rPr>
+              <w:t xml:space="preserve">Conservative — floor only (original bridge figure)</w:t>
+            </w:r>
+          </w:p>
+        </w:tc>
+      </w:tr>
+      <w:tr>
+        <w:tc>
+          <w:tcPr>
+            <w:tcW w:type="dxa" w:w="3300"/>
+            <w:shd w:fill="F5F5F5" w:val="clear"/>
+            <w:tcMar>
+              <w:top w:type="dxa" w:w="60"/>
+              <w:left w:type="dxa" w:w="100"/>
+              <w:bottom w:type="dxa" w:w="60"/>
+              <w:right w:type="dxa" w:w="100"/>
+            </w:tcMar>
+            <w:vAlign w:val="center"/>
+          </w:tcPr>
+          <w:p>
+            <w:pPr>
+              <w:jc w:val="left"/>
+            </w:pPr>
+            <w:r>
+              <w:rPr>
+                <w:b w:val="false"/>
+                <w:bCs w:val="false"/>
+                <w:color w:val="000000"/>
+                <w:sz w:val="19"/>
+                <w:szCs w:val="19"/>
+              </w:rPr>
+              <w:t xml:space="preserve">B1: Problem Child -&gt; Workhorse-level margin (47.5%)</w:t>
+            </w:r>
+          </w:p>
+        </w:tc>
+        <w:tc>
+          <w:tcPr>
+            <w:tcW w:type="dxa" w:w="1500"/>
+            <w:shd w:fill="F5F5F5" w:val="clear"/>
+            <w:tcMar>
+              <w:top w:type="dxa" w:w="60"/>
+              <w:left w:type="dxa" w:w="100"/>
+              <w:bottom w:type="dxa" w:w="60"/>
+              <w:right w:type="dxa" w:w="100"/>
+            </w:tcMar>
+            <w:vAlign w:val="center"/>
+          </w:tcPr>
+          <w:p>
+            <w:pPr>
+              <w:jc w:val="center"/>
+            </w:pPr>
+            <w:r>
+              <w:rPr>
+                <w:b w:val="false"/>
+                <w:bCs w:val="false"/>
+                <w:color w:val="000000"/>
+                <w:sz w:val="19"/>
+                <w:szCs w:val="19"/>
+              </w:rPr>
+              <w:t xml:space="preserve">12.4M</w:t>
+            </w:r>
+          </w:p>
+        </w:tc>
+        <w:tc>
+          <w:tcPr>
+            <w:tcW w:type="dxa" w:w="1650"/>
+            <w:shd w:fill="F5F5F5" w:val="clear"/>
+            <w:tcMar>
+              <w:top w:type="dxa" w:w="60"/>
+              <w:left w:type="dxa" w:w="100"/>
+              <w:bottom w:type="dxa" w:w="60"/>
+              <w:right w:type="dxa" w:w="100"/>
+            </w:tcMar>
+            <w:vAlign w:val="center"/>
+          </w:tcPr>
+          <w:p>
+            <w:pPr>
+              <w:jc w:val="center"/>
+            </w:pPr>
+            <w:r>
+              <w:rPr>
+                <w:b w:val="false"/>
+                <w:bCs w:val="false"/>
+                <w:color w:val="000000"/>
+                <w:sz w:val="19"/>
+                <w:szCs w:val="19"/>
+              </w:rPr>
+              <w:t xml:space="preserve">+1.47pt</w:t>
+            </w:r>
+          </w:p>
+        </w:tc>
+        <w:tc>
+          <w:tcPr>
+            <w:tcW w:type="dxa" w:w="2900"/>
+            <w:shd w:fill="F5F5F5" w:val="clear"/>
+            <w:tcMar>
+              <w:top w:type="dxa" w:w="60"/>
+              <w:left w:type="dxa" w:w="100"/>
+              <w:bottom w:type="dxa" w:w="60"/>
+              <w:right w:type="dxa" w:w="100"/>
+            </w:tcMar>
+            <w:vAlign w:val="center"/>
+          </w:tcPr>
+          <w:p>
+            <w:pPr>
+              <w:jc w:val="center"/>
+            </w:pPr>
+            <w:r>
+              <w:rPr>
+                <w:b w:val="false"/>
+                <w:bCs w:val="false"/>
+                <w:color w:val="000000"/>
+                <w:sz w:val="19"/>
+                <w:szCs w:val="19"/>
+              </w:rPr>
+              <w:t xml:space="preserve">Moderate — genuine turnaround, not just floor</w:t>
+            </w:r>
+          </w:p>
+        </w:tc>
+      </w:tr>
+      <w:tr>
+        <w:tc>
+          <w:tcPr>
+            <w:tcW w:type="dxa" w:w="3300"/>
+            <w:tcMar>
+              <w:top w:type="dxa" w:w="60"/>
+              <w:left w:type="dxa" w:w="100"/>
+              <w:bottom w:type="dxa" w:w="60"/>
+              <w:right w:type="dxa" w:w="100"/>
+            </w:tcMar>
+            <w:vAlign w:val="center"/>
+          </w:tcPr>
+          <w:p>
+            <w:pPr>
+              <w:jc w:val="left"/>
+            </w:pPr>
+            <w:r>
+              <w:rPr>
+                <w:b w:val="false"/>
+                <w:bCs w:val="false"/>
+                <w:color w:val="000000"/>
+                <w:sz w:val="19"/>
+                <w:szCs w:val="19"/>
+              </w:rPr>
+              <w:t xml:space="preserve">B2: Thin tier (8.1M) replaced at Workhorse-level margin</w:t>
+            </w:r>
+          </w:p>
+        </w:tc>
+        <w:tc>
+          <w:tcPr>
+            <w:tcW w:type="dxa" w:w="1500"/>
+            <w:tcMar>
+              <w:top w:type="dxa" w:w="60"/>
+              <w:left w:type="dxa" w:w="100"/>
+              <w:bottom w:type="dxa" w:w="60"/>
+              <w:right w:type="dxa" w:w="100"/>
+            </w:tcMar>
+            <w:vAlign w:val="center"/>
+          </w:tcPr>
+          <w:p>
+            <w:pPr>
+              <w:jc w:val="center"/>
+            </w:pPr>
+            <w:r>
+              <w:rPr>
+                <w:b w:val="false"/>
+                <w:bCs w:val="false"/>
+                <w:color w:val="000000"/>
+                <w:sz w:val="19"/>
+                <w:szCs w:val="19"/>
+              </w:rPr>
+              <w:t xml:space="preserve">1.6M</w:t>
+            </w:r>
+          </w:p>
+        </w:tc>
+        <w:tc>
+          <w:tcPr>
+            <w:tcW w:type="dxa" w:w="1650"/>
+            <w:tcMar>
+              <w:top w:type="dxa" w:w="60"/>
+              <w:left w:type="dxa" w:w="100"/>
+              <w:bottom w:type="dxa" w:w="60"/>
+              <w:right w:type="dxa" w:w="100"/>
+            </w:tcMar>
+            <w:vAlign w:val="center"/>
+          </w:tcPr>
+          <w:p>
+            <w:pPr>
+              <w:jc w:val="center"/>
+            </w:pPr>
+            <w:r>
+              <w:rPr>
+                <w:b w:val="false"/>
+                <w:bCs w:val="false"/>
+                <w:color w:val="000000"/>
+                <w:sz w:val="19"/>
+                <w:szCs w:val="19"/>
+              </w:rPr>
+              <w:t xml:space="preserve">+0.18pt</w:t>
+            </w:r>
+          </w:p>
+        </w:tc>
+        <w:tc>
+          <w:tcPr>
+            <w:tcW w:type="dxa" w:w="2900"/>
+            <w:tcMar>
+              <w:top w:type="dxa" w:w="60"/>
+              <w:left w:type="dxa" w:w="100"/>
+              <w:bottom w:type="dxa" w:w="60"/>
+              <w:right w:type="dxa" w:w="100"/>
+            </w:tcMar>
+            <w:vAlign w:val="center"/>
+          </w:tcPr>
+          <w:p>
+            <w:pPr>
+              <w:jc w:val="center"/>
+            </w:pPr>
+            <w:r>
+              <w:rPr>
+                <w:b w:val="false"/>
+                <w:bCs w:val="false"/>
+                <w:color w:val="000000"/>
+                <w:sz w:val="19"/>
+                <w:szCs w:val="19"/>
+              </w:rPr>
+              <w:t xml:space="preserve">Moderate — assumes exited volume is replaced by equivalent product, not just deleted</w:t>
+            </w:r>
+          </w:p>
+        </w:tc>
+      </w:tr>
+      <w:tr>
+        <w:tc>
+          <w:tcPr>
+            <w:tcW w:type="dxa" w:w="3300"/>
+            <w:shd w:fill="F5F5F5" w:val="clear"/>
+            <w:tcMar>
+              <w:top w:type="dxa" w:w="60"/>
+              <w:left w:type="dxa" w:w="100"/>
+              <w:bottom w:type="dxa" w:w="60"/>
+              <w:right w:type="dxa" w:w="100"/>
+            </w:tcMar>
+            <w:vAlign w:val="center"/>
+          </w:tcPr>
+          <w:p>
+            <w:pPr>
+              <w:jc w:val="left"/>
+            </w:pPr>
+            <w:r>
+              <w:rPr>
+                <w:b w:val="false"/>
+                <w:bCs w:val="false"/>
+                <w:color w:val="000000"/>
+                <w:sz w:val="19"/>
+                <w:szCs w:val="19"/>
+              </w:rPr>
+              <w:t xml:space="preserve">B total (B1+B2) — used in Section 2's running total</w:t>
+            </w:r>
+          </w:p>
+        </w:tc>
+        <w:tc>
+          <w:tcPr>
+            <w:tcW w:type="dxa" w:w="1500"/>
+            <w:shd w:fill="F5F5F5" w:val="clear"/>
+            <w:tcMar>
+              <w:top w:type="dxa" w:w="60"/>
+              <w:left w:type="dxa" w:w="100"/>
+              <w:bottom w:type="dxa" w:w="60"/>
+              <w:right w:type="dxa" w:w="100"/>
+            </w:tcMar>
+            <w:vAlign w:val="center"/>
+          </w:tcPr>
+          <w:p>
+            <w:pPr>
+              <w:jc w:val="center"/>
+            </w:pPr>
+            <w:r>
+              <w:rPr>
+                <w:b w:val="false"/>
+                <w:bCs w:val="false"/>
+                <w:color w:val="000000"/>
+                <w:sz w:val="19"/>
+                <w:szCs w:val="19"/>
+              </w:rPr>
+              <w:t xml:space="preserve">14.0M</w:t>
+            </w:r>
+          </w:p>
+        </w:tc>
+        <w:tc>
+          <w:tcPr>
+            <w:tcW w:type="dxa" w:w="1650"/>
+            <w:shd w:fill="F5F5F5" w:val="clear"/>
+            <w:tcMar>
+              <w:top w:type="dxa" w:w="60"/>
+              <w:left w:type="dxa" w:w="100"/>
+              <w:bottom w:type="dxa" w:w="60"/>
+              <w:right w:type="dxa" w:w="100"/>
+            </w:tcMar>
+            <w:vAlign w:val="center"/>
+          </w:tcPr>
+          <w:p>
+            <w:pPr>
+              <w:jc w:val="center"/>
+            </w:pPr>
+            <w:r>
+              <w:rPr>
+                <w:b w:val="false"/>
+                <w:bCs w:val="false"/>
+                <w:color w:val="000000"/>
+                <w:sz w:val="19"/>
+                <w:szCs w:val="19"/>
+              </w:rPr>
+              <w:t xml:space="preserve">+1.65pt</w:t>
+            </w:r>
+          </w:p>
+        </w:tc>
+        <w:tc>
+          <w:tcPr>
+            <w:tcW w:type="dxa" w:w="2900"/>
+            <w:shd w:fill="F5F5F5" w:val="clear"/>
+            <w:tcMar>
+              <w:top w:type="dxa" w:w="60"/>
+              <w:left w:type="dxa" w:w="100"/>
+              <w:bottom w:type="dxa" w:w="60"/>
+              <w:right w:type="dxa" w:w="100"/>
+            </w:tcMar>
+            <w:vAlign w:val="center"/>
+          </w:tcPr>
+          <w:p>
+            <w:pPr>
+              <w:jc w:val="center"/>
+            </w:pPr>
+            <w:r>
+              <w:rPr>
+                <w:b w:val="false"/>
+                <w:bCs w:val="false"/>
+                <w:color w:val="000000"/>
+                <w:sz w:val="19"/>
+                <w:szCs w:val="19"/>
+              </w:rPr>
+              <w:t xml:space="preserve">Recommended working assumption</w:t>
+            </w:r>
+          </w:p>
+        </w:tc>
+      </w:tr>
+      <w:tr>
+        <w:tc>
+          <w:tcPr>
+            <w:tcW w:type="dxa" w:w="3300"/>
+            <w:tcMar>
+              <w:top w:type="dxa" w:w="60"/>
+              <w:left w:type="dxa" w:w="100"/>
+              <w:bottom w:type="dxa" w:w="60"/>
+              <w:right w:type="dxa" w:w="100"/>
+            </w:tcMar>
+            <w:vAlign w:val="center"/>
+          </w:tcPr>
+          <w:p>
+            <w:pPr>
+              <w:jc w:val="left"/>
+            </w:pPr>
+            <w:r>
+              <w:rPr>
+                <w:b w:val="false"/>
+                <w:bCs w:val="false"/>
+                <w:color w:val="000000"/>
+                <w:sz w:val="19"/>
+                <w:szCs w:val="19"/>
+              </w:rPr>
+              <w:t xml:space="preserve">C: ENTIRE core portfolio (649.8M) -&gt; Hero-level margin (53.5%)</w:t>
+            </w:r>
+          </w:p>
+        </w:tc>
+        <w:tc>
+          <w:tcPr>
+            <w:tcW w:type="dxa" w:w="1500"/>
+            <w:tcMar>
+              <w:top w:type="dxa" w:w="60"/>
+              <w:left w:type="dxa" w:w="100"/>
+              <w:bottom w:type="dxa" w:w="60"/>
+              <w:right w:type="dxa" w:w="100"/>
+            </w:tcMar>
+            <w:vAlign w:val="center"/>
+          </w:tcPr>
+          <w:p>
+            <w:pPr>
+              <w:jc w:val="center"/>
+            </w:pPr>
+            <w:r>
+              <w:rPr>
+                <w:b w:val="false"/>
+                <w:bCs w:val="false"/>
+                <w:color w:val="000000"/>
+                <w:sz w:val="19"/>
+                <w:szCs w:val="19"/>
+              </w:rPr>
+              <w:t xml:space="preserve">46.5M</w:t>
+            </w:r>
+          </w:p>
+        </w:tc>
+        <w:tc>
+          <w:tcPr>
+            <w:tcW w:type="dxa" w:w="1650"/>
+            <w:tcMar>
+              <w:top w:type="dxa" w:w="60"/>
+              <w:left w:type="dxa" w:w="100"/>
+              <w:bottom w:type="dxa" w:w="60"/>
+              <w:right w:type="dxa" w:w="100"/>
+            </w:tcMar>
+            <w:vAlign w:val="center"/>
+          </w:tcPr>
+          <w:p>
+            <w:pPr>
+              <w:jc w:val="center"/>
+            </w:pPr>
+            <w:r>
+              <w:rPr>
+                <w:b w:val="false"/>
+                <w:bCs w:val="false"/>
+                <w:color w:val="000000"/>
+                <w:sz w:val="19"/>
+                <w:szCs w:val="19"/>
+              </w:rPr>
+              <w:t xml:space="preserve">+5.49pt</w:t>
+            </w:r>
+          </w:p>
+        </w:tc>
+        <w:tc>
+          <w:tcPr>
+            <w:tcW w:type="dxa" w:w="2900"/>
+            <w:tcMar>
+              <w:top w:type="dxa" w:w="60"/>
+              <w:left w:type="dxa" w:w="100"/>
+              <w:bottom w:type="dxa" w:w="60"/>
+              <w:right w:type="dxa" w:w="100"/>
+            </w:tcMar>
+            <w:vAlign w:val="center"/>
+          </w:tcPr>
+          <w:p>
+            <w:pPr>
+              <w:jc w:val="center"/>
+            </w:pPr>
+            <w:r>
+              <w:rPr>
+                <w:b w:val="false"/>
+                <w:bCs w:val="false"/>
+                <w:color w:val="000000"/>
+                <w:sz w:val="19"/>
+                <w:szCs w:val="19"/>
+              </w:rPr>
+              <w:t xml:space="preserve">Theoretical ceiling only — would require all 1,860 franchises, incl. Harvest/Thin/Exited, to perform like the best 34</w:t>
+            </w:r>
+          </w:p>
+        </w:tc>
+      </w:tr>
+    </w:tbl>
+    <w:p>
+      <w:pPr>
+        <w:pBdr>
+          <w:left w:val="single" w:color="3C8A4C" w:sz="18"/>
+        </w:pBdr>
+        <w:shd w:fill="EAF3EA" w:val="clear"/>
+        <w:spacing w:after="120" w:before="100"/>
+        <w:ind w:left="150" w:right="100"/>
+      </w:pPr>
+      <w:r>
+        <w:rPr>
+          <w:b/>
+          <w:bCs/>
+          <w:color w:val="1F5C2E"/>
+        </w:rPr>
+        <w:t xml:space="preserve">DATA SHOWS: </w:t>
+      </w:r>
+      <w:r>
+        <w:t xml:space="preserve">Harvest is deliberately excluded from this exercise: at 50.6% GM it already runs a healthier margin than Workhorse (47.5%) or Hero (53.5%) is only slightly better — Harvest's problem (Item 3) is volume decline, not margin, so 'fixing' its margin would be solving a problem it doesn't have.</w:t>
+      </w:r>
+    </w:p>
+    <w:p>
+      <w:pPr>
+        <w:pBdr>
+          <w:left w:val="single" w:color="B23A3A" w:sz="18"/>
+        </w:pBdr>
+        <w:shd w:fill="FBE7E7" w:val="clear"/>
+        <w:spacing w:after="120" w:before="100"/>
+        <w:ind w:left="150" w:right="100"/>
+      </w:pPr>
+      <w:r>
+        <w:rPr>
+          <w:b/>
+          <w:bCs/>
+          <w:color w:val="7A1F1F"/>
+        </w:rPr>
+        <w:t xml:space="preserve">UNEXPLAINED GAP: </w:t>
+      </w:r>
+      <w:r>
+        <w:t xml:space="preserve">Scenario C's +5.49pt ceiling looks tempting next to the 9.2pt residual, but it is explicitly not achievable — it requires the entire portfolio, including the 864-franchise Thin tier and the declining-but-already-profitable Harvest tier, to perform like the top 34 Hero/Near-Hero franchises. The moderate, defensible reading (B, +1.65pt) is what's carried into Section 2.</w:t>
+      </w:r>
+    </w:p>
+    <w:p>
+      <w:r>
+        <w:br w:type="page"/>
+      </w:r>
+    </w:p>
+    <w:p>
+      <w:pPr>
+        <w:pStyle w:val="Heading1"/>
+        <w:spacing w:after="160" w:before="320"/>
+      </w:pPr>
+      <w:r>
+        <w:t xml:space="preserve">6. A third, more basic problem: the starting point itself doesn't reconcile</w:t>
       </w:r>
     </w:p>
     <w:tbl>
@@ -2288,7 +4955,7 @@
         <w:spacing w:after="160" w:before="320"/>
       </w:pPr>
       <w:r>
-        <w:t xml:space="preserve">5. What's genuinely missing — the honest punch list</w:t>
+        <w:t xml:space="preserve">7. What's genuinely missing — the honest punch list</w:t>
       </w:r>
     </w:p>
     <w:p>
@@ -2301,7 +4968,7 @@
         <w:spacing w:after="80"/>
       </w:pPr>
       <w:r>
-        <w:t xml:space="preserve">The residual: ~10.5-11.5pt of the +14.3pt target has no named source anywhere in this engagement. This is the single most important fact in this note. Either there are large levers not yet identified (e.g., a cost/sourcing program, an SG&amp;A leverage story, a sales-mix shift toward higher-margin product at a scale not yet sized), or the 53.5% target itself needs to be re-examined against what bottom-up analysis actually supports.</w:t>
+        <w:t xml:space="preserve">The residual: ~9.2pt of the +14.3pt target still has no named source anywhere in this engagement, even after sizing channel mix and tier-mix this round. Either there are large levers not yet identified (e.g., a cost/sourcing program, an SG&amp;A leverage story), or the 53.5% target itself needs to be re-examined against what bottom-up analysis actually supports.</w:t>
       </w:r>
     </w:p>
     <w:p>
@@ -2314,7 +4981,7 @@
         <w:spacing w:after="80"/>
       </w:pPr>
       <w:r>
-        <w:t xml:space="preserve">SG&amp;A / overhead leverage as the company scales toward 2029 has not been analyzed anywhere in Items 1-6. If the 2029 target assumes operating leverage (fixed costs spread over more sales), that is a real, sizeable, entirely separate lever from anything in this bridge and needs its own workstream.</w:t>
+        <w:t xml:space="preserve">SG&amp;A / overhead leverage sits below Gross Profit in the P&amp;L structure, so it mechanically CANNOT move a Gross Margin figure — worth confirming the 53.5% target is genuinely a Gross Margin number and not being conflated with an EBIT-margin ambition, since the two would need very different levers.</w:t>
       </w:r>
     </w:p>
     <w:p>
@@ -2340,7 +5007,7 @@
         <w:spacing w:after="80"/>
       </w:pPr>
       <w:r>
-        <w:t xml:space="preserve">New-store start-up losses (Item 4) are a real, negative drag on the 2026-2029 window specifically — they work against the bridge in the near term even though the underlying stores may be a 2029+/2032 growth story. This note could not size the drag in Gross Margin terms because the MTP slide reports it as an EBIT figure (which includes store opex), not a Gross Margin figure — reconciling the two would need the store-level P&amp;L detail, which does not exist in the files provided.</w:t>
+        <w:t xml:space="preserve">New-store start-up losses (Item 4) are a real, negative drag on the 2026-2029 window specifically — they work against the bridge in the near term even though the underlying stores may be a 2029+/2032 growth story. This note could not size the drag in Gross Margin terms because the MTP slide reports it as an EBIT figure (which includes store opex), not a Gross Margin figure.</w:t>
       </w:r>
     </w:p>
     <w:p>
@@ -2353,7 +5020,7 @@
         <w:spacing w:after="80"/>
       </w:pPr>
       <w:r>
-        <w:t xml:space="preserve">The special-account mix effect moved the WRONG way in the one year of history available (−0.43pt, FY24-&gt;FY25). If XXL's continued wind-down (Item 5: XXL Wholesale sell-in was −100% in Q2 2026) is replaced by other special-account growth (China, Zalando) rather than core-channel growth, this could remain a headwind through 2029, not a tailwind — worth checking directly against whatever mix assumption the 2029 target embeds.</w:t>
+        <w:t xml:space="preserve">The special-account mix effect moved the WRONG way in the one year of history available (−0.43pt, FY24-&gt;FY25). If XXL's continued wind-down (Item 5: XXL Wholesale sell-in was −100% in Q2 2026) is replaced by other special-account growth (China, Zalando) rather than core-channel growth, this could remain a headwind through 2029, not a tailwind.</w:t>
       </w:r>
     </w:p>
     <w:p>
@@ -2366,24 +5033,7 @@
         <w:spacing w:after="80"/>
       </w:pPr>
       <w:r>
-        <w:t xml:space="preserve">No FY2029E sales, channel-mix, or account-mix target breakdown was available to this engagement — only the single headline GM% figure. Without knowing what mix of channels/accounts/products the 53.5% target assumes, it is not possible to check whether the target is internally consistent with the trends found in Items 1-6, only whether currently-identified levers are large enough to close the gap in isolation (they are not).</w:t>
-      </w:r>
-    </w:p>
-    <w:p>
-      <w:pPr>
-        <w:pStyle w:val="Heading1"/>
-        <w:spacing w:after="160" w:before="320"/>
-      </w:pPr>
-      <w:r>
-        <w:t xml:space="preserve">6. Recommended next step</w:t>
-      </w:r>
-    </w:p>
-    <w:p>
-      <w:pPr>
-        <w:spacing w:after="160"/>
-      </w:pPr>
-      <w:r>
-        <w:t xml:space="preserve">This note is a reconciliation, not a finished bridge — consistent with what was asked. Two things would do the most to close the gap between what's sized and what's needed:</w:t>
+        <w:t xml:space="preserve">No FY2029E sales, channel-mix, or account-mix target breakdown was available to this engagement — only the single headline GM% figure. Without it, the ~9.2pt residual can't be tested against a real target composition, only against what's currently identified (which isn't enough on its own).</w:t>
       </w:r>
     </w:p>
     <w:p>
@@ -2396,7 +5046,24 @@
         <w:spacing w:after="80"/>
       </w:pPr>
       <w:r>
-        <w:t xml:space="preserve">Get the FY2029E target's underlying assumptions (sales, channel mix, account mix, and whether SG&amp;A leverage is embedded) from whoever built the MTP, so the ~10.5-11.5pt residual can be tested against a real target composition rather than a single headline percentage.</w:t>
+        <w:t xml:space="preserve">Whether the FW27 target-margin-gap methodology (Item 2) could be extended beyond its current 172M-SEK Wholesale-only matched sample to Retail/E-com and a fuller style-match set remains untested — the true addressable base for 'get to the plan's own target margins' may be larger than what's counted in Section 2.</w:t>
+      </w:r>
+    </w:p>
+    <w:p>
+      <w:pPr>
+        <w:pStyle w:val="Heading1"/>
+        <w:spacing w:after="160" w:before="320"/>
+      </w:pPr>
+      <w:r>
+        <w:t xml:space="preserve">8. Recommended next step</w:t>
+      </w:r>
+    </w:p>
+    <w:p>
+      <w:pPr>
+        <w:spacing w:after="160"/>
+      </w:pPr>
+      <w:r>
+        <w:t xml:space="preserve">This note is a reconciliation, not a finished bridge — consistent with what was asked. Three things would do the most to close the remaining gap:</w:t>
       </w:r>
     </w:p>
     <w:p>
@@ -2409,7 +5076,33 @@
         <w:spacing w:after="80"/>
       </w:pPr>
       <w:r>
-        <w:t xml:space="preserve">Resolve the 1.8pt sales-extract-vs-P&amp;L basis mismatch with Finance before the workshop — otherwise every lever in Section 3 is being measured against a base that may not be the one the 53.5% target is actually stated on.</w:t>
+        <w:t xml:space="preserve">Get the FY2029E target's underlying assumptions (sales, channel mix, account mix) from whoever built the MTP, so the ~9.2pt residual can be tested against a real target composition rather than a single headline percentage.</w:t>
+      </w:r>
+    </w:p>
+    <w:p>
+      <w:pPr>
+        <w:pStyle w:val="ListParagraph"/>
+        <w:numPr>
+          <w:ilvl w:val="0"/>
+          <w:numId w:val="2"/>
+        </w:numPr>
+        <w:spacing w:after="80"/>
+      </w:pPr>
+      <w:r>
+        <w:t xml:space="preserve">Resolve the 1.8pt sales-extract-vs-P&amp;L basis mismatch with Finance before the workshop — otherwise every lever in this note is being measured against a base that may not be the one the 53.5% target is actually stated on.</w:t>
+      </w:r>
+    </w:p>
+    <w:p>
+      <w:pPr>
+        <w:pStyle w:val="ListParagraph"/>
+        <w:numPr>
+          <w:ilvl w:val="0"/>
+          <w:numId w:val="2"/>
+        </w:numPr>
+        <w:spacing w:after="80"/>
+      </w:pPr>
+      <w:r>
+        <w:t xml:space="preserve">Check whether FY2025 is a depressed base year (heavy one-off COVID-era inventory clearance, per the CEO's own early framing) rather than a normal one — the P&amp;L's Inventory Provision and Defectives lines have never been examined in this engagement, and if part of the 39.2% starting point is one-time, part of the 'gap to close' isn't a lever to pull at all.</w:t>
       </w:r>
     </w:p>
     <w:p>
@@ -2439,7 +5132,7 @@
         <w:spacing w:after="160" w:before="320"/>
       </w:pPr>
       <w:r>
-        <w:t xml:space="preserve">7. Backup data</w:t>
+        <w:t xml:space="preserve">9. Backup data</w:t>
       </w:r>
     </w:p>
     <w:p>
@@ -2452,7 +5145,7 @@
         <w:spacing w:after="80"/>
       </w:pPr>
       <w:r>
-        <w:t xml:space="preserve">bob_marginbridge_backup.xlsx — the reconciliation summary, full lever detail with formulas, the basis-mismatch check, and the fresh special-account mix/rate decomposition.</w:t>
+        <w:t xml:space="preserve">bob_marginbridge_backup.xlsx — the reconciliation summary, full lever detail with formulas, channel-mix current/sensitivity data, portfolio tier-mix scenarios, the basis-mismatch check, and the fresh special-account mix/rate decomposition.</w:t>
       </w:r>
     </w:p>
     <w:p>

</xml_diff>

<commit_message>
Add base-year normalization investigation to the Margin Bridge
Tests whether FY2025A was artificially depressed by one-off COVID-era
inventory clearance -- finds the opposite for the smaller COGS
provision/defectives lines (2024 was worse there, already reflected
in the FY25A base), but surfaces a real, previously-unexamined finding:
Direct Cost of Sales ratio spiked specifically in FY2025 (-3.5pt vs
FY2024A), and YTD2026 data shows it already reversing sharply
(-5.1pt vs the same period last year, Gross Margin +2.5pt). Flagged
as a strong signal worth 2.5-5pt but deliberately not added to the
quantified total pending disentanglement from the XXL mix effect,
which requires 2026 article-level data not available in this
engagement.
</commit_message>
<xml_diff>
--- a/workshop_prep/Margin_Bridge_Consolidated_Reconciliation.docx
+++ b/workshop_prep/Margin_Bridge_Consolidated_Reconciliation.docx
@@ -77,7 +77,7 @@
           <w:sz w:val="22"/>
           <w:szCs w:val="22"/>
         </w:rPr>
-        <w:t xml:space="preserve">UPDATED this round with two newly-sized levers: channel mix shift (Wholesale -&gt; DTC) and portfolio tier-mix optimization. Together they add roughly 3 more points, bringing the total quantified upside from ~2.8pt to ~5.1pt. The headline conclusion is unchanged in kind, improved in degree: of the +14.3pt Gross Margin target (39.2% FY2025A -&gt; 53.5% FY2029E), roughly 5.1pt is now backed by sized levers -- still only about a third of the target. ~9.2pt (64% of the gap) remains unexplained by anything sized in this engagement. This note exists to make that residual visible, not to paper over it.</w:t>
+        <w:t xml:space="preserve">UPDATED this round with three newly-investigated items: channel mix shift, portfolio tier-mix optimization, and base-year normalization. The first two add roughly 3 points of confirmed, countable upside, bringing the quantified total from ~2.8pt to ~5.1pt against the +14.3pt target (39.2% FY2025A -&gt; 53.5% FY2029E) -- still only about a third of the target, leaving a ~9.2pt residual. The base-year investigation (Section 6) did NOT find what was expected (2025 was not depressed by one-off inventory charges -- 2024 was worse there) but found something more useful: a real, unexplained spike in the Direct Cost of Sales ratio specific to FY2025, which the most current 2026 data shows already reversing. That signal is potentially worth +2.5 to +5pt but is deliberately NOT added to the quantified total, because it cannot yet be separated from the XXL mix effect without 2026 article-level data this engagement does not have.</w:t>
       </w:r>
     </w:p>
     <w:p>
@@ -4527,17 +4527,883 @@
       </w:r>
     </w:p>
     <w:p>
-      <w:r>
-        <w:br w:type="page"/>
+      <w:pPr>
+        <w:pStyle w:val="Heading1"/>
+        <w:spacing w:after="160" w:before="320"/>
+      </w:pPr>
+      <w:r>
+        <w:t xml:space="preserve">6. Base-year normalization — was FY2025 artificially depressed?</w:t>
       </w:r>
     </w:p>
     <w:p>
       <w:pPr>
+        <w:spacing w:after="160"/>
+      </w:pPr>
+      <w:r>
+        <w:t xml:space="preserve">The hypothesis: heavy, one-off COVID-era inventory clearance (per the CEO's own early framing) made FY2025A an abnormally bad base year, so part of the +14.3pt gap isn't a lever to pull, it's just 2025 not repeating. Tested directly against the P&amp;L's Cost of Sales detail — the answer is more specific and more useful than the hypothesis predicted.</w:t>
+      </w:r>
+    </w:p>
+    <w:tbl>
+      <w:tblPr>
+        <w:tblW w:type="dxa" w:w="9350"/>
+        <w:tblBorders>
+          <w:top w:val="single" w:color="auto" w:sz="4"/>
+          <w:left w:val="single" w:color="auto" w:sz="4"/>
+          <w:bottom w:val="single" w:color="auto" w:sz="4"/>
+          <w:right w:val="single" w:color="auto" w:sz="4"/>
+          <w:insideH w:val="single" w:color="auto" w:sz="4"/>
+          <w:insideV w:val="single" w:color="auto" w:sz="4"/>
+        </w:tblBorders>
+      </w:tblPr>
+      <w:tblGrid>
+        <w:gridCol w:w="2900"/>
+        <w:gridCol w:w="1450"/>
+        <w:gridCol w:w="1700"/>
+        <w:gridCol w:w="1900"/>
+        <w:gridCol w:w="1400"/>
+      </w:tblGrid>
+      <w:tr>
+        <w:trPr>
+          <w:tblHeader/>
+        </w:trPr>
+        <w:tc>
+          <w:tcPr>
+            <w:tcW w:type="dxa" w:w="2900"/>
+            <w:shd w:fill="2F2F2F" w:val="clear"/>
+            <w:tcMar>
+              <w:top w:type="dxa" w:w="60"/>
+              <w:left w:type="dxa" w:w="100"/>
+              <w:bottom w:type="dxa" w:w="60"/>
+              <w:right w:type="dxa" w:w="100"/>
+            </w:tcMar>
+            <w:vAlign w:val="center"/>
+          </w:tcPr>
+          <w:p>
+            <w:pPr>
+              <w:jc w:val="left"/>
+            </w:pPr>
+            <w:r>
+              <w:rPr>
+                <w:b/>
+                <w:bCs/>
+                <w:color w:val="FFFFFF"/>
+                <w:sz w:val="19"/>
+                <w:szCs w:val="19"/>
+              </w:rPr>
+              <w:t xml:space="preserve">Period</w:t>
+            </w:r>
+          </w:p>
+        </w:tc>
+        <w:tc>
+          <w:tcPr>
+            <w:tcW w:type="dxa" w:w="1450"/>
+            <w:shd w:fill="2F2F2F" w:val="clear"/>
+            <w:tcMar>
+              <w:top w:type="dxa" w:w="60"/>
+              <w:left w:type="dxa" w:w="100"/>
+              <w:bottom w:type="dxa" w:w="60"/>
+              <w:right w:type="dxa" w:w="100"/>
+            </w:tcMar>
+            <w:vAlign w:val="center"/>
+          </w:tcPr>
+          <w:p>
+            <w:pPr>
+              <w:jc w:val="center"/>
+            </w:pPr>
+            <w:r>
+              <w:rPr>
+                <w:b/>
+                <w:bCs/>
+                <w:color w:val="FFFFFF"/>
+                <w:sz w:val="19"/>
+                <w:szCs w:val="19"/>
+              </w:rPr>
+              <w:t xml:space="preserve">Net Sales</w:t>
+            </w:r>
+          </w:p>
+        </w:tc>
+        <w:tc>
+          <w:tcPr>
+            <w:tcW w:type="dxa" w:w="1700"/>
+            <w:shd w:fill="2F2F2F" w:val="clear"/>
+            <w:tcMar>
+              <w:top w:type="dxa" w:w="60"/>
+              <w:left w:type="dxa" w:w="100"/>
+              <w:bottom w:type="dxa" w:w="60"/>
+              <w:right w:type="dxa" w:w="100"/>
+            </w:tcMar>
+            <w:vAlign w:val="center"/>
+          </w:tcPr>
+          <w:p>
+            <w:pPr>
+              <w:jc w:val="center"/>
+            </w:pPr>
+            <w:r>
+              <w:rPr>
+                <w:b/>
+                <w:bCs/>
+                <w:color w:val="FFFFFF"/>
+                <w:sz w:val="19"/>
+                <w:szCs w:val="19"/>
+              </w:rPr>
+              <w:t xml:space="preserve">Direct COGS % of sales</w:t>
+            </w:r>
+          </w:p>
+        </w:tc>
+        <w:tc>
+          <w:tcPr>
+            <w:tcW w:type="dxa" w:w="1900"/>
+            <w:shd w:fill="2F2F2F" w:val="clear"/>
+            <w:tcMar>
+              <w:top w:type="dxa" w:w="60"/>
+              <w:left w:type="dxa" w:w="100"/>
+              <w:bottom w:type="dxa" w:w="60"/>
+              <w:right w:type="dxa" w:w="100"/>
+            </w:tcMar>
+            <w:vAlign w:val="center"/>
+          </w:tcPr>
+          <w:p>
+            <w:pPr>
+              <w:jc w:val="center"/>
+            </w:pPr>
+            <w:r>
+              <w:rPr>
+                <w:b/>
+                <w:bCs/>
+                <w:color w:val="FFFFFF"/>
+                <w:sz w:val="19"/>
+                <w:szCs w:val="19"/>
+              </w:rPr>
+              <w:t xml:space="preserve">Other COGS lines % of sales</w:t>
+            </w:r>
+          </w:p>
+        </w:tc>
+        <w:tc>
+          <w:tcPr>
+            <w:tcW w:type="dxa" w:w="1400"/>
+            <w:shd w:fill="2F2F2F" w:val="clear"/>
+            <w:tcMar>
+              <w:top w:type="dxa" w:w="60"/>
+              <w:left w:type="dxa" w:w="100"/>
+              <w:bottom w:type="dxa" w:w="60"/>
+              <w:right w:type="dxa" w:w="100"/>
+            </w:tcMar>
+            <w:vAlign w:val="center"/>
+          </w:tcPr>
+          <w:p>
+            <w:pPr>
+              <w:jc w:val="center"/>
+            </w:pPr>
+            <w:r>
+              <w:rPr>
+                <w:b/>
+                <w:bCs/>
+                <w:color w:val="FFFFFF"/>
+                <w:sz w:val="19"/>
+                <w:szCs w:val="19"/>
+              </w:rPr>
+              <w:t xml:space="preserve">Gross Margin</w:t>
+            </w:r>
+          </w:p>
+        </w:tc>
+      </w:tr>
+      <w:tr>
+        <w:tc>
+          <w:tcPr>
+            <w:tcW w:type="dxa" w:w="2900"/>
+            <w:tcMar>
+              <w:top w:type="dxa" w:w="60"/>
+              <w:left w:type="dxa" w:w="100"/>
+              <w:bottom w:type="dxa" w:w="60"/>
+              <w:right w:type="dxa" w:w="100"/>
+            </w:tcMar>
+            <w:vAlign w:val="center"/>
+          </w:tcPr>
+          <w:p>
+            <w:pPr>
+              <w:jc w:val="left"/>
+            </w:pPr>
+            <w:r>
+              <w:rPr>
+                <w:b w:val="false"/>
+                <w:bCs w:val="false"/>
+                <w:color w:val="000000"/>
+                <w:sz w:val="19"/>
+                <w:szCs w:val="19"/>
+              </w:rPr>
+              <w:t xml:space="preserve">FY2024A (full year)</w:t>
+            </w:r>
+          </w:p>
+        </w:tc>
+        <w:tc>
+          <w:tcPr>
+            <w:tcW w:type="dxa" w:w="1450"/>
+            <w:tcMar>
+              <w:top w:type="dxa" w:w="60"/>
+              <w:left w:type="dxa" w:w="100"/>
+              <w:bottom w:type="dxa" w:w="60"/>
+              <w:right w:type="dxa" w:w="100"/>
+            </w:tcMar>
+            <w:vAlign w:val="center"/>
+          </w:tcPr>
+          <w:p>
+            <w:pPr>
+              <w:jc w:val="center"/>
+            </w:pPr>
+            <w:r>
+              <w:rPr>
+                <w:b w:val="false"/>
+                <w:bCs w:val="false"/>
+                <w:color w:val="000000"/>
+                <w:sz w:val="19"/>
+                <w:szCs w:val="19"/>
+              </w:rPr>
+              <w:t xml:space="preserve">737.0M</w:t>
+            </w:r>
+          </w:p>
+        </w:tc>
+        <w:tc>
+          <w:tcPr>
+            <w:tcW w:type="dxa" w:w="1700"/>
+            <w:tcMar>
+              <w:top w:type="dxa" w:w="60"/>
+              <w:left w:type="dxa" w:w="100"/>
+              <w:bottom w:type="dxa" w:w="60"/>
+              <w:right w:type="dxa" w:w="100"/>
+            </w:tcMar>
+            <w:vAlign w:val="center"/>
+          </w:tcPr>
+          <w:p>
+            <w:pPr>
+              <w:jc w:val="center"/>
+            </w:pPr>
+            <w:r>
+              <w:rPr>
+                <w:b w:val="false"/>
+                <w:bCs w:val="false"/>
+                <w:color w:val="000000"/>
+                <w:sz w:val="19"/>
+                <w:szCs w:val="19"/>
+              </w:rPr>
+              <w:t xml:space="preserve">56.9%</w:t>
+            </w:r>
+          </w:p>
+        </w:tc>
+        <w:tc>
+          <w:tcPr>
+            <w:tcW w:type="dxa" w:w="1900"/>
+            <w:tcMar>
+              <w:top w:type="dxa" w:w="60"/>
+              <w:left w:type="dxa" w:w="100"/>
+              <w:bottom w:type="dxa" w:w="60"/>
+              <w:right w:type="dxa" w:w="100"/>
+            </w:tcMar>
+            <w:vAlign w:val="center"/>
+          </w:tcPr>
+          <w:p>
+            <w:pPr>
+              <w:jc w:val="center"/>
+            </w:pPr>
+            <w:r>
+              <w:rPr>
+                <w:b w:val="false"/>
+                <w:bCs w:val="false"/>
+                <w:color w:val="000000"/>
+                <w:sz w:val="19"/>
+                <w:szCs w:val="19"/>
+              </w:rPr>
+              <w:t xml:space="preserve">−8.15%</w:t>
+            </w:r>
+          </w:p>
+        </w:tc>
+        <w:tc>
+          <w:tcPr>
+            <w:tcW w:type="dxa" w:w="1400"/>
+            <w:tcMar>
+              <w:top w:type="dxa" w:w="60"/>
+              <w:left w:type="dxa" w:w="100"/>
+              <w:bottom w:type="dxa" w:w="60"/>
+              <w:right w:type="dxa" w:w="100"/>
+            </w:tcMar>
+            <w:vAlign w:val="center"/>
+          </w:tcPr>
+          <w:p>
+            <w:pPr>
+              <w:jc w:val="center"/>
+            </w:pPr>
+            <w:r>
+              <w:rPr>
+                <w:b w:val="false"/>
+                <w:bCs w:val="false"/>
+                <w:color w:val="000000"/>
+                <w:sz w:val="19"/>
+                <w:szCs w:val="19"/>
+              </w:rPr>
+              <w:t xml:space="preserve">39.0%</w:t>
+            </w:r>
+          </w:p>
+        </w:tc>
+      </w:tr>
+      <w:tr>
+        <w:tc>
+          <w:tcPr>
+            <w:tcW w:type="dxa" w:w="2900"/>
+            <w:shd w:fill="F5F5F5" w:val="clear"/>
+            <w:tcMar>
+              <w:top w:type="dxa" w:w="60"/>
+              <w:left w:type="dxa" w:w="100"/>
+              <w:bottom w:type="dxa" w:w="60"/>
+              <w:right w:type="dxa" w:w="100"/>
+            </w:tcMar>
+            <w:vAlign w:val="center"/>
+          </w:tcPr>
+          <w:p>
+            <w:pPr>
+              <w:jc w:val="left"/>
+            </w:pPr>
+            <w:r>
+              <w:rPr>
+                <w:b w:val="false"/>
+                <w:bCs w:val="false"/>
+                <w:color w:val="000000"/>
+                <w:sz w:val="19"/>
+                <w:szCs w:val="19"/>
+              </w:rPr>
+              <w:t xml:space="preserve">FY2025A (full year)</w:t>
+            </w:r>
+          </w:p>
+        </w:tc>
+        <w:tc>
+          <w:tcPr>
+            <w:tcW w:type="dxa" w:w="1450"/>
+            <w:shd w:fill="F5F5F5" w:val="clear"/>
+            <w:tcMar>
+              <w:top w:type="dxa" w:w="60"/>
+              <w:left w:type="dxa" w:w="100"/>
+              <w:bottom w:type="dxa" w:w="60"/>
+              <w:right w:type="dxa" w:w="100"/>
+            </w:tcMar>
+            <w:vAlign w:val="center"/>
+          </w:tcPr>
+          <w:p>
+            <w:pPr>
+              <w:jc w:val="center"/>
+            </w:pPr>
+            <w:r>
+              <w:rPr>
+                <w:b w:val="false"/>
+                <w:bCs w:val="false"/>
+                <w:color w:val="000000"/>
+                <w:sz w:val="19"/>
+                <w:szCs w:val="19"/>
+              </w:rPr>
+              <w:t xml:space="preserve">846.3M</w:t>
+            </w:r>
+          </w:p>
+        </w:tc>
+        <w:tc>
+          <w:tcPr>
+            <w:tcW w:type="dxa" w:w="1700"/>
+            <w:shd w:fill="F5F5F5" w:val="clear"/>
+            <w:tcMar>
+              <w:top w:type="dxa" w:w="60"/>
+              <w:left w:type="dxa" w:w="100"/>
+              <w:bottom w:type="dxa" w:w="60"/>
+              <w:right w:type="dxa" w:w="100"/>
+            </w:tcMar>
+            <w:vAlign w:val="center"/>
+          </w:tcPr>
+          <w:p>
+            <w:pPr>
+              <w:jc w:val="center"/>
+            </w:pPr>
+            <w:r>
+              <w:rPr>
+                <w:b w:val="false"/>
+                <w:bCs w:val="false"/>
+                <w:color w:val="000000"/>
+                <w:sz w:val="19"/>
+                <w:szCs w:val="19"/>
+              </w:rPr>
+              <w:t xml:space="preserve">60.4%</w:t>
+            </w:r>
+          </w:p>
+        </w:tc>
+        <w:tc>
+          <w:tcPr>
+            <w:tcW w:type="dxa" w:w="1900"/>
+            <w:shd w:fill="F5F5F5" w:val="clear"/>
+            <w:tcMar>
+              <w:top w:type="dxa" w:w="60"/>
+              <w:left w:type="dxa" w:w="100"/>
+              <w:bottom w:type="dxa" w:w="60"/>
+              <w:right w:type="dxa" w:w="100"/>
+            </w:tcMar>
+            <w:vAlign w:val="center"/>
+          </w:tcPr>
+          <w:p>
+            <w:pPr>
+              <w:jc w:val="center"/>
+            </w:pPr>
+            <w:r>
+              <w:rPr>
+                <w:b w:val="false"/>
+                <w:bCs w:val="false"/>
+                <w:color w:val="000000"/>
+                <w:sz w:val="19"/>
+                <w:szCs w:val="19"/>
+              </w:rPr>
+              <w:t xml:space="preserve">−0.89%</w:t>
+            </w:r>
+          </w:p>
+        </w:tc>
+        <w:tc>
+          <w:tcPr>
+            <w:tcW w:type="dxa" w:w="1400"/>
+            <w:shd w:fill="F5F5F5" w:val="clear"/>
+            <w:tcMar>
+              <w:top w:type="dxa" w:w="60"/>
+              <w:left w:type="dxa" w:w="100"/>
+              <w:bottom w:type="dxa" w:w="60"/>
+              <w:right w:type="dxa" w:w="100"/>
+            </w:tcMar>
+            <w:vAlign w:val="center"/>
+          </w:tcPr>
+          <w:p>
+            <w:pPr>
+              <w:jc w:val="center"/>
+            </w:pPr>
+            <w:r>
+              <w:rPr>
+                <w:b w:val="false"/>
+                <w:bCs w:val="false"/>
+                <w:color w:val="000000"/>
+                <w:sz w:val="19"/>
+                <w:szCs w:val="19"/>
+              </w:rPr>
+              <w:t xml:space="preserve">39.2%</w:t>
+            </w:r>
+          </w:p>
+        </w:tc>
+      </w:tr>
+      <w:tr>
+        <w:tc>
+          <w:tcPr>
+            <w:tcW w:type="dxa" w:w="2900"/>
+            <w:tcMar>
+              <w:top w:type="dxa" w:w="60"/>
+              <w:left w:type="dxa" w:w="100"/>
+              <w:bottom w:type="dxa" w:w="60"/>
+              <w:right w:type="dxa" w:w="100"/>
+            </w:tcMar>
+            <w:vAlign w:val="center"/>
+          </w:tcPr>
+          <w:p>
+            <w:pPr>
+              <w:jc w:val="left"/>
+            </w:pPr>
+            <w:r>
+              <w:rPr>
+                <w:b w:val="false"/>
+                <w:bCs w:val="false"/>
+                <w:color w:val="000000"/>
+                <w:sz w:val="19"/>
+                <w:szCs w:val="19"/>
+              </w:rPr>
+              <w:t xml:space="preserve">YTD 2025 (comparative, same period as YTD26)</w:t>
+            </w:r>
+          </w:p>
+        </w:tc>
+        <w:tc>
+          <w:tcPr>
+            <w:tcW w:type="dxa" w:w="1450"/>
+            <w:tcMar>
+              <w:top w:type="dxa" w:w="60"/>
+              <w:left w:type="dxa" w:w="100"/>
+              <w:bottom w:type="dxa" w:w="60"/>
+              <w:right w:type="dxa" w:w="100"/>
+            </w:tcMar>
+            <w:vAlign w:val="center"/>
+          </w:tcPr>
+          <w:p>
+            <w:pPr>
+              <w:jc w:val="center"/>
+            </w:pPr>
+            <w:r>
+              <w:rPr>
+                <w:b w:val="false"/>
+                <w:bCs w:val="false"/>
+                <w:color w:val="000000"/>
+                <w:sz w:val="19"/>
+                <w:szCs w:val="19"/>
+              </w:rPr>
+              <w:t xml:space="preserve">371.1M</w:t>
+            </w:r>
+          </w:p>
+        </w:tc>
+        <w:tc>
+          <w:tcPr>
+            <w:tcW w:type="dxa" w:w="1700"/>
+            <w:tcMar>
+              <w:top w:type="dxa" w:w="60"/>
+              <w:left w:type="dxa" w:w="100"/>
+              <w:bottom w:type="dxa" w:w="60"/>
+              <w:right w:type="dxa" w:w="100"/>
+            </w:tcMar>
+            <w:vAlign w:val="center"/>
+          </w:tcPr>
+          <w:p>
+            <w:pPr>
+              <w:jc w:val="center"/>
+            </w:pPr>
+            <w:r>
+              <w:rPr>
+                <w:b w:val="false"/>
+                <w:bCs w:val="false"/>
+                <w:color w:val="000000"/>
+                <w:sz w:val="19"/>
+                <w:szCs w:val="19"/>
+              </w:rPr>
+              <w:t xml:space="preserve">61.2%</w:t>
+            </w:r>
+          </w:p>
+        </w:tc>
+        <w:tc>
+          <w:tcPr>
+            <w:tcW w:type="dxa" w:w="1900"/>
+            <w:tcMar>
+              <w:top w:type="dxa" w:w="60"/>
+              <w:left w:type="dxa" w:w="100"/>
+              <w:bottom w:type="dxa" w:w="60"/>
+              <w:right w:type="dxa" w:w="100"/>
+            </w:tcMar>
+            <w:vAlign w:val="center"/>
+          </w:tcPr>
+          <w:p>
+            <w:pPr>
+              <w:jc w:val="center"/>
+            </w:pPr>
+            <w:r>
+              <w:rPr>
+                <w:b w:val="false"/>
+                <w:bCs w:val="false"/>
+                <w:color w:val="000000"/>
+                <w:sz w:val="19"/>
+                <w:szCs w:val="19"/>
+              </w:rPr>
+              <w:t xml:space="preserve">+0.84%</w:t>
+            </w:r>
+          </w:p>
+        </w:tc>
+        <w:tc>
+          <w:tcPr>
+            <w:tcW w:type="dxa" w:w="1400"/>
+            <w:tcMar>
+              <w:top w:type="dxa" w:w="60"/>
+              <w:left w:type="dxa" w:w="100"/>
+              <w:bottom w:type="dxa" w:w="60"/>
+              <w:right w:type="dxa" w:w="100"/>
+            </w:tcMar>
+            <w:vAlign w:val="center"/>
+          </w:tcPr>
+          <w:p>
+            <w:pPr>
+              <w:jc w:val="center"/>
+            </w:pPr>
+            <w:r>
+              <w:rPr>
+                <w:b w:val="false"/>
+                <w:bCs w:val="false"/>
+                <w:color w:val="000000"/>
+                <w:sz w:val="19"/>
+                <w:szCs w:val="19"/>
+              </w:rPr>
+              <w:t xml:space="preserve">39.2%</w:t>
+            </w:r>
+          </w:p>
+        </w:tc>
+      </w:tr>
+      <w:tr>
+        <w:tc>
+          <w:tcPr>
+            <w:tcW w:type="dxa" w:w="2900"/>
+            <w:shd w:fill="F5F5F5" w:val="clear"/>
+            <w:tcMar>
+              <w:top w:type="dxa" w:w="60"/>
+              <w:left w:type="dxa" w:w="100"/>
+              <w:bottom w:type="dxa" w:w="60"/>
+              <w:right w:type="dxa" w:w="100"/>
+            </w:tcMar>
+            <w:vAlign w:val="center"/>
+          </w:tcPr>
+          <w:p>
+            <w:pPr>
+              <w:jc w:val="left"/>
+            </w:pPr>
+            <w:r>
+              <w:rPr>
+                <w:b w:val="false"/>
+                <w:bCs w:val="false"/>
+                <w:color w:val="000000"/>
+                <w:sz w:val="19"/>
+                <w:szCs w:val="19"/>
+              </w:rPr>
+              <w:t xml:space="preserve">YTD 2026 (current)</w:t>
+            </w:r>
+          </w:p>
+        </w:tc>
+        <w:tc>
+          <w:tcPr>
+            <w:tcW w:type="dxa" w:w="1450"/>
+            <w:shd w:fill="F5F5F5" w:val="clear"/>
+            <w:tcMar>
+              <w:top w:type="dxa" w:w="60"/>
+              <w:left w:type="dxa" w:w="100"/>
+              <w:bottom w:type="dxa" w:w="60"/>
+              <w:right w:type="dxa" w:w="100"/>
+            </w:tcMar>
+            <w:vAlign w:val="center"/>
+          </w:tcPr>
+          <w:p>
+            <w:pPr>
+              <w:jc w:val="center"/>
+            </w:pPr>
+            <w:r>
+              <w:rPr>
+                <w:b w:val="false"/>
+                <w:bCs w:val="false"/>
+                <w:color w:val="000000"/>
+                <w:sz w:val="19"/>
+                <w:szCs w:val="19"/>
+              </w:rPr>
+              <w:t xml:space="preserve">294.7M</w:t>
+            </w:r>
+          </w:p>
+        </w:tc>
+        <w:tc>
+          <w:tcPr>
+            <w:tcW w:type="dxa" w:w="1700"/>
+            <w:shd w:fill="F5F5F5" w:val="clear"/>
+            <w:tcMar>
+              <w:top w:type="dxa" w:w="60"/>
+              <w:left w:type="dxa" w:w="100"/>
+              <w:bottom w:type="dxa" w:w="60"/>
+              <w:right w:type="dxa" w:w="100"/>
+            </w:tcMar>
+            <w:vAlign w:val="center"/>
+          </w:tcPr>
+          <w:p>
+            <w:pPr>
+              <w:jc w:val="center"/>
+            </w:pPr>
+            <w:r>
+              <w:rPr>
+                <w:b w:val="false"/>
+                <w:bCs w:val="false"/>
+                <w:color w:val="000000"/>
+                <w:sz w:val="19"/>
+                <w:szCs w:val="19"/>
+              </w:rPr>
+              <w:t xml:space="preserve">56.1%</w:t>
+            </w:r>
+          </w:p>
+        </w:tc>
+        <w:tc>
+          <w:tcPr>
+            <w:tcW w:type="dxa" w:w="1900"/>
+            <w:shd w:fill="F5F5F5" w:val="clear"/>
+            <w:tcMar>
+              <w:top w:type="dxa" w:w="60"/>
+              <w:left w:type="dxa" w:w="100"/>
+              <w:bottom w:type="dxa" w:w="60"/>
+              <w:right w:type="dxa" w:w="100"/>
+            </w:tcMar>
+            <w:vAlign w:val="center"/>
+          </w:tcPr>
+          <w:p>
+            <w:pPr>
+              <w:jc w:val="center"/>
+            </w:pPr>
+            <w:r>
+              <w:rPr>
+                <w:b w:val="false"/>
+                <w:bCs w:val="false"/>
+                <w:color w:val="000000"/>
+                <w:sz w:val="19"/>
+                <w:szCs w:val="19"/>
+              </w:rPr>
+              <w:t xml:space="preserve">−4.32%</w:t>
+            </w:r>
+          </w:p>
+        </w:tc>
+        <w:tc>
+          <w:tcPr>
+            <w:tcW w:type="dxa" w:w="1400"/>
+            <w:shd w:fill="F5F5F5" w:val="clear"/>
+            <w:tcMar>
+              <w:top w:type="dxa" w:w="60"/>
+              <w:left w:type="dxa" w:w="100"/>
+              <w:bottom w:type="dxa" w:w="60"/>
+              <w:right w:type="dxa" w:w="100"/>
+            </w:tcMar>
+            <w:vAlign w:val="center"/>
+          </w:tcPr>
+          <w:p>
+            <w:pPr>
+              <w:jc w:val="center"/>
+            </w:pPr>
+            <w:r>
+              <w:rPr>
+                <w:b w:val="false"/>
+                <w:bCs w:val="false"/>
+                <w:color w:val="000000"/>
+                <w:sz w:val="19"/>
+                <w:szCs w:val="19"/>
+              </w:rPr>
+              <w:t xml:space="preserve">41.7%</w:t>
+            </w:r>
+          </w:p>
+        </w:tc>
+      </w:tr>
+    </w:tbl>
+    <w:p>
+      <w:pPr>
+        <w:pBdr>
+          <w:left w:val="single" w:color="3C8A4C" w:sz="18"/>
+        </w:pBdr>
+        <w:shd w:fill="EAF3EA" w:val="clear"/>
+        <w:spacing w:after="120" w:before="100"/>
+        <w:ind w:left="150" w:right="100"/>
+      </w:pPr>
+      <w:r>
+        <w:rPr>
+          <w:b/>
+          <w:bCs/>
+          <w:color w:val="1F5C2E"/>
+        </w:rPr>
+        <w:t xml:space="preserve">DATA SHOWS: </w:t>
+      </w:r>
+      <w:r>
+        <w:t xml:space="preserve">Finding 1 — the original hypothesis is NOT supported: the 'Other Cost of Sales / Defectives / Inventory Provision / FX Difference' lines actually swing +52.5M SEK (+6.2pt) FAVOURABLY from FY2024A to FY2025A -- 2024 had the heavier one-off charges (Other COS −30.0M, Defectives −7.1M, an Inventory Provision CHARGE of −5.7M, Other COS2 −15.1M), not 2025, where Inventory Provision is actually a +5.9M release. FY2025A is not artificially depressed by one-off inventory charges relative to 2024 — if anything it already reflects an improvement, and this swing is already fully embedded in the FY2025A base, not a forward lever.</w:t>
+      </w:r>
+    </w:p>
+    <w:p>
+      <w:pPr>
+        <w:pBdr>
+          <w:left w:val="single" w:color="3C8A4C" w:sz="18"/>
+        </w:pBdr>
+        <w:shd w:fill="EAF3EA" w:val="clear"/>
+        <w:spacing w:after="120" w:before="100"/>
+        <w:ind w:left="150" w:right="100"/>
+      </w:pPr>
+      <w:r>
+        <w:rPr>
+          <w:b/>
+          <w:bCs/>
+          <w:color w:val="1F5C2E"/>
+        </w:rPr>
+        <w:t xml:space="preserve">DATA SHOWS: </w:t>
+      </w:r>
+      <w:r>
+        <w:t xml:space="preserve">Finding 2 — a different, real anomaly: the DIRECT Cost of Sales ratio itself spiked specifically in FY2025 (56.9% -&gt; 60.4% of Net Sales, a −3.5pt deterioration) and was even worse in the comparable YTD2025 period (61.2%). This is the company-wide P&amp;L confirmation of the per-unit COGS increases already found in Item 2 (Wholesale Reorder COGS/unit +12-44% across most layers, Retail COGS/unit +13.6%), attributed to FX per CEO direction but never verified against transaction-level data — exactly the verification gap flagged again this turn.</w:t>
+      </w:r>
+    </w:p>
+    <w:p>
+      <w:pPr>
+        <w:pBdr>
+          <w:left w:val="single" w:color="3C8A4C" w:sz="18"/>
+        </w:pBdr>
+        <w:shd w:fill="EAF3EA" w:val="clear"/>
+        <w:spacing w:after="120" w:before="100"/>
+        <w:ind w:left="150" w:right="100"/>
+      </w:pPr>
+      <w:r>
+        <w:rPr>
+          <w:b/>
+          <w:bCs/>
+          <w:color w:val="1F5C2E"/>
+        </w:rPr>
+        <w:t xml:space="preserve">DATA SHOWS: </w:t>
+      </w:r>
+      <w:r>
+        <w:t xml:space="preserve">Finding 3 — and it is already reverting, in the most current data available: YTD2026's Direct COGS ratio is 56.1%, DOWN 5.1pt from the same period last year (61.2%) on a like-for-like, apples-to-apples YTD basis. YTD2026 Gross Margin (41.7%) is already 2.5pt above the same period last year (39.2%) and above the FY2025A full-year base.</w:t>
+      </w:r>
+    </w:p>
+    <w:p>
+      <w:pPr>
+        <w:pBdr>
+          <w:left w:val="single" w:color="B23A3A" w:sz="18"/>
+        </w:pBdr>
+        <w:shd w:fill="FBE7E7" w:val="clear"/>
+        <w:spacing w:after="120" w:before="100"/>
+        <w:ind w:left="150" w:right="100"/>
+      </w:pPr>
+      <w:r>
+        <w:rPr>
+          <w:b/>
+          <w:bCs/>
+          <w:color w:val="7A1F1F"/>
+        </w:rPr>
+        <w:t xml:space="preserve">UNEXPLAINED GAP: </w:t>
+      </w:r>
+      <w:r>
+        <w:t xml:space="preserve">This is genuinely encouraging, but it is NOT added to the Section 2 running total. The YTD2026 improvement is very likely entangled with the XXL mix collapse (Item 5: XXL Wholesale sell-in was −100% in Q2 2026, removing a large low-margin-mix drag) rather than being purely a cost-structure recovery — and it cannot be disentangled without 2026 article/account-level data, which does not exist in the files available to this engagement (only the aggregate P&amp;L covers 2026). Treat the +2.5pt YTD momentum as a strong, real, positive signal worth investigating directly with Finance, not as a confirmed, incremental bridge point on top of everything else already counted.</w:t>
+      </w:r>
+    </w:p>
+    <w:p>
+      <w:pPr>
+        <w:pBdr>
+          <w:left w:val="single" w:color="C97A1A" w:sz="18"/>
+        </w:pBdr>
+        <w:shd w:fill="FCEFDC" w:val="clear"/>
+        <w:spacing w:after="120" w:before="100"/>
+        <w:ind w:left="150" w:right="100"/>
+      </w:pPr>
+      <w:r>
+        <w:rPr>
+          <w:b/>
+          <w:bCs/>
+          <w:color w:val="8A4B00"/>
+        </w:rPr>
+        <w:t xml:space="preserve">NOT ANSWERABLE FROM DATA — ASK: </w:t>
+      </w:r>
+      <w:r>
+        <w:t xml:space="preserve">Can Finance provide 2026 sales data at the same article/account granularity as the FY2024-2025 extract used throughout this engagement? Without it, the YTD2026 margin improvement (+2.5pt) cannot be split into 'genuine cost normalization' vs. 'XXL mix effect' vs. 'other' — and that split matters enormously for how much of the 53.5% target should be considered already de-risked. Owner: CFO / Finance data owner.</w:t>
+      </w:r>
+    </w:p>
+    <w:p>
+      <w:pPr>
+        <w:pBdr>
+          <w:left w:val="single" w:color="C97A1A" w:sz="18"/>
+        </w:pBdr>
+        <w:shd w:fill="FCEFDC" w:val="clear"/>
+        <w:spacing w:after="120" w:before="100"/>
+        <w:ind w:left="150" w:right="100"/>
+      </w:pPr>
+      <w:r>
+        <w:rPr>
+          <w:b/>
+          <w:bCs/>
+          <w:color w:val="8A4B00"/>
+        </w:rPr>
+        <w:t xml:space="preserve">NOT ANSWERABLE FROM DATA — ASK: </w:t>
+      </w:r>
+      <w:r>
+        <w:t xml:space="preserve">Is the FY2025 Direct-COGS-ratio spike (and its apparent 2026 reversal) explained by FX movements, a specific sourcing/landed-cost event, or something else? This is the same verification gap flagged in Section 3/7 for Legwear and Sleeping Bags specifically, now confirmed at the whole-company level and sized at 3.5pt — materially larger than the two-layer anecdote suggested. Owner: CFO / Sourcing.</w:t>
+      </w:r>
+    </w:p>
+    <w:p>
+      <w:r>
+        <w:br w:type="page"/>
+      </w:r>
+    </w:p>
+    <w:p>
+      <w:pPr>
         <w:pStyle w:val="Heading1"/>
         <w:spacing w:after="160" w:before="320"/>
       </w:pPr>
       <w:r>
-        <w:t xml:space="preserve">6. A third, more basic problem: the starting point itself doesn't reconcile</w:t>
+        <w:t xml:space="preserve">7. A fourth, more basic problem: the starting point itself doesn't reconcile</w:t>
       </w:r>
     </w:p>
     <w:tbl>
@@ -4955,7 +5821,7 @@
         <w:spacing w:after="160" w:before="320"/>
       </w:pPr>
       <w:r>
-        <w:t xml:space="preserve">7. What's genuinely missing — the honest punch list</w:t>
+        <w:t xml:space="preserve">8. What's genuinely missing — the honest punch list</w:t>
       </w:r>
     </w:p>
     <w:p>
@@ -4968,7 +5834,7 @@
         <w:spacing w:after="80"/>
       </w:pPr>
       <w:r>
-        <w:t xml:space="preserve">The residual: ~9.2pt of the +14.3pt target still has no named source anywhere in this engagement, even after sizing channel mix and tier-mix this round. Either there are large levers not yet identified (e.g., a cost/sourcing program, an SG&amp;A leverage story), or the 53.5% target itself needs to be re-examined against what bottom-up analysis actually supports.</w:t>
+        <w:t xml:space="preserve">The residual: ~9.2pt of the +14.3pt target still has no CONFIRMED, disentangled source anywhere in this engagement, even after sizing channel mix, tier-mix and the base-year investigation this round. The strongest new lead — the Direct-COGS-ratio reversal already visible in YTD2026 (potentially +2.5 to +5pt) — is real but not yet separable from the XXL mix effect, so it is deliberately not counted in Section 2's total.</w:t>
       </w:r>
     </w:p>
     <w:p>
@@ -4994,7 +5860,7 @@
         <w:spacing w:after="80"/>
       </w:pPr>
       <w:r>
-        <w:t xml:space="preserve">COGS/sourcing was ruled out early for negotiating leverage at current volumes (confirmed with CEO) — but per this turn's direction, the open question of whether the Legwear/Sleeping Bags cost overruns (Item 2) are true overruns or an FX artifact has never been verified, and no transaction-level FX data exists to check it directly.</w:t>
+        <w:t xml:space="preserve">The FX-vs-true-overrun question is now sized, not just anecdotal: the FY2025 Direct-COGS-ratio spike is worth −3.5pt at the whole-company level (Section 6), materially larger than the Legwear/Sleeping Bags two-layer example from Item 2 suggested. Still unverified against transaction-level FX data, which does not exist in the files available.</w:t>
       </w:r>
     </w:p>
     <w:p>
@@ -5020,7 +5886,7 @@
         <w:spacing w:after="80"/>
       </w:pPr>
       <w:r>
-        <w:t xml:space="preserve">The special-account mix effect moved the WRONG way in the one year of history available (−0.43pt, FY24-&gt;FY25). If XXL's continued wind-down (Item 5: XXL Wholesale sell-in was −100% in Q2 2026) is replaced by other special-account growth (China, Zalando) rather than core-channel growth, this could remain a headwind through 2029, not a tailwind.</w:t>
+        <w:t xml:space="preserve">The special-account mix effect moved the WRONG way in the one year of history available (−0.43pt, FY24-&gt;FY25) — but Section 6 shows something changed favorably in 2026 (XXL's Wholesale sell-in went to −100% in Q2 2026). Whether that flips the mix effect from headwind to tailwind through 2029, or is offset by other special-account growth (China, Zalando), is unconfirmed without 2026 article-level data.</w:t>
       </w:r>
     </w:p>
     <w:p>
@@ -5055,7 +5921,7 @@
         <w:spacing w:after="160" w:before="320"/>
       </w:pPr>
       <w:r>
-        <w:t xml:space="preserve">8. Recommended next step</w:t>
+        <w:t xml:space="preserve">9. Recommended next step</w:t>
       </w:r>
     </w:p>
     <w:p>
@@ -5063,7 +5929,7 @@
         <w:spacing w:after="160"/>
       </w:pPr>
       <w:r>
-        <w:t xml:space="preserve">This note is a reconciliation, not a finished bridge — consistent with what was asked. Three things would do the most to close the remaining gap:</w:t>
+        <w:t xml:space="preserve">This note is a reconciliation, not a finished bridge — consistent with what was asked. The single highest-value next step changed this round:</w:t>
       </w:r>
     </w:p>
     <w:p>
@@ -5076,7 +5942,7 @@
         <w:spacing w:after="80"/>
       </w:pPr>
       <w:r>
-        <w:t xml:space="preserve">Get the FY2029E target's underlying assumptions (sales, channel mix, account mix) from whoever built the MTP, so the ~9.2pt residual can be tested against a real target composition rather than a single headline percentage.</w:t>
+        <w:t xml:space="preserve">PRIORITY: get 2026 sales data at article/account granularity from Finance/IT, matching the FY2024-2025 extract structure used throughout this engagement. This is now the single most valuable data request in this note — it is the only way to confirm how much of the YTD2026 Direct-COGS reversal (potentially +2.5 to +5pt) is genuine cost normalization versus the XXL mix effect versus something else, and that split could materially change the size of the true residual.</w:t>
       </w:r>
     </w:p>
     <w:p>
@@ -5089,7 +5955,7 @@
         <w:spacing w:after="80"/>
       </w:pPr>
       <w:r>
-        <w:t xml:space="preserve">Resolve the 1.8pt sales-extract-vs-P&amp;L basis mismatch with Finance before the workshop — otherwise every lever in this note is being measured against a base that may not be the one the 53.5% target is actually stated on.</w:t>
+        <w:t xml:space="preserve">Get the FY2029E target's underlying assumptions (sales, channel mix, account mix) from whoever built the MTP, so the residual can be tested against a real target composition rather than a single headline percentage.</w:t>
       </w:r>
     </w:p>
     <w:p>
@@ -5102,7 +5968,7 @@
         <w:spacing w:after="80"/>
       </w:pPr>
       <w:r>
-        <w:t xml:space="preserve">Check whether FY2025 is a depressed base year (heavy one-off COVID-era inventory clearance, per the CEO's own early framing) rather than a normal one — the P&amp;L's Inventory Provision and Defectives lines have never been examined in this engagement, and if part of the 39.2% starting point is one-time, part of the 'gap to close' isn't a lever to pull at all.</w:t>
+        <w:t xml:space="preserve">Resolve the 1.8pt sales-extract-vs-P&amp;L basis mismatch with Finance before the workshop — otherwise every lever in this note is being measured against a base that may not be the one the 53.5% target is actually stated on.</w:t>
       </w:r>
     </w:p>
     <w:p>
@@ -5132,7 +5998,7 @@
         <w:spacing w:after="160" w:before="320"/>
       </w:pPr>
       <w:r>
-        <w:t xml:space="preserve">9. Backup data</w:t>
+        <w:t xml:space="preserve">10. Backup data</w:t>
       </w:r>
     </w:p>
     <w:p>
@@ -5145,7 +6011,7 @@
         <w:spacing w:after="80"/>
       </w:pPr>
       <w:r>
-        <w:t xml:space="preserve">bob_marginbridge_backup.xlsx — the reconciliation summary, full lever detail with formulas, channel-mix current/sensitivity data, portfolio tier-mix scenarios, the basis-mismatch check, and the fresh special-account mix/rate decomposition.</w:t>
+        <w:t xml:space="preserve">bob_marginbridge_backup.xlsx — the reconciliation summary, full lever detail with formulas, channel-mix current/sensitivity data, portfolio tier-mix scenarios, the base-year normalization detail and findings, the basis-mismatch check, and the fresh special-account mix/rate decomposition.</w:t>
       </w:r>
     </w:p>
     <w:p>

</xml_diff>

<commit_message>
Add competitive benchmark section to the Margin Bridge
New Section 7: five public/disclosed competitor margin comparables
(Fenix Outdoor/Fjallraven 59.4% GM, Amer Sports/Arc'teryx 57.7% GM +
21.6% op margin, VF Corp 53.5% GM, Columbia ~50-51.6% GM, Norrona 7.3%
net margin) against Haglofs' 39.2% GM / -3.5% EBIT. All five sit above
Haglofs' current margin; two sit above Haglofs' own 53.5% target.
Confirms the DTC-mix and discount-discipline levers already in this
bridge, and surfaces one new angle -- wholesale distribution curation
-- not yet analyzed anywhere in this engagement. Also names the honest
VF Corp tradeoff (margin recovery required accepting real revenue
decline) as a strategic question for the CEO/PE ownership.
</commit_message>
<xml_diff>
--- a/workshop_prep/Margin_Bridge_Consolidated_Reconciliation.docx
+++ b/workshop_prep/Margin_Bridge_Consolidated_Reconciliation.docx
@@ -77,7 +77,7 @@
           <w:sz w:val="22"/>
           <w:szCs w:val="22"/>
         </w:rPr>
-        <w:t xml:space="preserve">UPDATED this round with three newly-investigated items: channel mix shift, portfolio tier-mix optimization, and base-year normalization. The first two add roughly 3 points of confirmed, countable upside, bringing the quantified total from ~2.8pt to ~5.1pt against the +14.3pt target (39.2% FY2025A -&gt; 53.5% FY2029E) -- still only about a third of the target, leaving a ~9.2pt residual. The base-year investigation (Section 6) did NOT find what was expected (2025 was not depressed by one-off inventory charges -- 2024 was worse there) but found something more useful: a real, unexplained spike in the Direct Cost of Sales ratio specific to FY2025, which the most current 2026 data shows already reversing. That signal is potentially worth +2.5 to +5pt but is deliberately NOT added to the quantified total, because it cannot yet be separated from the XXL mix effect without 2026 article-level data this engagement does not have.</w:t>
+        <w:t xml:space="preserve">UPDATED this round with four newly-investigated items: channel mix shift, portfolio tier-mix optimization, base-year normalization, and an external competitive benchmark. The first two add roughly 3 points of confirmed, countable upside, bringing the quantified total from ~2.8pt to ~5.1pt against the +14.3pt target (39.2% FY2025A -&gt; 53.5% FY2029E) -- still only about a third of the target, leaving a ~9.2pt residual. The base-year investigation (Section 6) surfaced a real, unexplained spike in the Direct Cost of Sales ratio specific to FY2025, already reversing in 2026 data -- potentially +2.5 to +5pt, deliberately not counted pending disentanglement from the XXL mix effect. The competitive benchmark (Section 7) is the most important addition for interpreting the residual: five researched public comparables (Fenix Outdoor, Amer Sports/Arc'teryx, VF Corp, Columbia, Norrona) ALL sit above Haglofs' current margin, and two sit above Haglofs' own 53.5% target -- confirming the levers already in this bridge are the right ones, and surfacing one genuinely new angle (distribution curation) not yet analyzed anywhere in this engagement.</w:t>
       </w:r>
     </w:p>
     <w:p>
@@ -5389,7 +5389,7 @@
         <w:t xml:space="preserve">NOT ANSWERABLE FROM DATA — ASK: </w:t>
       </w:r>
       <w:r>
-        <w:t xml:space="preserve">Is the FY2025 Direct-COGS-ratio spike (and its apparent 2026 reversal) explained by FX movements, a specific sourcing/landed-cost event, or something else? This is the same verification gap flagged in Section 3/7 for Legwear and Sleeping Bags specifically, now confirmed at the whole-company level and sized at 3.5pt — materially larger than the two-layer anecdote suggested. Owner: CFO / Sourcing.</w:t>
+        <w:t xml:space="preserve">Is the FY2025 Direct-COGS-ratio spike (and its apparent 2026 reversal) explained by FX movements, a specific sourcing/landed-cost event, or something else? This is the same verification gap flagged in Item 2 for Legwear and Sleeping Bags specifically, now confirmed at the whole-company level and sized at 3.5pt — materially larger than the two-layer anecdote suggested. Owner: CFO / Sourcing.</w:t>
       </w:r>
     </w:p>
     <w:p>
@@ -5403,7 +5403,929 @@
         <w:spacing w:after="160" w:before="320"/>
       </w:pPr>
       <w:r>
-        <w:t xml:space="preserve">7. A fourth, more basic problem: the starting point itself doesn't reconcile</w:t>
+        <w:t xml:space="preserve">7. Competitive benchmark: how do peers get to a healthy margin?</w:t>
+      </w:r>
+    </w:p>
+    <w:p>
+      <w:pPr>
+        <w:spacing w:after="160"/>
+      </w:pPr>
+      <w:r>
+        <w:t xml:space="preserve">Requested directly: if there is genuinely no more to squeeze from Haglofs' own internal levers, what does the external evidence say about how comparable companies actually achieve a healthy margin? Five public/disclosed comparables, researched directly for this note:</w:t>
+      </w:r>
+    </w:p>
+    <w:tbl>
+      <w:tblPr>
+        <w:tblW w:type="dxa" w:w="9350"/>
+        <w:tblBorders>
+          <w:top w:val="single" w:color="auto" w:sz="4"/>
+          <w:left w:val="single" w:color="auto" w:sz="4"/>
+          <w:bottom w:val="single" w:color="auto" w:sz="4"/>
+          <w:right w:val="single" w:color="auto" w:sz="4"/>
+          <w:insideH w:val="single" w:color="auto" w:sz="4"/>
+          <w:insideV w:val="single" w:color="auto" w:sz="4"/>
+        </w:tblBorders>
+      </w:tblPr>
+      <w:tblGrid>
+        <w:gridCol w:w="2500"/>
+        <w:gridCol w:w="1500"/>
+        <w:gridCol w:w="2350"/>
+        <w:gridCol w:w="3000"/>
+      </w:tblGrid>
+      <w:tr>
+        <w:trPr>
+          <w:tblHeader/>
+        </w:trPr>
+        <w:tc>
+          <w:tcPr>
+            <w:tcW w:type="dxa" w:w="2500"/>
+            <w:shd w:fill="2F2F2F" w:val="clear"/>
+            <w:tcMar>
+              <w:top w:type="dxa" w:w="60"/>
+              <w:left w:type="dxa" w:w="100"/>
+              <w:bottom w:type="dxa" w:w="60"/>
+              <w:right w:type="dxa" w:w="100"/>
+            </w:tcMar>
+            <w:vAlign w:val="center"/>
+          </w:tcPr>
+          <w:p>
+            <w:pPr>
+              <w:jc w:val="left"/>
+            </w:pPr>
+            <w:r>
+              <w:rPr>
+                <w:b/>
+                <w:bCs/>
+                <w:color w:val="FFFFFF"/>
+                <w:sz w:val="19"/>
+                <w:szCs w:val="19"/>
+              </w:rPr>
+              <w:t xml:space="preserve">Company</w:t>
+            </w:r>
+          </w:p>
+        </w:tc>
+        <w:tc>
+          <w:tcPr>
+            <w:tcW w:type="dxa" w:w="1500"/>
+            <w:shd w:fill="2F2F2F" w:val="clear"/>
+            <w:tcMar>
+              <w:top w:type="dxa" w:w="60"/>
+              <w:left w:type="dxa" w:w="100"/>
+              <w:bottom w:type="dxa" w:w="60"/>
+              <w:right w:type="dxa" w:w="100"/>
+            </w:tcMar>
+            <w:vAlign w:val="center"/>
+          </w:tcPr>
+          <w:p>
+            <w:pPr>
+              <w:jc w:val="center"/>
+            </w:pPr>
+            <w:r>
+              <w:rPr>
+                <w:b/>
+                <w:bCs/>
+                <w:color w:val="FFFFFF"/>
+                <w:sz w:val="19"/>
+                <w:szCs w:val="19"/>
+              </w:rPr>
+              <w:t xml:space="preserve">Gross Margin</w:t>
+            </w:r>
+          </w:p>
+        </w:tc>
+        <w:tc>
+          <w:tcPr>
+            <w:tcW w:type="dxa" w:w="2350"/>
+            <w:shd w:fill="2F2F2F" w:val="clear"/>
+            <w:tcMar>
+              <w:top w:type="dxa" w:w="60"/>
+              <w:left w:type="dxa" w:w="100"/>
+              <w:bottom w:type="dxa" w:w="60"/>
+              <w:right w:type="dxa" w:w="100"/>
+            </w:tcMar>
+            <w:vAlign w:val="center"/>
+          </w:tcPr>
+          <w:p>
+            <w:pPr>
+              <w:jc w:val="center"/>
+            </w:pPr>
+            <w:r>
+              <w:rPr>
+                <w:b/>
+                <w:bCs/>
+                <w:color w:val="FFFFFF"/>
+                <w:sz w:val="19"/>
+                <w:szCs w:val="19"/>
+              </w:rPr>
+              <w:t xml:space="preserve">Operating/Net Margin</w:t>
+            </w:r>
+          </w:p>
+        </w:tc>
+        <w:tc>
+          <w:tcPr>
+            <w:tcW w:type="dxa" w:w="3000"/>
+            <w:shd w:fill="2F2F2F" w:val="clear"/>
+            <w:tcMar>
+              <w:top w:type="dxa" w:w="60"/>
+              <w:left w:type="dxa" w:w="100"/>
+              <w:bottom w:type="dxa" w:w="60"/>
+              <w:right w:type="dxa" w:w="100"/>
+            </w:tcMar>
+            <w:vAlign w:val="center"/>
+          </w:tcPr>
+          <w:p>
+            <w:pPr>
+              <w:jc w:val="center"/>
+            </w:pPr>
+            <w:r>
+              <w:rPr>
+                <w:b/>
+                <w:bCs/>
+                <w:color w:val="FFFFFF"/>
+                <w:sz w:val="19"/>
+                <w:szCs w:val="19"/>
+              </w:rPr>
+              <w:t xml:space="preserve">How they get there</w:t>
+            </w:r>
+          </w:p>
+        </w:tc>
+      </w:tr>
+      <w:tr>
+        <w:tc>
+          <w:tcPr>
+            <w:tcW w:type="dxa" w:w="2500"/>
+            <w:tcMar>
+              <w:top w:type="dxa" w:w="60"/>
+              <w:left w:type="dxa" w:w="100"/>
+              <w:bottom w:type="dxa" w:w="60"/>
+              <w:right w:type="dxa" w:w="100"/>
+            </w:tcMar>
+            <w:vAlign w:val="center"/>
+          </w:tcPr>
+          <w:p>
+            <w:pPr>
+              <w:jc w:val="left"/>
+            </w:pPr>
+            <w:r>
+              <w:rPr>
+                <w:b w:val="false"/>
+                <w:bCs w:val="false"/>
+                <w:color w:val="000000"/>
+                <w:sz w:val="19"/>
+                <w:szCs w:val="19"/>
+              </w:rPr>
+              <w:t xml:space="preserve">Fenix Outdoor (Fjallraven parent)</w:t>
+            </w:r>
+          </w:p>
+        </w:tc>
+        <w:tc>
+          <w:tcPr>
+            <w:tcW w:type="dxa" w:w="1500"/>
+            <w:tcMar>
+              <w:top w:type="dxa" w:w="60"/>
+              <w:left w:type="dxa" w:w="100"/>
+              <w:bottom w:type="dxa" w:w="60"/>
+              <w:right w:type="dxa" w:w="100"/>
+            </w:tcMar>
+            <w:vAlign w:val="center"/>
+          </w:tcPr>
+          <w:p>
+            <w:pPr>
+              <w:jc w:val="center"/>
+            </w:pPr>
+            <w:r>
+              <w:rPr>
+                <w:b w:val="false"/>
+                <w:bCs w:val="false"/>
+                <w:color w:val="000000"/>
+                <w:sz w:val="19"/>
+                <w:szCs w:val="19"/>
+              </w:rPr>
+              <w:t xml:space="preserve">59.4%</w:t>
+            </w:r>
+          </w:p>
+        </w:tc>
+        <w:tc>
+          <w:tcPr>
+            <w:tcW w:type="dxa" w:w="2350"/>
+            <w:tcMar>
+              <w:top w:type="dxa" w:w="60"/>
+              <w:left w:type="dxa" w:w="100"/>
+              <w:bottom w:type="dxa" w:w="60"/>
+              <w:right w:type="dxa" w:w="100"/>
+            </w:tcMar>
+            <w:vAlign w:val="center"/>
+          </w:tcPr>
+          <w:p>
+            <w:pPr>
+              <w:jc w:val="center"/>
+            </w:pPr>
+            <w:r>
+              <w:rPr>
+                <w:b w:val="false"/>
+                <w:bCs w:val="false"/>
+                <w:color w:val="000000"/>
+                <w:sz w:val="19"/>
+                <w:szCs w:val="19"/>
+              </w:rPr>
+              <w:t xml:space="preserve">1.1% EBIT</w:t>
+            </w:r>
+          </w:p>
+        </w:tc>
+        <w:tc>
+          <w:tcPr>
+            <w:tcW w:type="dxa" w:w="3000"/>
+            <w:tcMar>
+              <w:top w:type="dxa" w:w="60"/>
+              <w:left w:type="dxa" w:w="100"/>
+              <w:bottom w:type="dxa" w:w="60"/>
+              <w:right w:type="dxa" w:w="100"/>
+            </w:tcMar>
+            <w:vAlign w:val="center"/>
+          </w:tcPr>
+          <w:p>
+            <w:pPr>
+              <w:jc w:val="center"/>
+            </w:pPr>
+            <w:r>
+              <w:rPr>
+                <w:b w:val="false"/>
+                <w:bCs w:val="false"/>
+                <w:color w:val="000000"/>
+                <w:sz w:val="19"/>
+                <w:szCs w:val="19"/>
+              </w:rPr>
+              <w:t xml:space="preserve">Explicitly credits margin gain to 'more direct to consumer sales and less discounting'</w:t>
+            </w:r>
+          </w:p>
+        </w:tc>
+      </w:tr>
+      <w:tr>
+        <w:tc>
+          <w:tcPr>
+            <w:tcW w:type="dxa" w:w="2500"/>
+            <w:shd w:fill="F5F5F5" w:val="clear"/>
+            <w:tcMar>
+              <w:top w:type="dxa" w:w="60"/>
+              <w:left w:type="dxa" w:w="100"/>
+              <w:bottom w:type="dxa" w:w="60"/>
+              <w:right w:type="dxa" w:w="100"/>
+            </w:tcMar>
+            <w:vAlign w:val="center"/>
+          </w:tcPr>
+          <w:p>
+            <w:pPr>
+              <w:jc w:val="left"/>
+            </w:pPr>
+            <w:r>
+              <w:rPr>
+                <w:b w:val="false"/>
+                <w:bCs w:val="false"/>
+                <w:color w:val="000000"/>
+                <w:sz w:val="19"/>
+                <w:szCs w:val="19"/>
+              </w:rPr>
+              <w:t xml:space="preserve">Amer Sports (Arc'teryx parent)</w:t>
+            </w:r>
+          </w:p>
+        </w:tc>
+        <w:tc>
+          <w:tcPr>
+            <w:tcW w:type="dxa" w:w="1500"/>
+            <w:shd w:fill="F5F5F5" w:val="clear"/>
+            <w:tcMar>
+              <w:top w:type="dxa" w:w="60"/>
+              <w:left w:type="dxa" w:w="100"/>
+              <w:bottom w:type="dxa" w:w="60"/>
+              <w:right w:type="dxa" w:w="100"/>
+            </w:tcMar>
+            <w:vAlign w:val="center"/>
+          </w:tcPr>
+          <w:p>
+            <w:pPr>
+              <w:jc w:val="center"/>
+            </w:pPr>
+            <w:r>
+              <w:rPr>
+                <w:b w:val="false"/>
+                <w:bCs w:val="false"/>
+                <w:color w:val="000000"/>
+                <w:sz w:val="19"/>
+                <w:szCs w:val="19"/>
+              </w:rPr>
+              <w:t xml:space="preserve">57.7% co-wide</w:t>
+            </w:r>
+          </w:p>
+        </w:tc>
+        <w:tc>
+          <w:tcPr>
+            <w:tcW w:type="dxa" w:w="2350"/>
+            <w:shd w:fill="F5F5F5" w:val="clear"/>
+            <w:tcMar>
+              <w:top w:type="dxa" w:w="60"/>
+              <w:left w:type="dxa" w:w="100"/>
+              <w:bottom w:type="dxa" w:w="60"/>
+              <w:right w:type="dxa" w:w="100"/>
+            </w:tcMar>
+            <w:vAlign w:val="center"/>
+          </w:tcPr>
+          <w:p>
+            <w:pPr>
+              <w:jc w:val="center"/>
+            </w:pPr>
+            <w:r>
+              <w:rPr>
+                <w:b w:val="false"/>
+                <w:bCs w:val="false"/>
+                <w:color w:val="000000"/>
+                <w:sz w:val="19"/>
+                <w:szCs w:val="19"/>
+              </w:rPr>
+              <w:t xml:space="preserve">21.6% op. margin (Technical Apparel/Arc'teryx segment)</w:t>
+            </w:r>
+          </w:p>
+        </w:tc>
+        <w:tc>
+          <w:tcPr>
+            <w:tcW w:type="dxa" w:w="3000"/>
+            <w:shd w:fill="F5F5F5" w:val="clear"/>
+            <w:tcMar>
+              <w:top w:type="dxa" w:w="60"/>
+              <w:left w:type="dxa" w:w="100"/>
+              <w:bottom w:type="dxa" w:w="60"/>
+              <w:right w:type="dxa" w:w="100"/>
+            </w:tcMar>
+            <w:vAlign w:val="center"/>
+          </w:tcPr>
+          <w:p>
+            <w:pPr>
+              <w:jc w:val="center"/>
+            </w:pPr>
+            <w:r>
+              <w:rPr>
+                <w:b w:val="false"/>
+                <w:bCs w:val="false"/>
+                <w:color w:val="000000"/>
+                <w:sz w:val="19"/>
+                <w:szCs w:val="19"/>
+              </w:rPr>
+              <w:t xml:space="preserve">~60% DTC mix; curated wholesale (REI/Backcountry only); minimal discount-led marketing; ~$1,928 revenue/sqft across 160+ owned stores</w:t>
+            </w:r>
+          </w:p>
+        </w:tc>
+      </w:tr>
+      <w:tr>
+        <w:tc>
+          <w:tcPr>
+            <w:tcW w:type="dxa" w:w="2500"/>
+            <w:tcMar>
+              <w:top w:type="dxa" w:w="60"/>
+              <w:left w:type="dxa" w:w="100"/>
+              <w:bottom w:type="dxa" w:w="60"/>
+              <w:right w:type="dxa" w:w="100"/>
+            </w:tcMar>
+            <w:vAlign w:val="center"/>
+          </w:tcPr>
+          <w:p>
+            <w:pPr>
+              <w:jc w:val="left"/>
+            </w:pPr>
+            <w:r>
+              <w:rPr>
+                <w:b w:val="false"/>
+                <w:bCs w:val="false"/>
+                <w:color w:val="000000"/>
+                <w:sz w:val="19"/>
+                <w:szCs w:val="19"/>
+              </w:rPr>
+              <w:t xml:space="preserve">VF Corp (North Face/Vans)</w:t>
+            </w:r>
+          </w:p>
+        </w:tc>
+        <w:tc>
+          <w:tcPr>
+            <w:tcW w:type="dxa" w:w="1500"/>
+            <w:tcMar>
+              <w:top w:type="dxa" w:w="60"/>
+              <w:left w:type="dxa" w:w="100"/>
+              <w:bottom w:type="dxa" w:w="60"/>
+              <w:right w:type="dxa" w:w="100"/>
+            </w:tcMar>
+            <w:vAlign w:val="center"/>
+          </w:tcPr>
+          <w:p>
+            <w:pPr>
+              <w:jc w:val="center"/>
+            </w:pPr>
+            <w:r>
+              <w:rPr>
+                <w:b w:val="false"/>
+                <w:bCs w:val="false"/>
+                <w:color w:val="000000"/>
+                <w:sz w:val="19"/>
+                <w:szCs w:val="19"/>
+              </w:rPr>
+              <w:t xml:space="preserve">53.5%</w:t>
+            </w:r>
+          </w:p>
+        </w:tc>
+        <w:tc>
+          <w:tcPr>
+            <w:tcW w:type="dxa" w:w="2350"/>
+            <w:tcMar>
+              <w:top w:type="dxa" w:w="60"/>
+              <w:left w:type="dxa" w:w="100"/>
+              <w:bottom w:type="dxa" w:w="60"/>
+              <w:right w:type="dxa" w:w="100"/>
+            </w:tcMar>
+            <w:vAlign w:val="center"/>
+          </w:tcPr>
+          <w:p>
+            <w:pPr>
+              <w:jc w:val="center"/>
+            </w:pPr>
+            <w:r>
+              <w:rPr>
+                <w:b w:val="false"/>
+                <w:bCs w:val="false"/>
+                <w:color w:val="000000"/>
+                <w:sz w:val="19"/>
+                <w:szCs w:val="19"/>
+              </w:rPr>
+              <w:t xml:space="preserve">n/a disclosed</w:t>
+            </w:r>
+          </w:p>
+        </w:tc>
+        <w:tc>
+          <w:tcPr>
+            <w:tcW w:type="dxa" w:w="3000"/>
+            <w:tcMar>
+              <w:top w:type="dxa" w:w="60"/>
+              <w:left w:type="dxa" w:w="100"/>
+              <w:bottom w:type="dxa" w:w="60"/>
+              <w:right w:type="dxa" w:w="100"/>
+            </w:tcMar>
+            <w:vAlign w:val="center"/>
+          </w:tcPr>
+          <w:p>
+            <w:pPr>
+              <w:jc w:val="center"/>
+            </w:pPr>
+            <w:r>
+              <w:rPr>
+                <w:b w:val="false"/>
+                <w:bCs w:val="false"/>
+                <w:color w:val="000000"/>
+                <w:sz w:val="19"/>
+                <w:szCs w:val="19"/>
+              </w:rPr>
+              <w:t xml:space="preserve">+550bps in FY25 via cost reduction plus deliberately cutting unprofitable distribution channels</w:t>
+            </w:r>
+          </w:p>
+        </w:tc>
+      </w:tr>
+      <w:tr>
+        <w:tc>
+          <w:tcPr>
+            <w:tcW w:type="dxa" w:w="2500"/>
+            <w:shd w:fill="F5F5F5" w:val="clear"/>
+            <w:tcMar>
+              <w:top w:type="dxa" w:w="60"/>
+              <w:left w:type="dxa" w:w="100"/>
+              <w:bottom w:type="dxa" w:w="60"/>
+              <w:right w:type="dxa" w:w="100"/>
+            </w:tcMar>
+            <w:vAlign w:val="center"/>
+          </w:tcPr>
+          <w:p>
+            <w:pPr>
+              <w:jc w:val="left"/>
+            </w:pPr>
+            <w:r>
+              <w:rPr>
+                <w:b w:val="false"/>
+                <w:bCs w:val="false"/>
+                <w:color w:val="000000"/>
+                <w:sz w:val="19"/>
+                <w:szCs w:val="19"/>
+              </w:rPr>
+              <w:t xml:space="preserve">Columbia Sportswear</w:t>
+            </w:r>
+          </w:p>
+        </w:tc>
+        <w:tc>
+          <w:tcPr>
+            <w:tcW w:type="dxa" w:w="1500"/>
+            <w:shd w:fill="F5F5F5" w:val="clear"/>
+            <w:tcMar>
+              <w:top w:type="dxa" w:w="60"/>
+              <w:left w:type="dxa" w:w="100"/>
+              <w:bottom w:type="dxa" w:w="60"/>
+              <w:right w:type="dxa" w:w="100"/>
+            </w:tcMar>
+            <w:vAlign w:val="center"/>
+          </w:tcPr>
+          <w:p>
+            <w:pPr>
+              <w:jc w:val="center"/>
+            </w:pPr>
+            <w:r>
+              <w:rPr>
+                <w:b w:val="false"/>
+                <w:bCs w:val="false"/>
+                <w:color w:val="000000"/>
+                <w:sz w:val="19"/>
+                <w:szCs w:val="19"/>
+              </w:rPr>
+              <w:t xml:space="preserve">~50-51.6%</w:t>
+            </w:r>
+          </w:p>
+        </w:tc>
+        <w:tc>
+          <w:tcPr>
+            <w:tcW w:type="dxa" w:w="2350"/>
+            <w:shd w:fill="F5F5F5" w:val="clear"/>
+            <w:tcMar>
+              <w:top w:type="dxa" w:w="60"/>
+              <w:left w:type="dxa" w:w="100"/>
+              <w:bottom w:type="dxa" w:w="60"/>
+              <w:right w:type="dxa" w:w="100"/>
+            </w:tcMar>
+            <w:vAlign w:val="center"/>
+          </w:tcPr>
+          <w:p>
+            <w:pPr>
+              <w:jc w:val="center"/>
+            </w:pPr>
+            <w:r>
+              <w:rPr>
+                <w:b w:val="false"/>
+                <w:bCs w:val="false"/>
+                <w:color w:val="000000"/>
+                <w:sz w:val="19"/>
+                <w:szCs w:val="19"/>
+              </w:rPr>
+              <w:t xml:space="preserve">n/a disclosed</w:t>
+            </w:r>
+          </w:p>
+        </w:tc>
+        <w:tc>
+          <w:tcPr>
+            <w:tcW w:type="dxa" w:w="3000"/>
+            <w:shd w:fill="F5F5F5" w:val="clear"/>
+            <w:tcMar>
+              <w:top w:type="dxa" w:w="60"/>
+              <w:left w:type="dxa" w:w="100"/>
+              <w:bottom w:type="dxa" w:w="60"/>
+              <w:right w:type="dxa" w:w="100"/>
+            </w:tcMar>
+            <w:vAlign w:val="center"/>
+          </w:tcPr>
+          <w:p>
+            <w:pPr>
+              <w:jc w:val="center"/>
+            </w:pPr>
+            <w:r>
+              <w:rPr>
+                <w:b w:val="false"/>
+                <w:bCs w:val="false"/>
+                <w:color w:val="000000"/>
+                <w:sz w:val="19"/>
+                <w:szCs w:val="19"/>
+              </w:rPr>
+              <w:t xml:space="preserve">Mainstream, wholesale-heavy — closest comparable to Haglofs' current channel mix, still ~11-12pt above Haglofs</w:t>
+            </w:r>
+          </w:p>
+        </w:tc>
+      </w:tr>
+      <w:tr>
+        <w:tc>
+          <w:tcPr>
+            <w:tcW w:type="dxa" w:w="2500"/>
+            <w:tcMar>
+              <w:top w:type="dxa" w:w="60"/>
+              <w:left w:type="dxa" w:w="100"/>
+              <w:bottom w:type="dxa" w:w="60"/>
+              <w:right w:type="dxa" w:w="100"/>
+            </w:tcMar>
+            <w:vAlign w:val="center"/>
+          </w:tcPr>
+          <w:p>
+            <w:pPr>
+              <w:jc w:val="left"/>
+            </w:pPr>
+            <w:r>
+              <w:rPr>
+                <w:b w:val="false"/>
+                <w:bCs w:val="false"/>
+                <w:color w:val="000000"/>
+                <w:sz w:val="19"/>
+                <w:szCs w:val="19"/>
+              </w:rPr>
+              <w:t xml:space="preserve">Norrona (private, Norwegian family-owned)</w:t>
+            </w:r>
+          </w:p>
+        </w:tc>
+        <w:tc>
+          <w:tcPr>
+            <w:tcW w:type="dxa" w:w="1500"/>
+            <w:tcMar>
+              <w:top w:type="dxa" w:w="60"/>
+              <w:left w:type="dxa" w:w="100"/>
+              <w:bottom w:type="dxa" w:w="60"/>
+              <w:right w:type="dxa" w:w="100"/>
+            </w:tcMar>
+            <w:vAlign w:val="center"/>
+          </w:tcPr>
+          <w:p>
+            <w:pPr>
+              <w:jc w:val="center"/>
+            </w:pPr>
+            <w:r>
+              <w:rPr>
+                <w:b w:val="false"/>
+                <w:bCs w:val="false"/>
+                <w:color w:val="000000"/>
+                <w:sz w:val="19"/>
+                <w:szCs w:val="19"/>
+              </w:rPr>
+              <w:t xml:space="preserve">not disclosed</w:t>
+            </w:r>
+          </w:p>
+        </w:tc>
+        <w:tc>
+          <w:tcPr>
+            <w:tcW w:type="dxa" w:w="2350"/>
+            <w:tcMar>
+              <w:top w:type="dxa" w:w="60"/>
+              <w:left w:type="dxa" w:w="100"/>
+              <w:bottom w:type="dxa" w:w="60"/>
+              <w:right w:type="dxa" w:w="100"/>
+            </w:tcMar>
+            <w:vAlign w:val="center"/>
+          </w:tcPr>
+          <w:p>
+            <w:pPr>
+              <w:jc w:val="center"/>
+            </w:pPr>
+            <w:r>
+              <w:rPr>
+                <w:b w:val="false"/>
+                <w:bCs w:val="false"/>
+                <w:color w:val="000000"/>
+                <w:sz w:val="19"/>
+                <w:szCs w:val="19"/>
+              </w:rPr>
+              <w:t xml:space="preserve">7.3% net margin</w:t>
+            </w:r>
+          </w:p>
+        </w:tc>
+        <w:tc>
+          <w:tcPr>
+            <w:tcW w:type="dxa" w:w="3000"/>
+            <w:tcMar>
+              <w:top w:type="dxa" w:w="60"/>
+              <w:left w:type="dxa" w:w="100"/>
+              <w:bottom w:type="dxa" w:w="60"/>
+              <w:right w:type="dxa" w:w="100"/>
+            </w:tcMar>
+            <w:vAlign w:val="center"/>
+          </w:tcPr>
+          <w:p>
+            <w:pPr>
+              <w:jc w:val="center"/>
+            </w:pPr>
+            <w:r>
+              <w:rPr>
+                <w:b w:val="false"/>
+                <w:bCs w:val="false"/>
+                <w:color w:val="000000"/>
+                <w:sz w:val="19"/>
+                <w:szCs w:val="19"/>
+              </w:rPr>
+              <w:t xml:space="preserve">Closest structural peer (small, Nordic, heritage, family-owned) — proof the constraint isn't company size or ownership</w:t>
+            </w:r>
+          </w:p>
+        </w:tc>
+      </w:tr>
+      <w:tr>
+        <w:tc>
+          <w:tcPr>
+            <w:tcW w:type="dxa" w:w="2500"/>
+            <w:shd w:fill="F5F5F5" w:val="clear"/>
+            <w:tcMar>
+              <w:top w:type="dxa" w:w="60"/>
+              <w:left w:type="dxa" w:w="100"/>
+              <w:bottom w:type="dxa" w:w="60"/>
+              <w:right w:type="dxa" w:w="100"/>
+            </w:tcMar>
+            <w:vAlign w:val="center"/>
+          </w:tcPr>
+          <w:p>
+            <w:pPr>
+              <w:jc w:val="left"/>
+            </w:pPr>
+            <w:r>
+              <w:rPr>
+                <w:b w:val="false"/>
+                <w:bCs w:val="false"/>
+                <w:color w:val="000000"/>
+                <w:sz w:val="19"/>
+                <w:szCs w:val="19"/>
+              </w:rPr>
+              <w:t xml:space="preserve">Haglofs (current, FY2025A)</w:t>
+            </w:r>
+          </w:p>
+        </w:tc>
+        <w:tc>
+          <w:tcPr>
+            <w:tcW w:type="dxa" w:w="1500"/>
+            <w:shd w:fill="F5F5F5" w:val="clear"/>
+            <w:tcMar>
+              <w:top w:type="dxa" w:w="60"/>
+              <w:left w:type="dxa" w:w="100"/>
+              <w:bottom w:type="dxa" w:w="60"/>
+              <w:right w:type="dxa" w:w="100"/>
+            </w:tcMar>
+            <w:vAlign w:val="center"/>
+          </w:tcPr>
+          <w:p>
+            <w:pPr>
+              <w:jc w:val="center"/>
+            </w:pPr>
+            <w:r>
+              <w:rPr>
+                <w:b w:val="false"/>
+                <w:bCs w:val="false"/>
+                <w:color w:val="000000"/>
+                <w:sz w:val="19"/>
+                <w:szCs w:val="19"/>
+              </w:rPr>
+              <w:t xml:space="preserve">39.2%</w:t>
+            </w:r>
+          </w:p>
+        </w:tc>
+        <w:tc>
+          <w:tcPr>
+            <w:tcW w:type="dxa" w:w="2350"/>
+            <w:shd w:fill="F5F5F5" w:val="clear"/>
+            <w:tcMar>
+              <w:top w:type="dxa" w:w="60"/>
+              <w:left w:type="dxa" w:w="100"/>
+              <w:bottom w:type="dxa" w:w="60"/>
+              <w:right w:type="dxa" w:w="100"/>
+            </w:tcMar>
+            <w:vAlign w:val="center"/>
+          </w:tcPr>
+          <w:p>
+            <w:pPr>
+              <w:jc w:val="center"/>
+            </w:pPr>
+            <w:r>
+              <w:rPr>
+                <w:b w:val="false"/>
+                <w:bCs w:val="false"/>
+                <w:color w:val="000000"/>
+                <w:sz w:val="19"/>
+                <w:szCs w:val="19"/>
+              </w:rPr>
+              <w:t xml:space="preserve">−3.5% EBIT</w:t>
+            </w:r>
+          </w:p>
+        </w:tc>
+        <w:tc>
+          <w:tcPr>
+            <w:tcW w:type="dxa" w:w="3000"/>
+            <w:shd w:fill="F5F5F5" w:val="clear"/>
+            <w:tcMar>
+              <w:top w:type="dxa" w:w="60"/>
+              <w:left w:type="dxa" w:w="100"/>
+              <w:bottom w:type="dxa" w:w="60"/>
+              <w:right w:type="dxa" w:w="100"/>
+            </w:tcMar>
+            <w:vAlign w:val="center"/>
+          </w:tcPr>
+          <w:p>
+            <w:pPr>
+              <w:jc w:val="center"/>
+            </w:pPr>
+            <w:r>
+              <w:rPr>
+                <w:b w:val="false"/>
+                <w:bCs w:val="false"/>
+                <w:color w:val="000000"/>
+                <w:sz w:val="19"/>
+                <w:szCs w:val="19"/>
+              </w:rPr>
+              <w:t xml:space="preserve">This engagement's own finding</w:t>
+            </w:r>
+          </w:p>
+        </w:tc>
+      </w:tr>
+    </w:tbl>
+    <w:p>
+      <w:pPr>
+        <w:pBdr>
+          <w:left w:val="single" w:color="3C8A4C" w:sz="18"/>
+        </w:pBdr>
+        <w:shd w:fill="EAF3EA" w:val="clear"/>
+        <w:spacing w:after="120" w:before="100"/>
+        <w:ind w:left="150" w:right="100"/>
+      </w:pPr>
+      <w:r>
+        <w:rPr>
+          <w:b/>
+          <w:bCs/>
+          <w:color w:val="1F5C2E"/>
+        </w:rPr>
+        <w:t xml:space="preserve">DATA SHOWS: </w:t>
+      </w:r>
+      <w:r>
+        <w:t xml:space="preserve">Every comparable researched sits above Haglofs' current margin — and Fenix Outdoor and Amer Sports both sit ABOVE Haglofs' own 53.5% 2029 target. Worth naming plainly at the workshop: reaching 53.5% is 'catching up to VF Corp,' not 'reaching best-in-class.' VF Corp's 53.5% figure matching Haglofs' target exactly is a useful, concrete anchor — it is a real, achieved number, not an aspirational one.</w:t>
+      </w:r>
+    </w:p>
+    <w:p>
+      <w:pPr>
+        <w:pBdr>
+          <w:left w:val="single" w:color="3C8A4C" w:sz="18"/>
+        </w:pBdr>
+        <w:shd w:fill="EAF3EA" w:val="clear"/>
+        <w:spacing w:after="120" w:before="100"/>
+        <w:ind w:left="150" w:right="100"/>
+      </w:pPr>
+      <w:r>
+        <w:rPr>
+          <w:b/>
+          <w:bCs/>
+          <w:color w:val="1F5C2E"/>
+        </w:rPr>
+        <w:t xml:space="preserve">DATA SHOWS: </w:t>
+      </w:r>
+      <w:r>
+        <w:t xml:space="preserve">The 'how' is strikingly consistent across every comparable, and it maps almost exactly onto levers already identified in this engagement: DTC/owned-retail mix (Section 4's channel-mix lever), discount discipline (Item 2's core finding), and — confirmed independently by three of the five — active pruning of unprofitable distribution rather than trying to fix it in place (Item 3's Problem Child and FW27 Confirm-or-Exit work). None of this reveals a brand-new lever on its own; it is evidence that the levers already in this bridge work at scale for direct competitors.</w:t>
+      </w:r>
+    </w:p>
+    <w:p>
+      <w:pPr>
+        <w:pBdr>
+          <w:left w:val="single" w:color="B23A3A" w:sz="18"/>
+        </w:pBdr>
+        <w:shd w:fill="FBE7E7" w:val="clear"/>
+        <w:spacing w:after="120" w:before="100"/>
+        <w:ind w:left="150" w:right="100"/>
+      </w:pPr>
+      <w:r>
+        <w:rPr>
+          <w:b/>
+          <w:bCs/>
+          <w:color w:val="7A1F1F"/>
+        </w:rPr>
+        <w:t xml:space="preserve">UNEXPLAINED GAP: </w:t>
+      </w:r>
+      <w:r>
+        <w:t xml:space="preserve">One genuinely new angle, not analyzed anywhere in Items 1-6: distribution CURATION. Arc'teryx deliberately limits wholesale to a small number of specialty partners (REI, Backcountry) rather than the broad, long-tail account book Haglofs runs (498 Wholesale accounts in the 2025 extract, Item 5). Nobody has asked whether Haglofs' account base is simply too broad and undifferentiated relative to how a premium technical brand curates distribution — this is a structural, strategic question, not a pricing or mix-fix question, and it has not been sized in this engagement.</w:t>
+      </w:r>
+    </w:p>
+    <w:p>
+      <w:pPr>
+        <w:spacing w:after="160"/>
+      </w:pPr>
+      <w:r>
+        <w:t xml:space="preserve">The honest tradeoff, from VF Corp specifically: their margin recovery required accepting a real revenue decline in the channels being cut (Vans −16% FY25, with 60% of that decline attributed to deliberately dropping unprofitable channels). Worth saying directly at the workshop — closing Haglofs' margin gap may require accepting that total sales shrink before margin recovers, not that both grow together. This is a strategic choice, not a data finding, and belongs with the CEO and PE ownership, not buried in an analysis.</w:t>
+      </w:r>
+    </w:p>
+    <w:p>
+      <w:pPr>
+        <w:pBdr>
+          <w:left w:val="single" w:color="C97A1A" w:sz="18"/>
+        </w:pBdr>
+        <w:shd w:fill="FCEFDC" w:val="clear"/>
+        <w:spacing w:after="120" w:before="100"/>
+        <w:ind w:left="150" w:right="100"/>
+      </w:pPr>
+      <w:r>
+        <w:rPr>
+          <w:b/>
+          <w:bCs/>
+          <w:color w:val="8A4B00"/>
+        </w:rPr>
+        <w:t xml:space="preserve">NOT ANSWERABLE FROM DATA — ASK: </w:t>
+      </w:r>
+      <w:r>
+        <w:t xml:space="preserve">Would the business accept a VF Corp-style tradeoff — deliberately cutting unprofitable Wholesale distribution even at the cost of near-term revenue — to close the margin gap faster? This is the same question underlying the FW27 Confirm-or-Exit list (Item 3, 211 franchises) and the Problem Child pricing-fix work, now framed explicitly as a strategic choice rather than an analytical finding. Owner: CEO / PE ownership.</w:t>
+      </w:r>
+    </w:p>
+    <w:p>
+      <w:r>
+        <w:br w:type="page"/>
+      </w:r>
+    </w:p>
+    <w:p>
+      <w:pPr>
+        <w:pStyle w:val="Heading1"/>
+        <w:spacing w:after="160" w:before="320"/>
+      </w:pPr>
+      <w:r>
+        <w:t xml:space="preserve">8. A fourth, more basic problem: the starting point itself doesn't reconcile</w:t>
       </w:r>
     </w:p>
     <w:tbl>
@@ -5821,7 +6743,7 @@
         <w:spacing w:after="160" w:before="320"/>
       </w:pPr>
       <w:r>
-        <w:t xml:space="preserve">8. What's genuinely missing — the honest punch list</w:t>
+        <w:t xml:space="preserve">9. What's genuinely missing — the honest punch list</w:t>
       </w:r>
     </w:p>
     <w:p>
@@ -5921,7 +6843,7 @@
         <w:spacing w:after="160" w:before="320"/>
       </w:pPr>
       <w:r>
-        <w:t xml:space="preserve">9. Recommended next step</w:t>
+        <w:t xml:space="preserve">10. Recommended next step</w:t>
       </w:r>
     </w:p>
     <w:p>
@@ -5998,7 +6920,7 @@
         <w:spacing w:after="160" w:before="320"/>
       </w:pPr>
       <w:r>
-        <w:t xml:space="preserve">10. Backup data</w:t>
+        <w:t xml:space="preserve">11. Backup data</w:t>
       </w:r>
     </w:p>
     <w:p>
@@ -6011,7 +6933,20 @@
         <w:spacing w:after="80"/>
       </w:pPr>
       <w:r>
-        <w:t xml:space="preserve">bob_marginbridge_backup.xlsx — the reconciliation summary, full lever detail with formulas, channel-mix current/sensitivity data, portfolio tier-mix scenarios, the base-year normalization detail and findings, the basis-mismatch check, and the fresh special-account mix/rate decomposition.</w:t>
+        <w:t xml:space="preserve">bob_marginbridge_backup.xlsx — the reconciliation summary, full lever detail with formulas, channel-mix current/sensitivity data, portfolio tier-mix scenarios, the base-year normalization detail and findings, the competitive benchmark table, the basis-mismatch check, and the fresh special-account mix/rate decomposition.</w:t>
+      </w:r>
+    </w:p>
+    <w:p>
+      <w:pPr>
+        <w:pStyle w:val="ListParagraph"/>
+        <w:numPr>
+          <w:ilvl w:val="0"/>
+          <w:numId w:val="2"/>
+        </w:numPr>
+        <w:spacing w:after="80"/>
+      </w:pPr>
+      <w:r>
+        <w:t xml:space="preserve">Competitive benchmark figures (Section 7) are drawn from public company filings and press coverage — Fenix Outdoor interim/annual reports, Amer Sports SEC filings and earnings releases, VF Corp and Columbia Sportswear investor releases, and Norrona financial data via third-party company-data aggregators. Not derived from Haglofs' internal data.</w:t>
       </w:r>
     </w:p>
     <w:p>

</xml_diff>